<commit_message>
fix: remove hidden site details table from text box in PO template
The template had two copies of the site details table inside positioned
drawing elements (mc:Choice text box + mc:Fallback VML shape). The
expandLoop function found the first one inside the text box and expanded
it there, but text box content is invisible in the output.

Removed the entire mc:AlternateContent block and inserted the clean table
directly in the document body. Fixes #65.
</commit_message>
<xml_diff>
--- a/public/templates/PO_TEMPLATE_ORIGINAL.docx
+++ b/public/templates/PO_TEMPLATE_ORIGINAL.docx
@@ -11402,1592 +11402,701 @@
           <w:b/>
           <w:sz w:val="20"/>
         </w:rPr>
-        <mc:AlternateContent>
-          <mc:Choice Requires="wpg">
-            <w:drawing>
-              <wp:anchor xmlns:wp="http://schemas.openxmlformats.org/drawingml/2006/wordprocessingDrawing" xmlns:wp14="http://schemas.microsoft.com/office/word/2010/wordprocessingDrawing" distT="0" distB="0" distL="0" distR="0" simplePos="0" relativeHeight="251657728" behindDoc="0" locked="0" layoutInCell="1" allowOverlap="1">
-                <wp:simplePos x="0" y="0"/>
-                <wp:positionH relativeFrom="page">
-                  <wp:posOffset>777240</wp:posOffset>
-                </wp:positionH>
-                <wp:positionV relativeFrom="page">
-                  <wp:posOffset>3627120</wp:posOffset>
-                </wp:positionV>
-                <wp:extent cx="5843610" cy="1826355"/>
-                <wp:effectExtent l="0" t="0" r="0" b="0"/>
-                <wp:wrapNone/>
-                <wp:docPr id="5" name="Textbox 5"/>
-                <wp:cNvGraphicFramePr/>
-                <a:graphic xmlns:a="http://schemas.openxmlformats.org/drawingml/2006/main">
-                  <a:graphicData uri="http://schemas.microsoft.com/office/word/2010/wordprocessingShape">
-                    <wps:wsp>
-                      <wps:cNvPr id="0" name=""/>
-                      <wps:cNvSpPr txBox="1"/>
-                      <wps:spPr bwMode="auto">
-                        <a:xfrm flipH="0" flipV="0">
-                          <a:off x="0" y="0"/>
-                          <a:ext cx="5843610" cy="1826354"/>
-                        </a:xfrm>
-                        <a:prstGeom prst="rect">
-                          <a:avLst/>
-                        </a:prstGeom>
-                      </wps:spPr>
-                      <wps:txbx>
-                        <w:txbxContent>
-                          <w:tbl>
-                            <w:tblPr>
-                              <w:tblInd w:w="65" w:type="dxa"/>
-                              <w:tblW w:w="0" w:type="auto"/>
-                              <w:tblCellMar>
-                                <w:left w:w="0" w:type="dxa"/>
-                                <w:right w:w="0" w:type="dxa"/>
-                              </w:tblCellMar>
-                              <w:tblBorders>
-                                <w:top w:val="single" w:color="000000" w:sz="4" w:space="0"/>
-                                <w:left w:val="single" w:color="000000" w:sz="4" w:space="0"/>
-                                <w:bottom w:val="single" w:color="000000" w:sz="4" w:space="0"/>
-                                <w:right w:val="single" w:color="000000" w:sz="4" w:space="0"/>
-                                <w:insideH w:val="single" w:color="000000" w:sz="4" w:space="0"/>
-                                <w:insideV w:val="single" w:color="000000" w:sz="4" w:space="0"/>
-                              </w:tblBorders>
-                              <w:tblLayout w:type="fixed"/>
-                              <w:tblLook w:val="01E0" w:firstRow="1" w:lastRow="1" w:firstColumn="1" w:lastColumn="1" w:noHBand="0" w:noVBand="0"/>
-                            </w:tblPr>
-                            <w:tblGrid>
-                              <w:gridCol w:w="701"/>
-                              <w:gridCol w:w="1980"/>
-                              <w:gridCol w:w="1220"/>
-                              <w:gridCol w:w="1469"/>
-                              <w:gridCol w:w="1841"/>
-                            </w:tblGrid>
-                            <w:tr>
-                              <w:trPr>
-                                <w:trHeight w:val="438"/>
-                              </w:trPr>
-                              <w:tc>
-                                <w:tcPr>
-                                  <w:tcBorders/>
-                                  <w:tcW w:w="701" w:type="dxa"/>
-                                </w:tcPr>
-                                <w:p>
-                                  <w:pPr>
-                                    <w:pStyle w:val="939"/>
-                                    <w:pBdr/>
-                                    <w:spacing w:line="219" w:lineRule="exact"/>
-                                    <w:ind w:left="49"/>
-                                    <w:jc w:val="center"/>
-                                    <w:rPr>
-                                      <w:rFonts w:ascii="Calibri"/>
-                                      <w:b/>
-                                      <w:sz w:val="18"/>
-                                    </w:rPr>
-                                  </w:pPr>
-                                  <w:r>
-                                    <w:rPr>
-                                      <w:rFonts w:ascii="Calibri"/>
-                                      <w:b/>
-                                      <w:spacing w:val="-5"/>
-                                      <w:sz w:val="18"/>
-                                    </w:rPr>
-                                    <w:t xml:space="preserve">S/N</w:t>
-                                  </w:r>
-                                  <w:r>
-                                    <w:rPr>
-                                      <w:rFonts w:ascii="Calibri"/>
-                                      <w:b/>
-                                      <w:sz w:val="18"/>
-                                    </w:rPr>
-                                  </w:r>
-                                  <w:r>
-                                    <w:rPr>
-                                      <w:rFonts w:ascii="Calibri"/>
-                                      <w:b/>
-                                      <w:sz w:val="18"/>
-                                    </w:rPr>
-                                  </w:r>
-                                </w:p>
-                              </w:tc>
-                              <w:tc>
-                                <w:tcPr>
-                                  <w:tcBorders/>
-                                  <w:tcW w:w="1980" w:type="dxa"/>
-                                </w:tcPr>
-                                <w:p>
-                                  <w:pPr>
-                                    <w:pStyle w:val="939"/>
-                                    <w:pBdr/>
-                                    <w:spacing w:line="219" w:lineRule="exact"/>
-                                    <w:ind w:left="10"/>
-                                    <w:jc w:val="center"/>
-                                    <w:rPr>
-                                      <w:rFonts w:ascii="Calibri"/>
-                                      <w:b/>
-                                      <w:sz w:val="18"/>
-                                    </w:rPr>
-                                  </w:pPr>
-                                  <w:r>
-                                    <w:rPr>
-                                      <w:rFonts w:ascii="Calibri"/>
-                                      <w:b/>
-                                      <w:spacing w:val="-2"/>
-                                      <w:sz w:val="18"/>
-                                    </w:rPr>
-                                    <w:t xml:space="preserve">REGION</w:t>
-                                  </w:r>
-                                  <w:r>
-                                    <w:rPr>
-                                      <w:rFonts w:ascii="Calibri"/>
-                                      <w:b/>
-                                      <w:sz w:val="18"/>
-                                    </w:rPr>
-                                  </w:r>
-                                  <w:r>
-                                    <w:rPr>
-                                      <w:rFonts w:ascii="Calibri"/>
-                                      <w:b/>
-                                      <w:sz w:val="18"/>
-                                    </w:rPr>
-                                  </w:r>
-                                </w:p>
-                              </w:tc>
-                              <w:tc>
-                                <w:tcPr>
-                                  <w:tcBorders/>
-                                  <w:tcW w:w="1220" w:type="dxa"/>
-                                </w:tcPr>
-                                <w:p>
-                                  <w:pPr>
-                                    <w:pStyle w:val="939"/>
-                                    <w:pBdr/>
-                                    <w:spacing w:line="219" w:lineRule="exact"/>
-                                    <w:ind w:left="204"/>
-                                    <w:rPr>
-                                      <w:rFonts w:ascii="Calibri"/>
-                                      <w:b/>
-                                      <w:sz w:val="18"/>
-                                    </w:rPr>
-                                  </w:pPr>
-                                  <w:r>
-                                    <w:rPr>
-                                      <w:rFonts w:ascii="Calibri"/>
-                                      <w:b/>
-                                      <w:spacing w:val="-2"/>
-                                      <w:sz w:val="18"/>
-                                    </w:rPr>
-                                    <w:t xml:space="preserve">AREA/CITY</w:t>
-                                  </w:r>
-                                  <w:r>
-                                    <w:rPr>
-                                      <w:rFonts w:ascii="Calibri"/>
-                                      <w:b/>
-                                      <w:sz w:val="18"/>
-                                    </w:rPr>
-                                  </w:r>
-                                  <w:r>
-                                    <w:rPr>
-                                      <w:rFonts w:ascii="Calibri"/>
-                                      <w:b/>
-                                      <w:sz w:val="18"/>
-                                    </w:rPr>
-                                  </w:r>
-                                </w:p>
-                              </w:tc>
-                              <w:tc>
-                                <w:tcPr>
-                                  <w:tcBorders/>
-                                  <w:tcW w:w="1469" w:type="dxa"/>
-                                </w:tcPr>
-                                <w:p>
-                                  <w:pPr>
-                                    <w:pStyle w:val="939"/>
-                                    <w:pBdr/>
-                                    <w:spacing w:line="219" w:lineRule="exact"/>
-                                    <w:ind w:left="206"/>
-                                    <w:rPr>
-                                      <w:rFonts w:ascii="Calibri"/>
-                                      <w:b/>
-                                      <w:sz w:val="18"/>
-                                    </w:rPr>
-                                  </w:pPr>
-                                  <w:r>
-                                    <w:rPr>
-                                      <w:rFonts w:ascii="Calibri"/>
-                                      <w:b/>
-                                      <w:sz w:val="18"/>
-                                    </w:rPr>
-                                    <w:t xml:space="preserve">NO</w:t>
-                                  </w:r>
-                                  <w:r>
-                                    <w:rPr>
-                                      <w:rFonts w:ascii="Calibri"/>
-                                      <w:b/>
-                                      <w:spacing w:val="-2"/>
-                                      <w:sz w:val="18"/>
-                                    </w:rPr>
-                                    <w:t xml:space="preserve"> </w:t>
-                                  </w:r>
-                                  <w:r>
-                                    <w:rPr>
-                                      <w:rFonts w:ascii="Calibri"/>
-                                      <w:b/>
-                                      <w:sz w:val="18"/>
-                                    </w:rPr>
-                                    <w:t xml:space="preserve">OF</w:t>
-                                  </w:r>
-                                  <w:r>
-                                    <w:rPr>
-                                      <w:rFonts w:ascii="Calibri"/>
-                                      <w:b/>
-                                      <w:spacing w:val="-2"/>
-                                      <w:sz w:val="18"/>
-                                    </w:rPr>
-                                    <w:t xml:space="preserve"> NODES</w:t>
-                                  </w:r>
-                                  <w:r>
-                                    <w:rPr>
-                                      <w:rFonts w:ascii="Calibri"/>
-                                      <w:b/>
-                                      <w:sz w:val="18"/>
-                                    </w:rPr>
-                                  </w:r>
-                                  <w:r>
-                                    <w:rPr>
-                                      <w:rFonts w:ascii="Calibri"/>
-                                      <w:b/>
-                                      <w:sz w:val="18"/>
-                                    </w:rPr>
-                                  </w:r>
-                                </w:p>
-                              </w:tc>
-                              <w:tc>
-                                <w:tcPr>
-                                  <w:tcBorders/>
-                                  <w:tcW w:w="1841" w:type="dxa"/>
-                                </w:tcPr>
-                                <w:p>
-                                  <w:pPr>
-                                    <w:pStyle w:val="939"/>
-                                    <w:pBdr/>
-                                    <w:spacing w:line="219" w:lineRule="exact"/>
-                                    <w:ind w:left="158"/>
-                                    <w:rPr>
-                                      <w:rFonts w:ascii="Calibri"/>
-                                      <w:b/>
-                                      <w:sz w:val="18"/>
-                                    </w:rPr>
-                                  </w:pPr>
-                                  <w:r>
-                                    <w:rPr>
-                                      <w:rFonts w:ascii="Calibri"/>
-                                      <w:b/>
-                                      <w:sz w:val="18"/>
-                                    </w:rPr>
-                                    <w:t xml:space="preserve">ESTIMATED</w:t>
-                                  </w:r>
-                                  <w:r>
-                                    <w:rPr>
-                                      <w:rFonts w:ascii="Calibri"/>
-                                      <w:b/>
-                                      <w:spacing w:val="-4"/>
-                                      <w:sz w:val="18"/>
-                                    </w:rPr>
-                                    <w:t xml:space="preserve"> </w:t>
-                                  </w:r>
-                                  <w:r>
-                                    <w:rPr>
-                                      <w:rFonts w:ascii="Calibri"/>
-                                      <w:b/>
-                                      <w:spacing w:val="-2"/>
-                                      <w:sz w:val="18"/>
-                                    </w:rPr>
-                                    <w:t xml:space="preserve">STRAND</w:t>
-                                  </w:r>
-                                  <w:r>
-                                    <w:rPr>
-                                      <w:rFonts w:ascii="Calibri"/>
-                                      <w:b/>
-                                      <w:sz w:val="18"/>
-                                    </w:rPr>
-                                  </w:r>
-                                  <w:r>
-                                    <w:rPr>
-                                      <w:rFonts w:ascii="Calibri"/>
-                                      <w:b/>
-                                      <w:sz w:val="18"/>
-                                    </w:rPr>
-                                  </w:r>
-                                </w:p>
-                                <w:p>
-                                  <w:pPr>
-                                    <w:pStyle w:val="939"/>
-                                    <w:pBdr/>
-                                    <w:spacing w:before="1" w:line="199" w:lineRule="exact"/>
-                                    <w:ind w:left="160"/>
-                                    <w:rPr>
-                                      <w:rFonts w:ascii="Calibri"/>
-                                      <w:b/>
-                                      <w:sz w:val="18"/>
-                                    </w:rPr>
-                                  </w:pPr>
-                                  <w:r>
-                                    <w:rPr>
-                                      <w:rFonts w:ascii="Calibri"/>
-                                      <w:b/>
-                                      <w:sz w:val="18"/>
-                                    </w:rPr>
-                                    <w:t xml:space="preserve">CABLE</w:t>
-                                  </w:r>
-                                  <w:r>
-                                    <w:rPr>
-                                      <w:rFonts w:ascii="Calibri"/>
-                                      <w:b/>
-                                      <w:spacing w:val="-1"/>
-                                      <w:sz w:val="18"/>
-                                    </w:rPr>
-                                    <w:t xml:space="preserve"> </w:t>
-                                  </w:r>
-                                  <w:r>
-                                    <w:rPr>
-                                      <w:rFonts w:ascii="Calibri"/>
-                                      <w:b/>
-                                      <w:sz w:val="18"/>
-                                    </w:rPr>
-                                    <w:t xml:space="preserve">LENGTH</w:t>
-                                  </w:r>
-                                  <w:r>
-                                    <w:rPr>
-                                      <w:rFonts w:ascii="Calibri"/>
-                                      <w:b/>
-                                      <w:spacing w:val="-2"/>
-                                      <w:sz w:val="18"/>
-                                    </w:rPr>
-                                    <w:t xml:space="preserve"> </w:t>
-                                  </w:r>
-                                  <w:r>
-                                    <w:rPr>
-                                      <w:rFonts w:ascii="Calibri"/>
-                                      <w:b/>
-                                      <w:spacing w:val="-4"/>
-                                      <w:sz w:val="18"/>
-                                    </w:rPr>
-                                    <w:t xml:space="preserve">(KM)</w:t>
-                                  </w:r>
-                                  <w:r>
-                                    <w:rPr>
-                                      <w:rFonts w:ascii="Calibri"/>
-                                      <w:b/>
-                                      <w:sz w:val="18"/>
-                                    </w:rPr>
-                                  </w:r>
-                                  <w:r>
-                                    <w:rPr>
-                                      <w:rFonts w:ascii="Calibri"/>
-                                      <w:b/>
-                                      <w:sz w:val="18"/>
-                                    </w:rPr>
-                                  </w:r>
-                                </w:p>
-                              </w:tc>
-                            </w:tr>
-                            <w:tr>
-                              <w:trPr>
-                                <w:trHeight w:val="285"/>
-                              </w:trPr>
-                              <w:tc>
-                                <w:tcPr>
-                                  <w:tcBorders/>
-                                  <w:tcW w:w="701" w:type="dxa"/>
-                                </w:tcPr>
-                                <w:p>
-                                  <w:pPr>
-                                    <w:pStyle w:val="939"/>
-                                    <w:pBdr/>
-                                    <w:spacing w:before="1"/>
-                                    <w:ind w:right="39" w:left="49"/>
-                                    <w:jc w:val="center"/>
-                                    <w:rPr>
-                                      <w:rFonts w:ascii="Calibri"/>
-                                      <w:sz w:val="18"/>
-                                    </w:rPr>
-                                  </w:pPr>
-                                  <w:r>
-                                    <w:rPr>
-                                      <w:rFonts w:ascii="Calibri"/>
-                                      <w:sz w:val="18"/>
-                                    </w:rPr>
-                                  </w:r>
-                                  <w:r>
-                                    <w:rPr>
-                                      <w:rFonts w:ascii="Calibri"/>
-                                      <w:sz w:val="18"/>
-                                    </w:rPr>
-                                    <w:t xml:space="preserve">{#site_details}{sn}</w:t>
-                                  </w:r>
-                                  <w:r>
-                                    <w:rPr>
-                                      <w:rFonts w:ascii="Calibri"/>
-                                      <w:sz w:val="18"/>
-                                    </w:rPr>
-                                  </w:r>
-                                  <w:r>
-                                    <w:rPr>
-                                      <w:rFonts w:ascii="Calibri"/>
-                                      <w:sz w:val="18"/>
-                                    </w:rPr>
-                                  </w:r>
-                                </w:p>
-                              </w:tc>
-                              <w:tc>
-                                <w:tcPr>
-                                  <w:tcBorders/>
-                                  <w:tcW w:w="1980" w:type="dxa"/>
-                                </w:tcPr>
-                                <w:p>
-                                  <w:pPr>
-                                    <w:pStyle w:val="939"/>
-                                    <w:pBdr/>
-                                    <w:spacing w:before="1"/>
-                                    <w:ind w:left="108"/>
-                                    <w:rPr>
-                                      <w:rFonts w:ascii="Calibri"/>
-                                      <w:sz w:val="18"/>
-                                    </w:rPr>
-                                  </w:pPr>
-                                  <w:r>
-                                    <w:rPr>
-                                      <w:rFonts w:ascii="Calibri"/>
-                                      <w:sz w:val="18"/>
-                                    </w:rPr>
-                                    <w:t xml:space="preserve">{region}</w:t>
-                                  </w:r>
-                                  <w:r>
-                                    <w:rPr>
-                                      <w:rFonts w:ascii="Calibri"/>
-                                      <w:sz w:val="18"/>
-                                    </w:rPr>
-                                  </w:r>
-                                  <w:r>
-                                    <w:rPr>
-                                      <w:rFonts w:ascii="Calibri"/>
-                                      <w:sz w:val="18"/>
-                                    </w:rPr>
-                                  </w:r>
-                                </w:p>
-                              </w:tc>
-                              <w:tc>
-                                <w:tcPr>
-                                  <w:tcBorders/>
-                                  <w:tcW w:w="1220" w:type="dxa"/>
-                                </w:tcPr>
-                                <w:p>
-                                  <w:pPr>
-                                    <w:pStyle w:val="939"/>
-                                    <w:pBdr/>
-                                    <w:spacing w:before="1"/>
-                                    <w:ind w:left="108"/>
-                                    <w:rPr>
-                                      <w:rFonts w:ascii="Calibri"/>
-                                      <w:sz w:val="18"/>
-                                    </w:rPr>
-                                  </w:pPr>
-                                  <w:r>
-                                    <w:rPr>
-                                      <w:rFonts w:ascii="Calibri"/>
-                                      <w:sz w:val="18"/>
-                                    </w:rPr>
-                                    <w:t xml:space="preserve">{area}</w:t>
-                                  </w:r>
-                                  <w:r>
-                                    <w:rPr>
-                                      <w:rFonts w:ascii="Calibri"/>
-                                      <w:sz w:val="18"/>
-                                    </w:rPr>
-                                  </w:r>
-                                  <w:r>
-                                    <w:rPr>
-                                      <w:rFonts w:ascii="Calibri"/>
-                                      <w:sz w:val="18"/>
-                                    </w:rPr>
-                                  </w:r>
-                                </w:p>
-                              </w:tc>
-                              <w:tc>
-                                <w:tcPr>
-                                  <w:tcBorders/>
-                                  <w:tcW w:w="1469" w:type="dxa"/>
-                                </w:tcPr>
-                                <w:p>
-                                  <w:pPr>
-                                    <w:pStyle w:val="939"/>
-                                    <w:pBdr/>
-                                    <w:spacing w:before="66" w:line="199" w:lineRule="exact"/>
-                                    <w:ind w:right="96" w:left="0"/>
-                                    <w:jc w:val="right"/>
-                                    <w:rPr>
-                                      <w:rFonts w:ascii="Calibri"/>
-                                      <w:sz w:val="18"/>
-                                    </w:rPr>
-                                  </w:pPr>
-                                  <w:r>
-                                    <w:rPr>
-                                      <w:rFonts w:ascii="Calibri"/>
-                                      <w:sz w:val="18"/>
-                                    </w:rPr>
-                                    <w:t xml:space="preserve">{nodes}</w:t>
-                                  </w:r>
-                                  <w:r>
-                                    <w:rPr>
-                                      <w:rFonts w:ascii="Calibri"/>
-                                      <w:sz w:val="18"/>
-                                    </w:rPr>
-                                  </w:r>
-                                  <w:r>
-                                    <w:rPr>
-                                      <w:rFonts w:ascii="Calibri"/>
-                                      <w:sz w:val="18"/>
-                                    </w:rPr>
-                                  </w:r>
-                                </w:p>
-                              </w:tc>
-                              <w:tc>
-                                <w:tcPr>
-                                  <w:tcBorders/>
-                                  <w:tcW w:w="1841" w:type="dxa"/>
-                                </w:tcPr>
-                                <w:p>
-                                  <w:pPr>
-                                    <w:pStyle w:val="939"/>
-                                    <w:pBdr/>
-                                    <w:spacing w:before="1"/>
-                                    <w:ind w:right="96" w:left="0"/>
-                                    <w:jc w:val="right"/>
-                                    <w:rPr>
-                                      <w:rFonts w:ascii="Calibri"/>
-                                      <w:sz w:val="18"/>
-                                    </w:rPr>
-                                  </w:pPr>
-                                  <w:r>
-                                    <w:rPr>
-                                      <w:rFonts w:ascii="Calibri"/>
-                                      <w:sz w:val="18"/>
-                                    </w:rPr>
-                                    <w:t xml:space="preserve">{est_km}</w:t>
-                                  </w:r>
-                                  <w:r>
-                                    <w:rPr>
-                                      <w:rFonts w:ascii="Calibri"/>
-                                      <w:sz w:val="18"/>
-                                    </w:rPr>
-                                    <w:t xml:space="preserve">{/site_details}</w:t>
-                                  </w:r>
-                                  <w:r>
-                                    <w:rPr>
-                                      <w:rFonts w:ascii="Calibri"/>
-                                      <w:sz w:val="18"/>
-                                    </w:rPr>
-                                  </w:r>
-                                  <w:r>
-                                    <w:rPr>
-                                      <w:rFonts w:ascii="Calibri"/>
-                                      <w:sz w:val="18"/>
-                                    </w:rPr>
-                                  </w:r>
-                                </w:p>
-                              </w:tc>
-                            </w:tr>
-                            <w:tr>
-                              <w:trPr>
-                                <w:trHeight w:val="218"/>
-                              </w:trPr>
-                              <w:tc>
-                                <w:tcPr>
-                                  <w:gridSpan w:val="3"/>
-                                  <w:tcBorders/>
-                                  <w:tcW w:w="3901" w:type="dxa"/>
-                                </w:tcPr>
-                                <w:p>
-                                  <w:pPr>
-                                    <w:pStyle w:val="939"/>
-                                    <w:pBdr/>
-                                    <w:spacing w:line="198" w:lineRule="exact"/>
-                                    <w:ind w:left="6"/>
-                                    <w:jc w:val="center"/>
-                                    <w:rPr>
-                                      <w:rFonts w:ascii="Calibri"/>
-                                      <w:b/>
-                                      <w:sz w:val="18"/>
-                                    </w:rPr>
-                                  </w:pPr>
-                                  <w:r>
-                                    <w:rPr>
-                                      <w:rFonts w:ascii="Calibri"/>
-                                      <w:b/>
-                                      <w:spacing w:val="-2"/>
-                                      <w:sz w:val="18"/>
-                                    </w:rPr>
-                                    <w:t xml:space="preserve">TOTAL</w:t>
-                                  </w:r>
-                                  <w:r>
-                                    <w:rPr>
-                                      <w:rFonts w:ascii="Calibri"/>
-                                      <w:b/>
-                                      <w:sz w:val="18"/>
-                                    </w:rPr>
-                                  </w:r>
-                                  <w:r>
-                                    <w:rPr>
-                                      <w:rFonts w:ascii="Calibri"/>
-                                      <w:b/>
-                                      <w:sz w:val="18"/>
-                                    </w:rPr>
-                                  </w:r>
-                                </w:p>
-                              </w:tc>
-                              <w:tc>
-                                <w:tcPr>
-                                  <w:tcBorders/>
-                                  <w:tcW w:w="1469" w:type="dxa"/>
-                                </w:tcPr>
-                                <w:p>
-                                  <w:pPr>
-                                    <w:pStyle w:val="939"/>
-                                    <w:pBdr/>
-                                    <w:spacing w:line="198" w:lineRule="exact"/>
-                                    <w:ind w:right="96" w:left="0"/>
-                                    <w:jc w:val="right"/>
-                                    <w:rPr>
-                                      <w:rFonts w:ascii="Calibri"/>
-                                      <w:b/>
-                                      <w:sz w:val="18"/>
-                                    </w:rPr>
-                                  </w:pPr>
-                                  <w:r>
-                                    <w:rPr>
-                                      <w:rFonts w:ascii="Calibri"/>
-                                      <w:b/>
-                                      <w:sz w:val="18"/>
-                                    </w:rPr>
-                                    <w:t xml:space="preserve">{total_nodes}</w:t>
-                                  </w:r>
-                                  <w:r>
-                                    <w:rPr>
-                                      <w:rFonts w:ascii="Calibri"/>
-                                      <w:b/>
-                                      <w:sz w:val="18"/>
-                                    </w:rPr>
-                                  </w:r>
-                                  <w:r>
-                                    <w:rPr>
-                                      <w:rFonts w:ascii="Calibri"/>
-                                      <w:b/>
-                                      <w:sz w:val="18"/>
-                                    </w:rPr>
-                                  </w:r>
-                                </w:p>
-                              </w:tc>
-                              <w:tc>
-                                <w:tcPr>
-                                  <w:tcBorders/>
-                                  <w:tcW w:w="1841" w:type="dxa"/>
-                                </w:tcPr>
-                                <w:p>
-                                  <w:pPr>
-                                    <w:pStyle w:val="939"/>
-                                    <w:pBdr/>
-                                    <w:spacing w:line="198" w:lineRule="exact"/>
-                                    <w:ind w:right="96" w:left="0"/>
-                                    <w:jc w:val="right"/>
-                                    <w:rPr>
-                                      <w:rFonts w:ascii="Calibri"/>
-                                      <w:b/>
-                                      <w:sz w:val="18"/>
-                                    </w:rPr>
-                                  </w:pPr>
-                                  <w:r>
-                                    <w:rPr>
-                                      <w:rFonts w:ascii="Calibri"/>
-                                      <w:b/>
-                                      <w:sz w:val="18"/>
-                                    </w:rPr>
-                                    <w:t xml:space="preserve">{total_cable}</w:t>
-                                  </w:r>
-                                  <w:r>
-                                    <w:rPr>
-                                      <w:rFonts w:ascii="Calibri"/>
-                                      <w:b/>
-                                      <w:sz w:val="18"/>
-                                    </w:rPr>
-                                  </w:r>
-                                  <w:r>
-                                    <w:rPr>
-                                      <w:rFonts w:ascii="Calibri"/>
-                                      <w:b/>
-                                      <w:sz w:val="18"/>
-                                    </w:rPr>
-                                  </w:r>
-                                </w:p>
-                              </w:tc>
-                            </w:tr>
-                          </w:tbl>
-                          <w:p>
-                            <w:pPr>
-                              <w:pStyle w:val="937"/>
-                              <w:pBdr/>
-                              <w:spacing/>
-                              <w:ind/>
-                              <w:rPr/>
-                            </w:pPr>
-                            <w:r/>
-                            <w:r/>
-                          </w:p>
-                          <w:p>
-                            <w:pPr>
-                              <w:pStyle w:val="937"/>
-                              <w:pBdr/>
-                              <w:spacing/>
-                              <w:ind/>
-                              <w:rPr/>
-                            </w:pPr>
-                            <w:r/>
-                            <w:r/>
-                          </w:p>
-                          <w:p>
-                            <w:pPr>
-                              <w:pStyle w:val="937"/>
-                              <w:pBdr/>
-                              <w:spacing/>
-                              <w:ind/>
-                              <w:rPr/>
-                            </w:pPr>
-                            <w:r/>
-                            <w:r/>
-                          </w:p>
-                          <w:p>
-                            <w:pPr>
-                              <w:pStyle w:val="937"/>
-                              <w:pBdr/>
-                              <w:spacing/>
-                              <w:ind/>
-                              <w:rPr/>
-                            </w:pPr>
-                            <w:r/>
-                            <w:r/>
-                          </w:p>
-                          <w:p>
-                            <w:pPr>
-                              <w:pStyle w:val="937"/>
-                              <w:pBdr/>
-                              <w:spacing/>
-                              <w:ind/>
-                              <w:rPr/>
-                            </w:pPr>
-                            <w:r/>
-                            <w:r/>
-                          </w:p>
-                          <w:p>
-                            <w:pPr>
-                              <w:pStyle w:val="937"/>
-                              <w:pBdr/>
-                              <w:tabs>
-                                <w:tab w:val="left" w:leader="none" w:pos="4013"/>
-                              </w:tabs>
-                              <w:spacing/>
-                              <w:ind/>
-                              <w:rPr/>
-                            </w:pPr>
-                            <w:r>
-                              <w:tab/>
-                            </w:r>
-                            <w:r/>
-                          </w:p>
-                        </w:txbxContent>
-                      </wps:txbx>
-                      <wps:bodyPr wrap="square" lIns="0" tIns="0" rIns="0" bIns="0" rtlCol="0">
-                        <a:noAutofit/>
-                      </wps:bodyPr>
-                    </wps:wsp>
-                  </a:graphicData>
-                </a:graphic>
-              </wp:anchor>
-            </w:drawing>
-          </mc:Choice>
-          <mc:Fallback>
-            <w:pict>
-              <v:shape id="shape 4" o:spid="_x0000_s4" o:spt="202" type="#_x0000_t202" style="position:absolute;z-index:251657728;o:allowoverlap:true;o:allowincell:true;mso-position-horizontal-relative:page;margin-left:61.20pt;mso-position-horizontal:absolute;mso-position-vertical-relative:page;margin-top:285.60pt;mso-position-vertical:absolute;width:460.13pt;height:143.81pt;mso-wrap-distance-left:0.00pt;mso-wrap-distance-top:0.00pt;mso-wrap-distance-right:0.00pt;mso-wrap-distance-bottom:0.00pt;visibility:visible;" filled="f">
-                <v:textbox inset="0,0,0,0">
-                  <w:txbxContent>
-                    <w:tbl>
-                      <w:tblPr>
-                        <w:tblInd w:w="65" w:type="dxa"/>
-                        <w:tblW w:w="0" w:type="auto"/>
-                        <w:tblCellMar>
-                          <w:left w:w="0" w:type="dxa"/>
-                          <w:right w:w="0" w:type="dxa"/>
-                        </w:tblCellMar>
-                        <w:tblBorders>
-                          <w:top w:val="single" w:color="000000" w:sz="4" w:space="0"/>
-                          <w:left w:val="single" w:color="000000" w:sz="4" w:space="0"/>
-                          <w:bottom w:val="single" w:color="000000" w:sz="4" w:space="0"/>
-                          <w:right w:val="single" w:color="000000" w:sz="4" w:space="0"/>
-                          <w:insideH w:val="single" w:color="000000" w:sz="4" w:space="0"/>
-                          <w:insideV w:val="single" w:color="000000" w:sz="4" w:space="0"/>
-                        </w:tblBorders>
-                        <w:tblLayout w:type="fixed"/>
-                        <w:tblLook w:val="01E0" w:firstRow="1" w:lastRow="1" w:firstColumn="1" w:lastColumn="1" w:noHBand="0" w:noVBand="0"/>
-                      </w:tblPr>
-                      <w:tblGrid>
-                        <w:gridCol w:w="701"/>
-                        <w:gridCol w:w="1980"/>
-                        <w:gridCol w:w="1220"/>
-                        <w:gridCol w:w="1469"/>
-                        <w:gridCol w:w="1841"/>
-                      </w:tblGrid>
-                      <w:tr>
-                        <w:trPr>
-                          <w:trHeight w:val="438"/>
-                        </w:trPr>
-                        <w:tc>
-                          <w:tcPr>
-                            <w:tcBorders/>
-                            <w:tcW w:w="701" w:type="dxa"/>
-                          </w:tcPr>
-                          <w:p>
-                            <w:pPr>
-                              <w:pStyle w:val="939"/>
-                              <w:pBdr/>
-                              <w:spacing w:line="219" w:lineRule="exact"/>
-                              <w:ind w:left="49"/>
-                              <w:jc w:val="center"/>
-                              <w:rPr>
-                                <w:rFonts w:ascii="Calibri"/>
-                                <w:b/>
-                                <w:sz w:val="18"/>
-                              </w:rPr>
-                            </w:pPr>
-                            <w:r>
-                              <w:rPr>
-                                <w:rFonts w:ascii="Calibri"/>
-                                <w:b/>
-                                <w:spacing w:val="-5"/>
-                                <w:sz w:val="18"/>
-                              </w:rPr>
-                              <w:t xml:space="preserve">S/N</w:t>
-                            </w:r>
-                            <w:r>
-                              <w:rPr>
-                                <w:rFonts w:ascii="Calibri"/>
-                                <w:b/>
-                                <w:sz w:val="18"/>
-                              </w:rPr>
-                            </w:r>
-                            <w:r>
-                              <w:rPr>
-                                <w:rFonts w:ascii="Calibri"/>
-                                <w:b/>
-                                <w:sz w:val="18"/>
-                              </w:rPr>
-                            </w:r>
-                          </w:p>
-                        </w:tc>
-                        <w:tc>
-                          <w:tcPr>
-                            <w:tcBorders/>
-                            <w:tcW w:w="1980" w:type="dxa"/>
-                          </w:tcPr>
-                          <w:p>
-                            <w:pPr>
-                              <w:pStyle w:val="939"/>
-                              <w:pBdr/>
-                              <w:spacing w:line="219" w:lineRule="exact"/>
-                              <w:ind w:left="10"/>
-                              <w:jc w:val="center"/>
-                              <w:rPr>
-                                <w:rFonts w:ascii="Calibri"/>
-                                <w:b/>
-                                <w:sz w:val="18"/>
-                              </w:rPr>
-                            </w:pPr>
-                            <w:r>
-                              <w:rPr>
-                                <w:rFonts w:ascii="Calibri"/>
-                                <w:b/>
-                                <w:spacing w:val="-2"/>
-                                <w:sz w:val="18"/>
-                              </w:rPr>
-                              <w:t xml:space="preserve">REGION</w:t>
-                            </w:r>
-                            <w:r>
-                              <w:rPr>
-                                <w:rFonts w:ascii="Calibri"/>
-                                <w:b/>
-                                <w:sz w:val="18"/>
-                              </w:rPr>
-                            </w:r>
-                            <w:r>
-                              <w:rPr>
-                                <w:rFonts w:ascii="Calibri"/>
-                                <w:b/>
-                                <w:sz w:val="18"/>
-                              </w:rPr>
-                            </w:r>
-                          </w:p>
-                        </w:tc>
-                        <w:tc>
-                          <w:tcPr>
-                            <w:tcBorders/>
-                            <w:tcW w:w="1220" w:type="dxa"/>
-                          </w:tcPr>
-                          <w:p>
-                            <w:pPr>
-                              <w:pStyle w:val="939"/>
-                              <w:pBdr/>
-                              <w:spacing w:line="219" w:lineRule="exact"/>
-                              <w:ind w:left="204"/>
-                              <w:rPr>
-                                <w:rFonts w:ascii="Calibri"/>
-                                <w:b/>
-                                <w:sz w:val="18"/>
-                              </w:rPr>
-                            </w:pPr>
-                            <w:r>
-                              <w:rPr>
-                                <w:rFonts w:ascii="Calibri"/>
-                                <w:b/>
-                                <w:spacing w:val="-2"/>
-                                <w:sz w:val="18"/>
-                              </w:rPr>
-                              <w:t xml:space="preserve">AREA/CITY</w:t>
-                            </w:r>
-                            <w:r>
-                              <w:rPr>
-                                <w:rFonts w:ascii="Calibri"/>
-                                <w:b/>
-                                <w:sz w:val="18"/>
-                              </w:rPr>
-                            </w:r>
-                            <w:r>
-                              <w:rPr>
-                                <w:rFonts w:ascii="Calibri"/>
-                                <w:b/>
-                                <w:sz w:val="18"/>
-                              </w:rPr>
-                            </w:r>
-                          </w:p>
-                        </w:tc>
-                        <w:tc>
-                          <w:tcPr>
-                            <w:tcBorders/>
-                            <w:tcW w:w="1469" w:type="dxa"/>
-                          </w:tcPr>
-                          <w:p>
-                            <w:pPr>
-                              <w:pStyle w:val="939"/>
-                              <w:pBdr/>
-                              <w:spacing w:line="219" w:lineRule="exact"/>
-                              <w:ind w:left="206"/>
-                              <w:rPr>
-                                <w:rFonts w:ascii="Calibri"/>
-                                <w:b/>
-                                <w:sz w:val="18"/>
-                              </w:rPr>
-                            </w:pPr>
-                            <w:r>
-                              <w:rPr>
-                                <w:rFonts w:ascii="Calibri"/>
-                                <w:b/>
-                                <w:sz w:val="18"/>
-                              </w:rPr>
-                              <w:t xml:space="preserve">NO</w:t>
-                            </w:r>
-                            <w:r>
-                              <w:rPr>
-                                <w:rFonts w:ascii="Calibri"/>
-                                <w:b/>
-                                <w:spacing w:val="-2"/>
-                                <w:sz w:val="18"/>
-                              </w:rPr>
-                              <w:t xml:space="preserve"> </w:t>
-                            </w:r>
-                            <w:r>
-                              <w:rPr>
-                                <w:rFonts w:ascii="Calibri"/>
-                                <w:b/>
-                                <w:sz w:val="18"/>
-                              </w:rPr>
-                              <w:t xml:space="preserve">OF</w:t>
-                            </w:r>
-                            <w:r>
-                              <w:rPr>
-                                <w:rFonts w:ascii="Calibri"/>
-                                <w:b/>
-                                <w:spacing w:val="-2"/>
-                                <w:sz w:val="18"/>
-                              </w:rPr>
-                              <w:t xml:space="preserve"> NODES</w:t>
-                            </w:r>
-                            <w:r>
-                              <w:rPr>
-                                <w:rFonts w:ascii="Calibri"/>
-                                <w:b/>
-                                <w:sz w:val="18"/>
-                              </w:rPr>
-                            </w:r>
-                            <w:r>
-                              <w:rPr>
-                                <w:rFonts w:ascii="Calibri"/>
-                                <w:b/>
-                                <w:sz w:val="18"/>
-                              </w:rPr>
-                            </w:r>
-                          </w:p>
-                        </w:tc>
-                        <w:tc>
-                          <w:tcPr>
-                            <w:tcBorders/>
-                            <w:tcW w:w="1841" w:type="dxa"/>
-                          </w:tcPr>
-                          <w:p>
-                            <w:pPr>
-                              <w:pStyle w:val="939"/>
-                              <w:pBdr/>
-                              <w:spacing w:line="219" w:lineRule="exact"/>
-                              <w:ind w:left="158"/>
-                              <w:rPr>
-                                <w:rFonts w:ascii="Calibri"/>
-                                <w:b/>
-                                <w:sz w:val="18"/>
-                              </w:rPr>
-                            </w:pPr>
-                            <w:r>
-                              <w:rPr>
-                                <w:rFonts w:ascii="Calibri"/>
-                                <w:b/>
-                                <w:sz w:val="18"/>
-                              </w:rPr>
-                              <w:t xml:space="preserve">ESTIMATED</w:t>
-                            </w:r>
-                            <w:r>
-                              <w:rPr>
-                                <w:rFonts w:ascii="Calibri"/>
-                                <w:b/>
-                                <w:spacing w:val="-4"/>
-                                <w:sz w:val="18"/>
-                              </w:rPr>
-                              <w:t xml:space="preserve"> </w:t>
-                            </w:r>
-                            <w:r>
-                              <w:rPr>
-                                <w:rFonts w:ascii="Calibri"/>
-                                <w:b/>
-                                <w:spacing w:val="-2"/>
-                                <w:sz w:val="18"/>
-                              </w:rPr>
-                              <w:t xml:space="preserve">STRAND</w:t>
-                            </w:r>
-                            <w:r>
-                              <w:rPr>
-                                <w:rFonts w:ascii="Calibri"/>
-                                <w:b/>
-                                <w:sz w:val="18"/>
-                              </w:rPr>
-                            </w:r>
-                            <w:r>
-                              <w:rPr>
-                                <w:rFonts w:ascii="Calibri"/>
-                                <w:b/>
-                                <w:sz w:val="18"/>
-                              </w:rPr>
-                            </w:r>
-                          </w:p>
-                          <w:p>
-                            <w:pPr>
-                              <w:pStyle w:val="939"/>
-                              <w:pBdr/>
-                              <w:spacing w:before="1" w:line="199" w:lineRule="exact"/>
-                              <w:ind w:left="160"/>
-                              <w:rPr>
-                                <w:rFonts w:ascii="Calibri"/>
-                                <w:b/>
-                                <w:sz w:val="18"/>
-                              </w:rPr>
-                            </w:pPr>
-                            <w:r>
-                              <w:rPr>
-                                <w:rFonts w:ascii="Calibri"/>
-                                <w:b/>
-                                <w:sz w:val="18"/>
-                              </w:rPr>
-                              <w:t xml:space="preserve">CABLE</w:t>
-                            </w:r>
-                            <w:r>
-                              <w:rPr>
-                                <w:rFonts w:ascii="Calibri"/>
-                                <w:b/>
-                                <w:spacing w:val="-1"/>
-                                <w:sz w:val="18"/>
-                              </w:rPr>
-                              <w:t xml:space="preserve"> </w:t>
-                            </w:r>
-                            <w:r>
-                              <w:rPr>
-                                <w:rFonts w:ascii="Calibri"/>
-                                <w:b/>
-                                <w:sz w:val="18"/>
-                              </w:rPr>
-                              <w:t xml:space="preserve">LENGTH</w:t>
-                            </w:r>
-                            <w:r>
-                              <w:rPr>
-                                <w:rFonts w:ascii="Calibri"/>
-                                <w:b/>
-                                <w:spacing w:val="-2"/>
-                                <w:sz w:val="18"/>
-                              </w:rPr>
-                              <w:t xml:space="preserve"> </w:t>
-                            </w:r>
-                            <w:r>
-                              <w:rPr>
-                                <w:rFonts w:ascii="Calibri"/>
-                                <w:b/>
-                                <w:spacing w:val="-4"/>
-                                <w:sz w:val="18"/>
-                              </w:rPr>
-                              <w:t xml:space="preserve">(KM)</w:t>
-                            </w:r>
-                            <w:r>
-                              <w:rPr>
-                                <w:rFonts w:ascii="Calibri"/>
-                                <w:b/>
-                                <w:sz w:val="18"/>
-                              </w:rPr>
-                            </w:r>
-                            <w:r>
-                              <w:rPr>
-                                <w:rFonts w:ascii="Calibri"/>
-                                <w:b/>
-                                <w:sz w:val="18"/>
-                              </w:rPr>
-                            </w:r>
-                          </w:p>
-                        </w:tc>
-                      </w:tr>
-                      <w:tr>
-                        <w:trPr>
-                          <w:trHeight w:val="285"/>
-                        </w:trPr>
-                        <w:tc>
-                          <w:tcPr>
-                            <w:tcBorders/>
-                            <w:tcW w:w="701" w:type="dxa"/>
-                          </w:tcPr>
-                          <w:p>
-                            <w:pPr>
-                              <w:pStyle w:val="939"/>
-                              <w:pBdr/>
-                              <w:spacing w:before="1"/>
-                              <w:ind w:right="39" w:left="49"/>
-                              <w:jc w:val="center"/>
-                              <w:rPr>
-                                <w:rFonts w:ascii="Calibri"/>
-                                <w:sz w:val="18"/>
-                              </w:rPr>
-                            </w:pPr>
-                            <w:r>
-                              <w:rPr>
-                                <w:rFonts w:ascii="Calibri"/>
-                                <w:sz w:val="18"/>
-                              </w:rPr>
-                            </w:r>
-                            <w:r>
-                              <w:rPr>
-                                <w:rFonts w:ascii="Calibri"/>
-                                <w:sz w:val="18"/>
-                              </w:rPr>
-                              <w:t xml:space="preserve">{#site_details}{sn}</w:t>
-                            </w:r>
-                            <w:r>
-                              <w:rPr>
-                                <w:rFonts w:ascii="Calibri"/>
-                                <w:sz w:val="18"/>
-                              </w:rPr>
-                            </w:r>
-                            <w:r>
-                              <w:rPr>
-                                <w:rFonts w:ascii="Calibri"/>
-                                <w:sz w:val="18"/>
-                              </w:rPr>
-                            </w:r>
-                          </w:p>
-                        </w:tc>
-                        <w:tc>
-                          <w:tcPr>
-                            <w:tcBorders/>
-                            <w:tcW w:w="1980" w:type="dxa"/>
-                          </w:tcPr>
-                          <w:p>
-                            <w:pPr>
-                              <w:pStyle w:val="939"/>
-                              <w:pBdr/>
-                              <w:spacing w:before="1"/>
-                              <w:ind w:left="108"/>
-                              <w:rPr>
-                                <w:rFonts w:ascii="Calibri"/>
-                                <w:sz w:val="18"/>
-                              </w:rPr>
-                            </w:pPr>
-                            <w:r>
-                              <w:rPr>
-                                <w:rFonts w:ascii="Calibri"/>
-                                <w:sz w:val="18"/>
-                              </w:rPr>
-                              <w:t xml:space="preserve">{region}</w:t>
-                            </w:r>
-                            <w:r>
-                              <w:rPr>
-                                <w:rFonts w:ascii="Calibri"/>
-                                <w:sz w:val="18"/>
-                              </w:rPr>
-                            </w:r>
-                            <w:r>
-                              <w:rPr>
-                                <w:rFonts w:ascii="Calibri"/>
-                                <w:sz w:val="18"/>
-                              </w:rPr>
-                            </w:r>
-                          </w:p>
-                        </w:tc>
-                        <w:tc>
-                          <w:tcPr>
-                            <w:tcBorders/>
-                            <w:tcW w:w="1220" w:type="dxa"/>
-                          </w:tcPr>
-                          <w:p>
-                            <w:pPr>
-                              <w:pStyle w:val="939"/>
-                              <w:pBdr/>
-                              <w:spacing w:before="1"/>
-                              <w:ind w:left="108"/>
-                              <w:rPr>
-                                <w:rFonts w:ascii="Calibri"/>
-                                <w:sz w:val="18"/>
-                              </w:rPr>
-                            </w:pPr>
-                            <w:r>
-                              <w:rPr>
-                                <w:rFonts w:ascii="Calibri"/>
-                                <w:sz w:val="18"/>
-                              </w:rPr>
-                              <w:t xml:space="preserve">{area}</w:t>
-                            </w:r>
-                            <w:r>
-                              <w:rPr>
-                                <w:rFonts w:ascii="Calibri"/>
-                                <w:sz w:val="18"/>
-                              </w:rPr>
-                            </w:r>
-                            <w:r>
-                              <w:rPr>
-                                <w:rFonts w:ascii="Calibri"/>
-                                <w:sz w:val="18"/>
-                              </w:rPr>
-                            </w:r>
-                          </w:p>
-                        </w:tc>
-                        <w:tc>
-                          <w:tcPr>
-                            <w:tcBorders/>
-                            <w:tcW w:w="1469" w:type="dxa"/>
-                          </w:tcPr>
-                          <w:p>
-                            <w:pPr>
-                              <w:pStyle w:val="939"/>
-                              <w:pBdr/>
-                              <w:spacing w:before="66" w:line="199" w:lineRule="exact"/>
-                              <w:ind w:right="96" w:left="0"/>
-                              <w:jc w:val="right"/>
-                              <w:rPr>
-                                <w:rFonts w:ascii="Calibri"/>
-                                <w:sz w:val="18"/>
-                              </w:rPr>
-                            </w:pPr>
-                            <w:r>
-                              <w:rPr>
-                                <w:rFonts w:ascii="Calibri"/>
-                                <w:sz w:val="18"/>
-                              </w:rPr>
-                              <w:t xml:space="preserve">{nodes}</w:t>
-                            </w:r>
-                            <w:r>
-                              <w:rPr>
-                                <w:rFonts w:ascii="Calibri"/>
-                                <w:sz w:val="18"/>
-                              </w:rPr>
-                            </w:r>
-                            <w:r>
-                              <w:rPr>
-                                <w:rFonts w:ascii="Calibri"/>
-                                <w:sz w:val="18"/>
-                              </w:rPr>
-                            </w:r>
-                          </w:p>
-                        </w:tc>
-                        <w:tc>
-                          <w:tcPr>
-                            <w:tcBorders/>
-                            <w:tcW w:w="1841" w:type="dxa"/>
-                          </w:tcPr>
-                          <w:p>
-                            <w:pPr>
-                              <w:pStyle w:val="939"/>
-                              <w:pBdr/>
-                              <w:spacing w:before="1"/>
-                              <w:ind w:right="96" w:left="0"/>
-                              <w:jc w:val="right"/>
-                              <w:rPr>
-                                <w:rFonts w:ascii="Calibri"/>
-                                <w:sz w:val="18"/>
-                              </w:rPr>
-                            </w:pPr>
-                            <w:r>
-                              <w:rPr>
-                                <w:rFonts w:ascii="Calibri"/>
-                                <w:sz w:val="18"/>
-                              </w:rPr>
-                              <w:t xml:space="preserve">{est_km}</w:t>
-                            </w:r>
-                            <w:r>
-                              <w:rPr>
-                                <w:rFonts w:ascii="Calibri"/>
-                                <w:sz w:val="18"/>
-                              </w:rPr>
-                              <w:t xml:space="preserve">{/site_details}</w:t>
-                            </w:r>
-                            <w:r>
-                              <w:rPr>
-                                <w:rFonts w:ascii="Calibri"/>
-                                <w:sz w:val="18"/>
-                              </w:rPr>
-                            </w:r>
-                            <w:r>
-                              <w:rPr>
-                                <w:rFonts w:ascii="Calibri"/>
-                                <w:sz w:val="18"/>
-                              </w:rPr>
-                            </w:r>
-                          </w:p>
-                        </w:tc>
-                      </w:tr>
-                      <w:tr>
-                        <w:trPr>
-                          <w:trHeight w:val="218"/>
-                        </w:trPr>
-                        <w:tc>
-                          <w:tcPr>
-                            <w:gridSpan w:val="3"/>
-                            <w:tcBorders/>
-                            <w:tcW w:w="3901" w:type="dxa"/>
-                          </w:tcPr>
-                          <w:p>
-                            <w:pPr>
-                              <w:pStyle w:val="939"/>
-                              <w:pBdr/>
-                              <w:spacing w:line="198" w:lineRule="exact"/>
-                              <w:ind w:left="6"/>
-                              <w:jc w:val="center"/>
-                              <w:rPr>
-                                <w:rFonts w:ascii="Calibri"/>
-                                <w:b/>
-                                <w:sz w:val="18"/>
-                              </w:rPr>
-                            </w:pPr>
-                            <w:r>
-                              <w:rPr>
-                                <w:rFonts w:ascii="Calibri"/>
-                                <w:b/>
-                                <w:spacing w:val="-2"/>
-                                <w:sz w:val="18"/>
-                              </w:rPr>
-                              <w:t xml:space="preserve">TOTAL</w:t>
-                            </w:r>
-                            <w:r>
-                              <w:rPr>
-                                <w:rFonts w:ascii="Calibri"/>
-                                <w:b/>
-                                <w:sz w:val="18"/>
-                              </w:rPr>
-                            </w:r>
-                            <w:r>
-                              <w:rPr>
-                                <w:rFonts w:ascii="Calibri"/>
-                                <w:b/>
-                                <w:sz w:val="18"/>
-                              </w:rPr>
-                            </w:r>
-                          </w:p>
-                        </w:tc>
-                        <w:tc>
-                          <w:tcPr>
-                            <w:tcBorders/>
-                            <w:tcW w:w="1469" w:type="dxa"/>
-                          </w:tcPr>
-                          <w:p>
-                            <w:pPr>
-                              <w:pStyle w:val="939"/>
-                              <w:pBdr/>
-                              <w:spacing w:line="198" w:lineRule="exact"/>
-                              <w:ind w:right="96" w:left="0"/>
-                              <w:jc w:val="right"/>
-                              <w:rPr>
-                                <w:rFonts w:ascii="Calibri"/>
-                                <w:b/>
-                                <w:sz w:val="18"/>
-                              </w:rPr>
-                            </w:pPr>
-                            <w:r>
-                              <w:rPr>
-                                <w:rFonts w:ascii="Calibri"/>
-                                <w:b/>
-                                <w:sz w:val="18"/>
-                              </w:rPr>
-                              <w:t xml:space="preserve">{total_nodes}</w:t>
-                            </w:r>
-                            <w:r>
-                              <w:rPr>
-                                <w:rFonts w:ascii="Calibri"/>
-                                <w:b/>
-                                <w:sz w:val="18"/>
-                              </w:rPr>
-                            </w:r>
-                            <w:r>
-                              <w:rPr>
-                                <w:rFonts w:ascii="Calibri"/>
-                                <w:b/>
-                                <w:sz w:val="18"/>
-                              </w:rPr>
-                            </w:r>
-                          </w:p>
-                        </w:tc>
-                        <w:tc>
-                          <w:tcPr>
-                            <w:tcBorders/>
-                            <w:tcW w:w="1841" w:type="dxa"/>
-                          </w:tcPr>
-                          <w:p>
-                            <w:pPr>
-                              <w:pStyle w:val="939"/>
-                              <w:pBdr/>
-                              <w:spacing w:line="198" w:lineRule="exact"/>
-                              <w:ind w:right="96" w:left="0"/>
-                              <w:jc w:val="right"/>
-                              <w:rPr>
-                                <w:rFonts w:ascii="Calibri"/>
-                                <w:b/>
-                                <w:sz w:val="18"/>
-                              </w:rPr>
-                            </w:pPr>
-                            <w:r>
-                              <w:rPr>
-                                <w:rFonts w:ascii="Calibri"/>
-                                <w:b/>
-                                <w:sz w:val="18"/>
-                              </w:rPr>
-                              <w:t xml:space="preserve">{total_cable}</w:t>
-                            </w:r>
-                            <w:r>
-                              <w:rPr>
-                                <w:rFonts w:ascii="Calibri"/>
-                                <w:b/>
-                                <w:sz w:val="18"/>
-                              </w:rPr>
-                            </w:r>
-                            <w:r>
-                              <w:rPr>
-                                <w:rFonts w:ascii="Calibri"/>
-                                <w:b/>
-                                <w:sz w:val="18"/>
-                              </w:rPr>
-                            </w:r>
-                          </w:p>
-                        </w:tc>
-                      </w:tr>
-                    </w:tbl>
-                    <w:p>
-                      <w:pPr>
-                        <w:pStyle w:val="937"/>
-                        <w:pBdr/>
-                        <w:spacing/>
-                        <w:ind/>
-                        <w:rPr/>
-                      </w:pPr>
-                      <w:r/>
-                      <w:r/>
-                    </w:p>
-                    <w:p>
-                      <w:pPr>
-                        <w:pStyle w:val="937"/>
-                        <w:pBdr/>
-                        <w:spacing/>
-                        <w:ind/>
-                        <w:rPr/>
-                      </w:pPr>
-                      <w:r/>
-                      <w:r/>
-                    </w:p>
-                    <w:p>
-                      <w:pPr>
-                        <w:pStyle w:val="937"/>
-                        <w:pBdr/>
-                        <w:spacing/>
-                        <w:ind/>
-                        <w:rPr/>
-                      </w:pPr>
-                      <w:r/>
-                      <w:r/>
-                    </w:p>
-                    <w:p>
-                      <w:pPr>
-                        <w:pStyle w:val="937"/>
-                        <w:pBdr/>
-                        <w:spacing/>
-                        <w:ind/>
-                        <w:rPr/>
-                      </w:pPr>
-                      <w:r/>
-                      <w:r/>
-                    </w:p>
-                    <w:p>
-                      <w:pPr>
-                        <w:pStyle w:val="937"/>
-                        <w:pBdr/>
-                        <w:spacing/>
-                        <w:ind/>
-                        <w:rPr/>
-                      </w:pPr>
-                      <w:r/>
-                      <w:r/>
-                    </w:p>
-                    <w:p>
-                      <w:pPr>
-                        <w:pStyle w:val="937"/>
-                        <w:pBdr/>
-                        <w:tabs>
-                          <w:tab w:val="left" w:leader="none" w:pos="4013"/>
-                        </w:tabs>
-                        <w:spacing/>
-                        <w:ind/>
-                        <w:rPr/>
-                      </w:pPr>
-                      <w:r>
-                        <w:tab/>
-                      </w:r>
-                      <w:r/>
-                    </w:p>
-                  </w:txbxContent>
-                </v:textbox>
-              </v:shape>
-            </w:pict>
-          </mc:Fallback>
-        </mc:AlternateContent>
+        <w:tbl>
+          <w:tblPr>
+            <w:tblInd w:w="65" w:type="dxa"/>
+            <w:tblW w:w="0" w:type="auto"/>
+            <w:tblCellMar>
+              <w:left w:w="0" w:type="dxa"/>
+              <w:right w:w="0" w:type="dxa"/>
+            </w:tblCellMar>
+            <w:tblBorders>
+              <w:top w:val="single" w:color="000000" w:sz="4" w:space="0"/>
+              <w:left w:val="single" w:color="000000" w:sz="4" w:space="0"/>
+              <w:bottom w:val="single" w:color="000000" w:sz="4" w:space="0"/>
+              <w:right w:val="single" w:color="000000" w:sz="4" w:space="0"/>
+              <w:insideH w:val="single" w:color="000000" w:sz="4" w:space="0"/>
+              <w:insideV w:val="single" w:color="000000" w:sz="4" w:space="0"/>
+            </w:tblBorders>
+            <w:tblLayout w:type="fixed"/>
+            <w:tblLook w:val="01E0" w:firstRow="1" w:lastRow="1" w:firstColumn="1" w:lastColumn="1" w:noHBand="0" w:noVBand="0"/>
+          </w:tblPr>
+          <w:tblGrid>
+            <w:gridCol w:w="701"/>
+            <w:gridCol w:w="1980"/>
+            <w:gridCol w:w="1220"/>
+            <w:gridCol w:w="1469"/>
+            <w:gridCol w:w="1841"/>
+          </w:tblGrid>
+          <w:tr>
+            <w:trPr>
+              <w:trHeight w:val="438"/>
+            </w:trPr>
+            <w:tc>
+              <w:tcPr>
+                <w:tcBorders/>
+                <w:tcW w:w="701" w:type="dxa"/>
+              </w:tcPr>
+              <w:p>
+                <w:pPr>
+                  <w:pStyle w:val="939"/>
+                  <w:pBdr/>
+                  <w:spacing w:line="219" w:lineRule="exact"/>
+                  <w:ind w:left="49"/>
+                  <w:jc w:val="center"/>
+                  <w:rPr>
+                    <w:rFonts w:ascii="Calibri"/>
+                    <w:b/>
+                    <w:sz w:val="18"/>
+                  </w:rPr>
+                </w:pPr>
+                <w:r>
+                  <w:rPr>
+                    <w:rFonts w:ascii="Calibri"/>
+                    <w:b/>
+                    <w:spacing w:val="-5"/>
+                    <w:sz w:val="18"/>
+                  </w:rPr>
+                  <w:t xml:space="preserve">S/N</w:t>
+                </w:r>
+                <w:r>
+                  <w:rPr>
+                    <w:rFonts w:ascii="Calibri"/>
+                    <w:b/>
+                    <w:sz w:val="18"/>
+                  </w:rPr>
+                </w:r>
+                <w:r>
+                  <w:rPr>
+                    <w:rFonts w:ascii="Calibri"/>
+                    <w:b/>
+                    <w:sz w:val="18"/>
+                  </w:rPr>
+                </w:r>
+              </w:p>
+            </w:tc>
+            <w:tc>
+              <w:tcPr>
+                <w:tcBorders/>
+                <w:tcW w:w="1980" w:type="dxa"/>
+              </w:tcPr>
+              <w:p>
+                <w:pPr>
+                  <w:pStyle w:val="939"/>
+                  <w:pBdr/>
+                  <w:spacing w:line="219" w:lineRule="exact"/>
+                  <w:ind w:left="10"/>
+                  <w:jc w:val="center"/>
+                  <w:rPr>
+                    <w:rFonts w:ascii="Calibri"/>
+                    <w:b/>
+                    <w:sz w:val="18"/>
+                  </w:rPr>
+                </w:pPr>
+                <w:r>
+                  <w:rPr>
+                    <w:rFonts w:ascii="Calibri"/>
+                    <w:b/>
+                    <w:spacing w:val="-2"/>
+                    <w:sz w:val="18"/>
+                  </w:rPr>
+                  <w:t xml:space="preserve">REGION</w:t>
+                </w:r>
+                <w:r>
+                  <w:rPr>
+                    <w:rFonts w:ascii="Calibri"/>
+                    <w:b/>
+                    <w:sz w:val="18"/>
+                  </w:rPr>
+                </w:r>
+                <w:r>
+                  <w:rPr>
+                    <w:rFonts w:ascii="Calibri"/>
+                    <w:b/>
+                    <w:sz w:val="18"/>
+                  </w:rPr>
+                </w:r>
+              </w:p>
+            </w:tc>
+            <w:tc>
+              <w:tcPr>
+                <w:tcBorders/>
+                <w:tcW w:w="1220" w:type="dxa"/>
+              </w:tcPr>
+              <w:p>
+                <w:pPr>
+                  <w:pStyle w:val="939"/>
+                  <w:pBdr/>
+                  <w:spacing w:line="219" w:lineRule="exact"/>
+                  <w:ind w:left="204"/>
+                  <w:rPr>
+                    <w:rFonts w:ascii="Calibri"/>
+                    <w:b/>
+                    <w:sz w:val="18"/>
+                  </w:rPr>
+                </w:pPr>
+                <w:r>
+                  <w:rPr>
+                    <w:rFonts w:ascii="Calibri"/>
+                    <w:b/>
+                    <w:spacing w:val="-2"/>
+                    <w:sz w:val="18"/>
+                  </w:rPr>
+                  <w:t xml:space="preserve">AREA/CITY</w:t>
+                </w:r>
+                <w:r>
+                  <w:rPr>
+                    <w:rFonts w:ascii="Calibri"/>
+                    <w:b/>
+                    <w:sz w:val="18"/>
+                  </w:rPr>
+                </w:r>
+                <w:r>
+                  <w:rPr>
+                    <w:rFonts w:ascii="Calibri"/>
+                    <w:b/>
+                    <w:sz w:val="18"/>
+                  </w:rPr>
+                </w:r>
+              </w:p>
+            </w:tc>
+            <w:tc>
+              <w:tcPr>
+                <w:tcBorders/>
+                <w:tcW w:w="1469" w:type="dxa"/>
+              </w:tcPr>
+              <w:p>
+                <w:pPr>
+                  <w:pStyle w:val="939"/>
+                  <w:pBdr/>
+                  <w:spacing w:line="219" w:lineRule="exact"/>
+                  <w:ind w:left="206"/>
+                  <w:rPr>
+                    <w:rFonts w:ascii="Calibri"/>
+                    <w:b/>
+                    <w:sz w:val="18"/>
+                  </w:rPr>
+                </w:pPr>
+                <w:r>
+                  <w:rPr>
+                    <w:rFonts w:ascii="Calibri"/>
+                    <w:b/>
+                    <w:sz w:val="18"/>
+                  </w:rPr>
+                  <w:t xml:space="preserve">NO</w:t>
+                </w:r>
+                <w:r>
+                  <w:rPr>
+                    <w:rFonts w:ascii="Calibri"/>
+                    <w:b/>
+                    <w:spacing w:val="-2"/>
+                    <w:sz w:val="18"/>
+                  </w:rPr>
+                  <w:t xml:space="preserve"> </w:t>
+                </w:r>
+                <w:r>
+                  <w:rPr>
+                    <w:rFonts w:ascii="Calibri"/>
+                    <w:b/>
+                    <w:sz w:val="18"/>
+                  </w:rPr>
+                  <w:t xml:space="preserve">OF</w:t>
+                </w:r>
+                <w:r>
+                  <w:rPr>
+                    <w:rFonts w:ascii="Calibri"/>
+                    <w:b/>
+                    <w:spacing w:val="-2"/>
+                    <w:sz w:val="18"/>
+                  </w:rPr>
+                  <w:t xml:space="preserve"> NODES</w:t>
+                </w:r>
+                <w:r>
+                  <w:rPr>
+                    <w:rFonts w:ascii="Calibri"/>
+                    <w:b/>
+                    <w:sz w:val="18"/>
+                  </w:rPr>
+                </w:r>
+                <w:r>
+                  <w:rPr>
+                    <w:rFonts w:ascii="Calibri"/>
+                    <w:b/>
+                    <w:sz w:val="18"/>
+                  </w:rPr>
+                </w:r>
+              </w:p>
+            </w:tc>
+            <w:tc>
+              <w:tcPr>
+                <w:tcBorders/>
+                <w:tcW w:w="1841" w:type="dxa"/>
+              </w:tcPr>
+              <w:p>
+                <w:pPr>
+                  <w:pStyle w:val="939"/>
+                  <w:pBdr/>
+                  <w:spacing w:line="219" w:lineRule="exact"/>
+                  <w:ind w:left="158"/>
+                  <w:rPr>
+                    <w:rFonts w:ascii="Calibri"/>
+                    <w:b/>
+                    <w:sz w:val="18"/>
+                  </w:rPr>
+                </w:pPr>
+                <w:r>
+                  <w:rPr>
+                    <w:rFonts w:ascii="Calibri"/>
+                    <w:b/>
+                    <w:sz w:val="18"/>
+                  </w:rPr>
+                  <w:t xml:space="preserve">ESTIMATED</w:t>
+                </w:r>
+                <w:r>
+                  <w:rPr>
+                    <w:rFonts w:ascii="Calibri"/>
+                    <w:b/>
+                    <w:spacing w:val="-4"/>
+                    <w:sz w:val="18"/>
+                  </w:rPr>
+                  <w:t xml:space="preserve"> </w:t>
+                </w:r>
+                <w:r>
+                  <w:rPr>
+                    <w:rFonts w:ascii="Calibri"/>
+                    <w:b/>
+                    <w:spacing w:val="-2"/>
+                    <w:sz w:val="18"/>
+                  </w:rPr>
+                  <w:t xml:space="preserve">STRAND</w:t>
+                </w:r>
+                <w:r>
+                  <w:rPr>
+                    <w:rFonts w:ascii="Calibri"/>
+                    <w:b/>
+                    <w:sz w:val="18"/>
+                  </w:rPr>
+                </w:r>
+                <w:r>
+                  <w:rPr>
+                    <w:rFonts w:ascii="Calibri"/>
+                    <w:b/>
+                    <w:sz w:val="18"/>
+                  </w:rPr>
+                </w:r>
+              </w:p>
+              <w:p>
+                <w:pPr>
+                  <w:pStyle w:val="939"/>
+                  <w:pBdr/>
+                  <w:spacing w:before="1" w:line="199" w:lineRule="exact"/>
+                  <w:ind w:left="160"/>
+                  <w:rPr>
+                    <w:rFonts w:ascii="Calibri"/>
+                    <w:b/>
+                    <w:sz w:val="18"/>
+                  </w:rPr>
+                </w:pPr>
+                <w:r>
+                  <w:rPr>
+                    <w:rFonts w:ascii="Calibri"/>
+                    <w:b/>
+                    <w:sz w:val="18"/>
+                  </w:rPr>
+                  <w:t xml:space="preserve">CABLE</w:t>
+                </w:r>
+                <w:r>
+                  <w:rPr>
+                    <w:rFonts w:ascii="Calibri"/>
+                    <w:b/>
+                    <w:spacing w:val="-1"/>
+                    <w:sz w:val="18"/>
+                  </w:rPr>
+                  <w:t xml:space="preserve"> </w:t>
+                </w:r>
+                <w:r>
+                  <w:rPr>
+                    <w:rFonts w:ascii="Calibri"/>
+                    <w:b/>
+                    <w:sz w:val="18"/>
+                  </w:rPr>
+                  <w:t xml:space="preserve">LENGTH</w:t>
+                </w:r>
+                <w:r>
+                  <w:rPr>
+                    <w:rFonts w:ascii="Calibri"/>
+                    <w:b/>
+                    <w:spacing w:val="-2"/>
+                    <w:sz w:val="18"/>
+                  </w:rPr>
+                  <w:t xml:space="preserve"> </w:t>
+                </w:r>
+                <w:r>
+                  <w:rPr>
+                    <w:rFonts w:ascii="Calibri"/>
+                    <w:b/>
+                    <w:spacing w:val="-4"/>
+                    <w:sz w:val="18"/>
+                  </w:rPr>
+                  <w:t xml:space="preserve">(KM)</w:t>
+                </w:r>
+                <w:r>
+                  <w:rPr>
+                    <w:rFonts w:ascii="Calibri"/>
+                    <w:b/>
+                    <w:sz w:val="18"/>
+                  </w:rPr>
+                </w:r>
+                <w:r>
+                  <w:rPr>
+                    <w:rFonts w:ascii="Calibri"/>
+                    <w:b/>
+                    <w:sz w:val="18"/>
+                  </w:rPr>
+                </w:r>
+              </w:p>
+            </w:tc>
+          </w:tr>
+          <w:tr>
+            <w:trPr>
+              <w:trHeight w:val="285"/>
+            </w:trPr>
+            <w:tc>
+              <w:tcPr>
+                <w:tcBorders/>
+                <w:tcW w:w="701" w:type="dxa"/>
+              </w:tcPr>
+              <w:p>
+                <w:pPr>
+                  <w:pStyle w:val="939"/>
+                  <w:pBdr/>
+                  <w:spacing w:before="1"/>
+                  <w:ind w:right="39" w:left="49"/>
+                  <w:jc w:val="center"/>
+                  <w:rPr>
+                    <w:rFonts w:ascii="Calibri"/>
+                    <w:sz w:val="18"/>
+                  </w:rPr>
+                </w:pPr>
+                <w:r>
+                  <w:rPr>
+                    <w:rFonts w:ascii="Calibri"/>
+                    <w:sz w:val="18"/>
+                  </w:rPr>
+                </w:r>
+                <w:r>
+                  <w:rPr>
+                    <w:rFonts w:ascii="Calibri"/>
+                    <w:sz w:val="18"/>
+                  </w:rPr>
+                  <w:t xml:space="preserve">{#site_details}{sn}</w:t>
+                </w:r>
+                <w:r>
+                  <w:rPr>
+                    <w:rFonts w:ascii="Calibri"/>
+                    <w:sz w:val="18"/>
+                  </w:rPr>
+                </w:r>
+                <w:r>
+                  <w:rPr>
+                    <w:rFonts w:ascii="Calibri"/>
+                    <w:sz w:val="18"/>
+                  </w:rPr>
+                </w:r>
+              </w:p>
+            </w:tc>
+            <w:tc>
+              <w:tcPr>
+                <w:tcBorders/>
+                <w:tcW w:w="1980" w:type="dxa"/>
+              </w:tcPr>
+              <w:p>
+                <w:pPr>
+                  <w:pStyle w:val="939"/>
+                  <w:pBdr/>
+                  <w:spacing w:before="1"/>
+                  <w:ind w:left="108"/>
+                  <w:rPr>
+                    <w:rFonts w:ascii="Calibri"/>
+                    <w:sz w:val="18"/>
+                  </w:rPr>
+                </w:pPr>
+                <w:r>
+                  <w:rPr>
+                    <w:rFonts w:ascii="Calibri"/>
+                    <w:sz w:val="18"/>
+                  </w:rPr>
+                  <w:t xml:space="preserve">{region}</w:t>
+                </w:r>
+                <w:r>
+                  <w:rPr>
+                    <w:rFonts w:ascii="Calibri"/>
+                    <w:sz w:val="18"/>
+                  </w:rPr>
+                </w:r>
+                <w:r>
+                  <w:rPr>
+                    <w:rFonts w:ascii="Calibri"/>
+                    <w:sz w:val="18"/>
+                  </w:rPr>
+                </w:r>
+              </w:p>
+            </w:tc>
+            <w:tc>
+              <w:tcPr>
+                <w:tcBorders/>
+                <w:tcW w:w="1220" w:type="dxa"/>
+              </w:tcPr>
+              <w:p>
+                <w:pPr>
+                  <w:pStyle w:val="939"/>
+                  <w:pBdr/>
+                  <w:spacing w:before="1"/>
+                  <w:ind w:left="108"/>
+                  <w:rPr>
+                    <w:rFonts w:ascii="Calibri"/>
+                    <w:sz w:val="18"/>
+                  </w:rPr>
+                </w:pPr>
+                <w:r>
+                  <w:rPr>
+                    <w:rFonts w:ascii="Calibri"/>
+                    <w:sz w:val="18"/>
+                  </w:rPr>
+                  <w:t xml:space="preserve">{area}</w:t>
+                </w:r>
+                <w:r>
+                  <w:rPr>
+                    <w:rFonts w:ascii="Calibri"/>
+                    <w:sz w:val="18"/>
+                  </w:rPr>
+                </w:r>
+                <w:r>
+                  <w:rPr>
+                    <w:rFonts w:ascii="Calibri"/>
+                    <w:sz w:val="18"/>
+                  </w:rPr>
+                </w:r>
+              </w:p>
+            </w:tc>
+            <w:tc>
+              <w:tcPr>
+                <w:tcBorders/>
+                <w:tcW w:w="1469" w:type="dxa"/>
+              </w:tcPr>
+              <w:p>
+                <w:pPr>
+                  <w:pStyle w:val="939"/>
+                  <w:pBdr/>
+                  <w:spacing w:before="66" w:line="199" w:lineRule="exact"/>
+                  <w:ind w:right="96" w:left="0"/>
+                  <w:jc w:val="right"/>
+                  <w:rPr>
+                    <w:rFonts w:ascii="Calibri"/>
+                    <w:sz w:val="18"/>
+                  </w:rPr>
+                </w:pPr>
+                <w:r>
+                  <w:rPr>
+                    <w:rFonts w:ascii="Calibri"/>
+                    <w:sz w:val="18"/>
+                  </w:rPr>
+                  <w:t xml:space="preserve">{nodes}</w:t>
+                </w:r>
+                <w:r>
+                  <w:rPr>
+                    <w:rFonts w:ascii="Calibri"/>
+                    <w:sz w:val="18"/>
+                  </w:rPr>
+                </w:r>
+                <w:r>
+                  <w:rPr>
+                    <w:rFonts w:ascii="Calibri"/>
+                    <w:sz w:val="18"/>
+                  </w:rPr>
+                </w:r>
+              </w:p>
+            </w:tc>
+            <w:tc>
+              <w:tcPr>
+                <w:tcBorders/>
+                <w:tcW w:w="1841" w:type="dxa"/>
+              </w:tcPr>
+              <w:p>
+                <w:pPr>
+                  <w:pStyle w:val="939"/>
+                  <w:pBdr/>
+                  <w:spacing w:before="1"/>
+                  <w:ind w:right="96" w:left="0"/>
+                  <w:jc w:val="right"/>
+                  <w:rPr>
+                    <w:rFonts w:ascii="Calibri"/>
+                    <w:sz w:val="18"/>
+                  </w:rPr>
+                </w:pPr>
+                <w:r>
+                  <w:rPr>
+                    <w:rFonts w:ascii="Calibri"/>
+                    <w:sz w:val="18"/>
+                  </w:rPr>
+                  <w:t xml:space="preserve">{est_km}</w:t>
+                </w:r>
+                <w:r>
+                  <w:rPr>
+                    <w:rFonts w:ascii="Calibri"/>
+                    <w:sz w:val="18"/>
+                  </w:rPr>
+                  <w:t xml:space="preserve">{/site_details}</w:t>
+                </w:r>
+                <w:r>
+                  <w:rPr>
+                    <w:rFonts w:ascii="Calibri"/>
+                    <w:sz w:val="18"/>
+                  </w:rPr>
+                </w:r>
+                <w:r>
+                  <w:rPr>
+                    <w:rFonts w:ascii="Calibri"/>
+                    <w:sz w:val="18"/>
+                  </w:rPr>
+                </w:r>
+              </w:p>
+            </w:tc>
+          </w:tr>
+          <w:tr>
+            <w:trPr>
+              <w:trHeight w:val="218"/>
+            </w:trPr>
+            <w:tc>
+              <w:tcPr>
+                <w:gridSpan w:val="3"/>
+                <w:tcBorders/>
+                <w:tcW w:w="3901" w:type="dxa"/>
+              </w:tcPr>
+              <w:p>
+                <w:pPr>
+                  <w:pStyle w:val="939"/>
+                  <w:pBdr/>
+                  <w:spacing w:line="198" w:lineRule="exact"/>
+                  <w:ind w:left="6"/>
+                  <w:jc w:val="center"/>
+                  <w:rPr>
+                    <w:rFonts w:ascii="Calibri"/>
+                    <w:b/>
+                    <w:sz w:val="18"/>
+                  </w:rPr>
+                </w:pPr>
+                <w:r>
+                  <w:rPr>
+                    <w:rFonts w:ascii="Calibri"/>
+                    <w:b/>
+                    <w:spacing w:val="-2"/>
+                    <w:sz w:val="18"/>
+                  </w:rPr>
+                  <w:t xml:space="preserve">TOTAL</w:t>
+                </w:r>
+                <w:r>
+                  <w:rPr>
+                    <w:rFonts w:ascii="Calibri"/>
+                    <w:b/>
+                    <w:sz w:val="18"/>
+                  </w:rPr>
+                </w:r>
+                <w:r>
+                  <w:rPr>
+                    <w:rFonts w:ascii="Calibri"/>
+                    <w:b/>
+                    <w:sz w:val="18"/>
+                  </w:rPr>
+                </w:r>
+              </w:p>
+            </w:tc>
+            <w:tc>
+              <w:tcPr>
+                <w:tcBorders/>
+                <w:tcW w:w="1469" w:type="dxa"/>
+              </w:tcPr>
+              <w:p>
+                <w:pPr>
+                  <w:pStyle w:val="939"/>
+                  <w:pBdr/>
+                  <w:spacing w:line="198" w:lineRule="exact"/>
+                  <w:ind w:right="96" w:left="0"/>
+                  <w:jc w:val="right"/>
+                  <w:rPr>
+                    <w:rFonts w:ascii="Calibri"/>
+                    <w:b/>
+                    <w:sz w:val="18"/>
+                  </w:rPr>
+                </w:pPr>
+                <w:r>
+                  <w:rPr>
+                    <w:rFonts w:ascii="Calibri"/>
+                    <w:b/>
+                    <w:sz w:val="18"/>
+                  </w:rPr>
+                  <w:t xml:space="preserve">{total_nodes}</w:t>
+                </w:r>
+                <w:r>
+                  <w:rPr>
+                    <w:rFonts w:ascii="Calibri"/>
+                    <w:b/>
+                    <w:sz w:val="18"/>
+                  </w:rPr>
+                </w:r>
+                <w:r>
+                  <w:rPr>
+                    <w:rFonts w:ascii="Calibri"/>
+                    <w:b/>
+                    <w:sz w:val="18"/>
+                  </w:rPr>
+                </w:r>
+              </w:p>
+            </w:tc>
+            <w:tc>
+              <w:tcPr>
+                <w:tcBorders/>
+                <w:tcW w:w="1841" w:type="dxa"/>
+              </w:tcPr>
+              <w:p>
+                <w:pPr>
+                  <w:pStyle w:val="939"/>
+                  <w:pBdr/>
+                  <w:spacing w:line="198" w:lineRule="exact"/>
+                  <w:ind w:right="96" w:left="0"/>
+                  <w:jc w:val="right"/>
+                  <w:rPr>
+                    <w:rFonts w:ascii="Calibri"/>
+                    <w:b/>
+                    <w:sz w:val="18"/>
+                  </w:rPr>
+                </w:pPr>
+                <w:r>
+                  <w:rPr>
+                    <w:rFonts w:ascii="Calibri"/>
+                    <w:b/>
+                    <w:sz w:val="18"/>
+                  </w:rPr>
+                  <w:t xml:space="preserve">{total_cable}</w:t>
+                </w:r>
+                <w:r>
+                  <w:rPr>
+                    <w:rFonts w:ascii="Calibri"/>
+                    <w:b/>
+                    <w:sz w:val="18"/>
+                  </w:rPr>
+                </w:r>
+                <w:r>
+                  <w:rPr>
+                    <w:rFonts w:ascii="Calibri"/>
+                    <w:b/>
+                    <w:sz w:val="18"/>
+                  </w:rPr>
+                </w:r>
+              </w:p>
+            </w:tc>
+          </w:tr>
+        </w:tbl>
       </w:r>
       <w:r>
         <w:rPr>

</xml_diff>

<commit_message>
fix: update PO template - payment terms, T&C, and site details layout
- Replace {payment_terms} placeholder with static text 'Refer to the PO notes below.'
- Update ref number CM-1N-2026-015 to CM-1N-2026-017
- Change payment item 3b from 70% to 60%
- Add item 3c (10% retention fee)
- Fix 2-column section to 1-column before site details table (fixes Eigenpal rendering)
</commit_message>
<xml_diff>
--- a/public/templates/PO_TEMPLATE_ORIGINAL.docx
+++ b/public/templates/PO_TEMPLATE_ORIGINAL.docx
@@ -570,10 +570,7 @@
           <w:pgSz w:h="16838" w:orient="portrait" w:w="11906"/>
           <w:pgMar w:top="700" w:right="0" w:bottom="1200" w:left="720" w:header="0" w:footer="1012" w:gutter="0"/>
           <w:pgNumType w:start="1"/>
-          <w:cols w:num="2" w:sep="0" w:space="720" w:equalWidth="0">
-            <w:col w:w="4958" w:space="1987"/>
-            <w:col w:w="4575" w:space="0"/>
-          </w:cols>
+          <w:cols w:num="1" w:sep="0" w:space="720" w:equalWidth="1"/>
         </w:sectPr>
       </w:pPr>
       <w:r>
@@ -892,19 +889,19 @@
               <w:rPr>
                 <w:sz w:val="20"/>
               </w:rPr>
-              <w:t xml:space="preserve">{</w:t>
-            </w:r>
-            <w:r>
-              <w:rPr>
-                <w:sz w:val="20"/>
-              </w:rPr>
-              <w:t xml:space="preserve">payment_terms</w:t>
-            </w:r>
-            <w:r>
-              <w:rPr>
-                <w:sz w:val="20"/>
-              </w:rPr>
-              <w:t xml:space="preserve">}</w:t>
+              <w:t xml:space="preserve">Refer to the PO notes below.</w:t>
+            </w:r>
+            <w:r>
+              <w:rPr>
+                <w:sz w:val="20"/>
+              </w:rPr>
+              <w:t xml:space="preserve"/>
+            </w:r>
+            <w:r>
+              <w:rPr>
+                <w:sz w:val="20"/>
+              </w:rPr>
+              <w:t xml:space="preserve"/>
             </w:r>
             <w:r>
               <w:rPr>
@@ -4795,19 +4792,19 @@
               <w:rPr>
                 <w:sz w:val="20"/>
               </w:rPr>
-              <w:t xml:space="preserve">{</w:t>
-            </w:r>
-            <w:r>
-              <w:rPr>
-                <w:sz w:val="20"/>
-              </w:rPr>
-              <w:t xml:space="preserve">payment_terms</w:t>
-            </w:r>
-            <w:r>
-              <w:rPr>
-                <w:sz w:val="20"/>
-              </w:rPr>
-              <w:t xml:space="preserve">}</w:t>
+              <w:t xml:space="preserve">Refer to the PO notes below.</w:t>
+            </w:r>
+            <w:r>
+              <w:rPr>
+                <w:sz w:val="20"/>
+              </w:rPr>
+              <w:t xml:space="preserve"/>
+            </w:r>
+            <w:r>
+              <w:rPr>
+                <w:sz w:val="20"/>
+              </w:rPr>
+              <w:t xml:space="preserve"/>
             </w:r>
             <w:r>
               <w:rPr>
@@ -5685,7 +5682,7 @@
               <w:rPr>
                 <w:sz w:val="18"/>
               </w:rPr>
-              <w:t xml:space="preserve">CM-1N-2026-015,</w:t>
+              <w:t xml:space="preserve">CM-1N-2026-017,</w:t>
             </w:r>
             <w:r>
               <w:rPr>
@@ -6645,10 +6642,81 @@
               <w:rPr>
                 <w:sz w:val="18"/>
               </w:rPr>
+              <w:t xml:space="preserve">60%</w:t>
+            </w:r>
+            <w:r>
+              <w:rPr>
+                <w:spacing w:val="-1"/>
+                <w:sz w:val="18"/>
+              </w:rPr>
+              <w:t xml:space="preserve"/>
+            </w:r>
+            <w:r>
+              <w:rPr>
+                <w:sz w:val="18"/>
+              </w:rPr>
+              <w:t xml:space="preserve"/>
+            </w:r>
+            <w:r>
+              <w:rPr>
+                <w:sz w:val="18"/>
+              </w:rPr>
+              <w:t xml:space="preserve"/>
+            </w:r>
+            <w:r>
+              <w:rPr>
+                <w:spacing w:val="-2"/>
+                <w:sz w:val="18"/>
+              </w:rPr>
+              <w:t xml:space="preserve"> </w:t>
+            </w:r>
+            <w:r>
+              <w:rPr>
+                <w:sz w:val="18"/>
+              </w:rPr>
+              <w:t xml:space="preserve">of</w:t>
+            </w:r>
+            <w:r>
+              <w:rPr>
+                <w:spacing w:val="-3"/>
+                <w:sz w:val="18"/>
+              </w:rPr>
+              <w:t xml:space="preserve"> </w:t>
+            </w:r>
+            <w:r>
+              <w:rPr>
+                <w:sz w:val="18"/>
+              </w:rPr>
               <w:t xml:space="preserve">the</w:t>
             </w:r>
             <w:r>
               <w:rPr>
+                <w:spacing w:val="-2"/>
+                <w:sz w:val="18"/>
+              </w:rPr>
+              <w:t xml:space="preserve"> </w:t>
+            </w:r>
+            <w:r>
+              <w:rPr>
+                <w:sz w:val="18"/>
+              </w:rPr>
+              <w:t xml:space="preserve">value</w:t>
+            </w:r>
+            <w:r>
+              <w:rPr>
+                <w:spacing w:val="-2"/>
+                <w:sz w:val="18"/>
+              </w:rPr>
+              <w:t xml:space="preserve"> </w:t>
+            </w:r>
+            <w:r>
+              <w:rPr>
+                <w:sz w:val="18"/>
+              </w:rPr>
+              <w:t xml:space="preserve">shall</w:t>
+            </w:r>
+            <w:r>
+              <w:rPr>
                 <w:spacing w:val="-1"/>
                 <w:sz w:val="18"/>
               </w:rPr>
@@ -6658,13 +6726,7 @@
               <w:rPr>
                 <w:sz w:val="18"/>
               </w:rPr>
-              <w:t xml:space="preserve">70</w:t>
-            </w:r>
-            <w:r>
-              <w:rPr>
-                <w:sz w:val="18"/>
-              </w:rPr>
-              <w:t xml:space="preserve">%</w:t>
+              <w:t xml:space="preserve">be</w:t>
             </w:r>
             <w:r>
               <w:rPr>
@@ -6677,6 +6739,149 @@
               <w:rPr>
                 <w:sz w:val="18"/>
               </w:rPr>
+              <w:t xml:space="preserve">paid</w:t>
+            </w:r>
+            <w:r>
+              <w:rPr>
+                <w:spacing w:val="-1"/>
+                <w:sz w:val="18"/>
+              </w:rPr>
+              <w:t xml:space="preserve"> </w:t>
+            </w:r>
+            <w:r>
+              <w:rPr>
+                <w:sz w:val="18"/>
+              </w:rPr>
+              <w:t xml:space="preserve">via</w:t>
+            </w:r>
+            <w:r>
+              <w:rPr>
+                <w:spacing w:val="-2"/>
+                <w:sz w:val="18"/>
+              </w:rPr>
+              <w:t xml:space="preserve"> </w:t>
+            </w:r>
+            <w:r>
+              <w:rPr>
+                <w:sz w:val="18"/>
+              </w:rPr>
+              <w:t xml:space="preserve">Progressive</w:t>
+            </w:r>
+            <w:r>
+              <w:rPr>
+                <w:spacing w:val="-2"/>
+                <w:sz w:val="18"/>
+              </w:rPr>
+              <w:t xml:space="preserve"> </w:t>
+            </w:r>
+            <w:r>
+              <w:rPr>
+                <w:sz w:val="18"/>
+              </w:rPr>
+              <w:t xml:space="preserve">Billing</w:t>
+            </w:r>
+            <w:r>
+              <w:rPr>
+                <w:spacing w:val="-1"/>
+                <w:sz w:val="18"/>
+              </w:rPr>
+              <w:t xml:space="preserve"> </w:t>
+            </w:r>
+            <w:r>
+              <w:rPr>
+                <w:sz w:val="18"/>
+              </w:rPr>
+              <w:t xml:space="preserve">on</w:t>
+            </w:r>
+            <w:r>
+              <w:rPr>
+                <w:spacing w:val="-2"/>
+                <w:sz w:val="18"/>
+              </w:rPr>
+              <w:t xml:space="preserve"> </w:t>
+            </w:r>
+            <w:r>
+              <w:rPr>
+                <w:sz w:val="18"/>
+              </w:rPr>
+              <w:t xml:space="preserve">a</w:t>
+            </w:r>
+            <w:r>
+              <w:rPr>
+                <w:spacing w:val="-3"/>
+                <w:sz w:val="18"/>
+              </w:rPr>
+              <w:t xml:space="preserve"> </w:t>
+            </w:r>
+            <w:r>
+              <w:rPr>
+                <w:sz w:val="18"/>
+              </w:rPr>
+              <w:t xml:space="preserve">per</w:t>
+            </w:r>
+            <w:r>
+              <w:rPr>
+                <w:spacing w:val="-1"/>
+                <w:sz w:val="18"/>
+              </w:rPr>
+              <w:t xml:space="preserve"> </w:t>
+            </w:r>
+            <w:r>
+              <w:rPr>
+                <w:sz w:val="18"/>
+              </w:rPr>
+              <w:t xml:space="preserve">completed</w:t>
+            </w:r>
+            <w:r>
+              <w:rPr>
+                <w:spacing w:val="-2"/>
+                <w:sz w:val="18"/>
+              </w:rPr>
+              <w:t xml:space="preserve"> </w:t>
+            </w:r>
+            <w:r>
+              <w:rPr>
+                <w:sz w:val="18"/>
+              </w:rPr>
+              <w:t xml:space="preserve">Node</w:t>
+            </w:r>
+            <w:r>
+              <w:rPr>
+                <w:spacing w:val="-2"/>
+                <w:sz w:val="18"/>
+              </w:rPr>
+              <w:t xml:space="preserve"> </w:t>
+            </w:r>
+            <w:r>
+              <w:rPr>
+                <w:sz w:val="18"/>
+              </w:rPr>
+              <w:t xml:space="preserve">or</w:t>
+            </w:r>
+            <w:r>
+              <w:rPr>
+                <w:spacing w:val="-1"/>
+                <w:sz w:val="18"/>
+              </w:rPr>
+              <w:t xml:space="preserve"> </w:t>
+            </w:r>
+            <w:r>
+              <w:rPr>
+                <w:sz w:val="18"/>
+              </w:rPr>
+              <w:t xml:space="preserve">batch</w:t>
+            </w:r>
+            <w:r>
+              <w:rPr>
+                <w:spacing w:val="-2"/>
+                <w:sz w:val="18"/>
+              </w:rPr>
+              <w:t xml:space="preserve"> </w:t>
+            </w:r>
+            <w:r>
+              <w:rPr>
+                <w:sz w:val="18"/>
+              </w:rPr>
               <w:t xml:space="preserve">of</w:t>
             </w:r>
             <w:r>
@@ -6690,214 +6895,6 @@
               <w:rPr>
                 <w:sz w:val="18"/>
               </w:rPr>
-              <w:t xml:space="preserve">the</w:t>
-            </w:r>
-            <w:r>
-              <w:rPr>
-                <w:spacing w:val="-2"/>
-                <w:sz w:val="18"/>
-              </w:rPr>
-              <w:t xml:space="preserve"> </w:t>
-            </w:r>
-            <w:r>
-              <w:rPr>
-                <w:sz w:val="18"/>
-              </w:rPr>
-              <w:t xml:space="preserve">value</w:t>
-            </w:r>
-            <w:r>
-              <w:rPr>
-                <w:spacing w:val="-2"/>
-                <w:sz w:val="18"/>
-              </w:rPr>
-              <w:t xml:space="preserve"> </w:t>
-            </w:r>
-            <w:r>
-              <w:rPr>
-                <w:sz w:val="18"/>
-              </w:rPr>
-              <w:t xml:space="preserve">shall</w:t>
-            </w:r>
-            <w:r>
-              <w:rPr>
-                <w:spacing w:val="-1"/>
-                <w:sz w:val="18"/>
-              </w:rPr>
-              <w:t xml:space="preserve"> </w:t>
-            </w:r>
-            <w:r>
-              <w:rPr>
-                <w:sz w:val="18"/>
-              </w:rPr>
-              <w:t xml:space="preserve">be</w:t>
-            </w:r>
-            <w:r>
-              <w:rPr>
-                <w:spacing w:val="-2"/>
-                <w:sz w:val="18"/>
-              </w:rPr>
-              <w:t xml:space="preserve"> </w:t>
-            </w:r>
-            <w:r>
-              <w:rPr>
-                <w:sz w:val="18"/>
-              </w:rPr>
-              <w:t xml:space="preserve">paid</w:t>
-            </w:r>
-            <w:r>
-              <w:rPr>
-                <w:spacing w:val="-1"/>
-                <w:sz w:val="18"/>
-              </w:rPr>
-              <w:t xml:space="preserve"> </w:t>
-            </w:r>
-            <w:r>
-              <w:rPr>
-                <w:sz w:val="18"/>
-              </w:rPr>
-              <w:t xml:space="preserve">via</w:t>
-            </w:r>
-            <w:r>
-              <w:rPr>
-                <w:spacing w:val="-2"/>
-                <w:sz w:val="18"/>
-              </w:rPr>
-              <w:t xml:space="preserve"> </w:t>
-            </w:r>
-            <w:r>
-              <w:rPr>
-                <w:sz w:val="18"/>
-              </w:rPr>
-              <w:t xml:space="preserve">Progressive</w:t>
-            </w:r>
-            <w:r>
-              <w:rPr>
-                <w:spacing w:val="-2"/>
-                <w:sz w:val="18"/>
-              </w:rPr>
-              <w:t xml:space="preserve"> </w:t>
-            </w:r>
-            <w:r>
-              <w:rPr>
-                <w:sz w:val="18"/>
-              </w:rPr>
-              <w:t xml:space="preserve">Billing</w:t>
-            </w:r>
-            <w:r>
-              <w:rPr>
-                <w:spacing w:val="-1"/>
-                <w:sz w:val="18"/>
-              </w:rPr>
-              <w:t xml:space="preserve"> </w:t>
-            </w:r>
-            <w:r>
-              <w:rPr>
-                <w:sz w:val="18"/>
-              </w:rPr>
-              <w:t xml:space="preserve">on</w:t>
-            </w:r>
-            <w:r>
-              <w:rPr>
-                <w:spacing w:val="-2"/>
-                <w:sz w:val="18"/>
-              </w:rPr>
-              <w:t xml:space="preserve"> </w:t>
-            </w:r>
-            <w:r>
-              <w:rPr>
-                <w:sz w:val="18"/>
-              </w:rPr>
-              <w:t xml:space="preserve">a</w:t>
-            </w:r>
-            <w:r>
-              <w:rPr>
-                <w:spacing w:val="-3"/>
-                <w:sz w:val="18"/>
-              </w:rPr>
-              <w:t xml:space="preserve"> </w:t>
-            </w:r>
-            <w:r>
-              <w:rPr>
-                <w:sz w:val="18"/>
-              </w:rPr>
-              <w:t xml:space="preserve">per</w:t>
-            </w:r>
-            <w:r>
-              <w:rPr>
-                <w:spacing w:val="-1"/>
-                <w:sz w:val="18"/>
-              </w:rPr>
-              <w:t xml:space="preserve"> </w:t>
-            </w:r>
-            <w:r>
-              <w:rPr>
-                <w:sz w:val="18"/>
-              </w:rPr>
-              <w:t xml:space="preserve">completed</w:t>
-            </w:r>
-            <w:r>
-              <w:rPr>
-                <w:spacing w:val="-2"/>
-                <w:sz w:val="18"/>
-              </w:rPr>
-              <w:t xml:space="preserve"> </w:t>
-            </w:r>
-            <w:r>
-              <w:rPr>
-                <w:sz w:val="18"/>
-              </w:rPr>
-              <w:t xml:space="preserve">Node</w:t>
-            </w:r>
-            <w:r>
-              <w:rPr>
-                <w:spacing w:val="-2"/>
-                <w:sz w:val="18"/>
-              </w:rPr>
-              <w:t xml:space="preserve"> </w:t>
-            </w:r>
-            <w:r>
-              <w:rPr>
-                <w:sz w:val="18"/>
-              </w:rPr>
-              <w:t xml:space="preserve">or</w:t>
-            </w:r>
-            <w:r>
-              <w:rPr>
-                <w:spacing w:val="-1"/>
-                <w:sz w:val="18"/>
-              </w:rPr>
-              <w:t xml:space="preserve"> </w:t>
-            </w:r>
-            <w:r>
-              <w:rPr>
-                <w:sz w:val="18"/>
-              </w:rPr>
-              <w:t xml:space="preserve">batch</w:t>
-            </w:r>
-            <w:r>
-              <w:rPr>
-                <w:spacing w:val="-2"/>
-                <w:sz w:val="18"/>
-              </w:rPr>
-              <w:t xml:space="preserve"> </w:t>
-            </w:r>
-            <w:r>
-              <w:rPr>
-                <w:sz w:val="18"/>
-              </w:rPr>
-              <w:t xml:space="preserve">of</w:t>
-            </w:r>
-            <w:r>
-              <w:rPr>
-                <w:spacing w:val="-3"/>
-                <w:sz w:val="18"/>
-              </w:rPr>
-              <w:t xml:space="preserve"> </w:t>
-            </w:r>
-            <w:r>
-              <w:rPr>
-                <w:sz w:val="18"/>
-              </w:rPr>
               <w:t xml:space="preserve">Nodes. Payment shall be made after the 30% Total DP is exhausted against completed works. Each Progressive Billing shall be paid by </w:t>
             </w:r>
             <w:r>
@@ -6911,6 +6908,40 @@
                 <w:sz w:val="18"/>
               </w:rPr>
               <w:t xml:space="preserve"> to the Vendor within thirty (30) calendar days from the date of receipt of a complete and correct invoice.</w:t>
+            </w:r>
+            <w:r>
+              <w:rPr>
+                <w:sz w:val="18"/>
+              </w:rPr>
+            </w:r>
+            <w:r>
+              <w:rPr>
+                <w:sz w:val="18"/>
+              </w:rPr>
+            </w:r>
+          </w:p>
+          <w:p>
+            <w:pPr>
+              <w:pStyle w:val="939"/>
+              <w:numPr>
+                <w:ilvl w:val="1"/>
+                <w:numId w:val="3"/>
+              </w:numPr>
+              <w:pBdr/>
+              <w:tabs>
+                <w:tab w:val="left" w:leader="none" w:pos="1188"/>
+              </w:tabs>
+              <w:spacing/>
+              <w:ind w:right="555"/>
+              <w:rPr>
+                <w:sz w:val="18"/>
+              </w:rPr>
+            </w:pPr>
+            <w:r>
+              <w:rPr>
+                <w:sz w:val="18"/>
+              </w:rPr>
+              <w:t xml:space="preserve">Final Billing shall be 10% of the PO value as retention fee. Payment shall be made within thirty (30) calendar days from the date of receipt of complete and correct invoice.</w:t>
             </w:r>
             <w:r>
               <w:rPr>
@@ -12364,19 +12395,19 @@
               <w:rPr>
                 <w:sz w:val="20"/>
               </w:rPr>
-              <w:t xml:space="preserve">{</w:t>
-            </w:r>
-            <w:r>
-              <w:rPr>
-                <w:sz w:val="20"/>
-              </w:rPr>
-              <w:t xml:space="preserve">payment_terms</w:t>
-            </w:r>
-            <w:r>
-              <w:rPr>
-                <w:sz w:val="20"/>
-              </w:rPr>
-              <w:t xml:space="preserve">}</w:t>
+              <w:t xml:space="preserve">Refer to the PO notes below.</w:t>
+            </w:r>
+            <w:r>
+              <w:rPr>
+                <w:sz w:val="20"/>
+              </w:rPr>
+              <w:t xml:space="preserve"/>
+            </w:r>
+            <w:r>
+              <w:rPr>
+                <w:sz w:val="20"/>
+              </w:rPr>
+              <w:t xml:space="preserve"/>
             </w:r>
             <w:r>
               <w:rPr>

</xml_diff>

<commit_message>
fix: remove 2-column section layout for site details table in PO template
</commit_message>
<xml_diff>
--- a/public/templates/PO_TEMPLATE_ORIGINAL.docx
+++ b/public/templates/PO_TEMPLATE_ORIGINAL.docx
@@ -4443,7 +4443,7 @@
           <w:type w:val="nextPage"/>
           <w:pgSz w:h="16838" w:orient="portrait" w:w="11906"/>
           <w:pgMar w:top="700" w:right="0" w:bottom="1200" w:left="720" w:header="0" w:footer="1012" w:gutter="0"/>
-          <w:cols w:num="2" w:sep="0" w:space="720" w:equalWidth="0">
+          <w:cols w:num="1" w:sep="0" w:space="720" w:equalWidth="0">
             <w:col w:w="4958" w:space="1987"/>
             <w:col w:w="4575" w:space="0"/>
           </w:cols>
@@ -11393,7 +11393,7 @@
           <w:type w:val="nextPage"/>
           <w:pgSz w:h="16838" w:orient="portrait" w:w="11906"/>
           <w:pgMar w:top="700" w:right="0" w:bottom="1200" w:left="720" w:header="0" w:footer="1012" w:gutter="0"/>
-          <w:cols w:num="2" w:sep="0" w:space="720" w:equalWidth="0">
+          <w:cols w:num="1" w:sep="0" w:space="720" w:equalWidth="0">
             <w:col w:w="4958" w:space="1987"/>
             <w:col w:w="4575" w:space="0"/>
           </w:cols>

</xml_diff>

<commit_message>
fix(docx): unwrap site details table from run so the editor renders it
</commit_message>
<xml_diff>
--- a/public/templates/PO_TEMPLATE_ORIGINAL.docx
+++ b/public/templates/PO_TEMPLATE_ORIGINAL.docx
@@ -11433,702 +11433,704 @@
           <w:b/>
           <w:sz w:val="20"/>
         </w:rPr>
-        <w:tbl>
-          <w:tblPr>
-            <w:tblInd w:w="65" w:type="dxa"/>
-            <w:tblW w:w="0" w:type="auto"/>
-            <w:tblCellMar>
-              <w:left w:w="0" w:type="dxa"/>
-              <w:right w:w="0" w:type="dxa"/>
-            </w:tblCellMar>
-            <w:tblBorders>
-              <w:top w:val="single" w:color="000000" w:sz="4" w:space="0"/>
-              <w:left w:val="single" w:color="000000" w:sz="4" w:space="0"/>
-              <w:bottom w:val="single" w:color="000000" w:sz="4" w:space="0"/>
-              <w:right w:val="single" w:color="000000" w:sz="4" w:space="0"/>
-              <w:insideH w:val="single" w:color="000000" w:sz="4" w:space="0"/>
-              <w:insideV w:val="single" w:color="000000" w:sz="4" w:space="0"/>
-            </w:tblBorders>
-            <w:tblLayout w:type="fixed"/>
-            <w:tblLook w:val="01E0" w:firstRow="1" w:lastRow="1" w:firstColumn="1" w:lastColumn="1" w:noHBand="0" w:noVBand="0"/>
-          </w:tblPr>
-          <w:tblGrid>
-            <w:gridCol w:w="701"/>
-            <w:gridCol w:w="1980"/>
-            <w:gridCol w:w="1220"/>
-            <w:gridCol w:w="1469"/>
-            <w:gridCol w:w="1841"/>
-          </w:tblGrid>
-          <w:tr>
-            <w:trPr>
-              <w:trHeight w:val="438"/>
-            </w:trPr>
-            <w:tc>
-              <w:tcPr>
-                <w:tcBorders/>
-                <w:tcW w:w="701" w:type="dxa"/>
-              </w:tcPr>
-              <w:p>
-                <w:pPr>
-                  <w:pStyle w:val="939"/>
-                  <w:pBdr/>
-                  <w:spacing w:line="219" w:lineRule="exact"/>
-                  <w:ind w:left="49"/>
-                  <w:jc w:val="center"/>
-                  <w:rPr>
-                    <w:rFonts w:ascii="Calibri"/>
-                    <w:b/>
-                    <w:sz w:val="18"/>
-                  </w:rPr>
-                </w:pPr>
-                <w:r>
-                  <w:rPr>
-                    <w:rFonts w:ascii="Calibri"/>
-                    <w:b/>
-                    <w:spacing w:val="-5"/>
-                    <w:sz w:val="18"/>
-                  </w:rPr>
-                  <w:t xml:space="preserve">S/N</w:t>
-                </w:r>
-                <w:r>
-                  <w:rPr>
-                    <w:rFonts w:ascii="Calibri"/>
-                    <w:b/>
-                    <w:sz w:val="18"/>
-                  </w:rPr>
-                </w:r>
-                <w:r>
-                  <w:rPr>
-                    <w:rFonts w:ascii="Calibri"/>
-                    <w:b/>
-                    <w:sz w:val="18"/>
-                  </w:rPr>
-                </w:r>
-              </w:p>
-            </w:tc>
-            <w:tc>
-              <w:tcPr>
-                <w:tcBorders/>
-                <w:tcW w:w="1980" w:type="dxa"/>
-              </w:tcPr>
-              <w:p>
-                <w:pPr>
-                  <w:pStyle w:val="939"/>
-                  <w:pBdr/>
-                  <w:spacing w:line="219" w:lineRule="exact"/>
-                  <w:ind w:left="10"/>
-                  <w:jc w:val="center"/>
-                  <w:rPr>
-                    <w:rFonts w:ascii="Calibri"/>
-                    <w:b/>
-                    <w:sz w:val="18"/>
-                  </w:rPr>
-                </w:pPr>
-                <w:r>
-                  <w:rPr>
-                    <w:rFonts w:ascii="Calibri"/>
-                    <w:b/>
-                    <w:spacing w:val="-2"/>
-                    <w:sz w:val="18"/>
-                  </w:rPr>
-                  <w:t xml:space="preserve">REGION</w:t>
-                </w:r>
-                <w:r>
-                  <w:rPr>
-                    <w:rFonts w:ascii="Calibri"/>
-                    <w:b/>
-                    <w:sz w:val="18"/>
-                  </w:rPr>
-                </w:r>
-                <w:r>
-                  <w:rPr>
-                    <w:rFonts w:ascii="Calibri"/>
-                    <w:b/>
-                    <w:sz w:val="18"/>
-                  </w:rPr>
-                </w:r>
-              </w:p>
-            </w:tc>
-            <w:tc>
-              <w:tcPr>
-                <w:tcBorders/>
-                <w:tcW w:w="1220" w:type="dxa"/>
-              </w:tcPr>
-              <w:p>
-                <w:pPr>
-                  <w:pStyle w:val="939"/>
-                  <w:pBdr/>
-                  <w:spacing w:line="219" w:lineRule="exact"/>
-                  <w:ind w:left="204"/>
-                  <w:rPr>
-                    <w:rFonts w:ascii="Calibri"/>
-                    <w:b/>
-                    <w:sz w:val="18"/>
-                  </w:rPr>
-                </w:pPr>
-                <w:r>
-                  <w:rPr>
-                    <w:rFonts w:ascii="Calibri"/>
-                    <w:b/>
-                    <w:spacing w:val="-2"/>
-                    <w:sz w:val="18"/>
-                  </w:rPr>
-                  <w:t xml:space="preserve">AREA/CITY</w:t>
-                </w:r>
-                <w:r>
-                  <w:rPr>
-                    <w:rFonts w:ascii="Calibri"/>
-                    <w:b/>
-                    <w:sz w:val="18"/>
-                  </w:rPr>
-                </w:r>
-                <w:r>
-                  <w:rPr>
-                    <w:rFonts w:ascii="Calibri"/>
-                    <w:b/>
-                    <w:sz w:val="18"/>
-                  </w:rPr>
-                </w:r>
-              </w:p>
-            </w:tc>
-            <w:tc>
-              <w:tcPr>
-                <w:tcBorders/>
-                <w:tcW w:w="1469" w:type="dxa"/>
-              </w:tcPr>
-              <w:p>
-                <w:pPr>
-                  <w:pStyle w:val="939"/>
-                  <w:pBdr/>
-                  <w:spacing w:line="219" w:lineRule="exact"/>
-                  <w:ind w:left="206"/>
-                  <w:rPr>
-                    <w:rFonts w:ascii="Calibri"/>
-                    <w:b/>
-                    <w:sz w:val="18"/>
-                  </w:rPr>
-                </w:pPr>
-                <w:r>
-                  <w:rPr>
-                    <w:rFonts w:ascii="Calibri"/>
-                    <w:b/>
-                    <w:sz w:val="18"/>
-                  </w:rPr>
-                  <w:t xml:space="preserve">NO</w:t>
-                </w:r>
-                <w:r>
-                  <w:rPr>
-                    <w:rFonts w:ascii="Calibri"/>
-                    <w:b/>
-                    <w:spacing w:val="-2"/>
-                    <w:sz w:val="18"/>
-                  </w:rPr>
-                  <w:t xml:space="preserve"> </w:t>
-                </w:r>
-                <w:r>
-                  <w:rPr>
-                    <w:rFonts w:ascii="Calibri"/>
-                    <w:b/>
-                    <w:sz w:val="18"/>
-                  </w:rPr>
-                  <w:t xml:space="preserve">OF</w:t>
-                </w:r>
-                <w:r>
-                  <w:rPr>
-                    <w:rFonts w:ascii="Calibri"/>
-                    <w:b/>
-                    <w:spacing w:val="-2"/>
-                    <w:sz w:val="18"/>
-                  </w:rPr>
-                  <w:t xml:space="preserve"> NODES</w:t>
-                </w:r>
-                <w:r>
-                  <w:rPr>
-                    <w:rFonts w:ascii="Calibri"/>
-                    <w:b/>
-                    <w:sz w:val="18"/>
-                  </w:rPr>
-                </w:r>
-                <w:r>
-                  <w:rPr>
-                    <w:rFonts w:ascii="Calibri"/>
-                    <w:b/>
-                    <w:sz w:val="18"/>
-                  </w:rPr>
-                </w:r>
-              </w:p>
-            </w:tc>
-            <w:tc>
-              <w:tcPr>
-                <w:tcBorders/>
-                <w:tcW w:w="1841" w:type="dxa"/>
-              </w:tcPr>
-              <w:p>
-                <w:pPr>
-                  <w:pStyle w:val="939"/>
-                  <w:pBdr/>
-                  <w:spacing w:line="219" w:lineRule="exact"/>
-                  <w:ind w:left="158"/>
-                  <w:rPr>
-                    <w:rFonts w:ascii="Calibri"/>
-                    <w:b/>
-                    <w:sz w:val="18"/>
-                  </w:rPr>
-                </w:pPr>
-                <w:r>
-                  <w:rPr>
-                    <w:rFonts w:ascii="Calibri"/>
-                    <w:b/>
-                    <w:sz w:val="18"/>
-                  </w:rPr>
-                  <w:t xml:space="preserve">ESTIMATED</w:t>
-                </w:r>
-                <w:r>
-                  <w:rPr>
-                    <w:rFonts w:ascii="Calibri"/>
-                    <w:b/>
-                    <w:spacing w:val="-4"/>
-                    <w:sz w:val="18"/>
-                  </w:rPr>
-                  <w:t xml:space="preserve"> </w:t>
-                </w:r>
-                <w:r>
-                  <w:rPr>
-                    <w:rFonts w:ascii="Calibri"/>
-                    <w:b/>
-                    <w:spacing w:val="-2"/>
-                    <w:sz w:val="18"/>
-                  </w:rPr>
-                  <w:t xml:space="preserve">STRAND</w:t>
-                </w:r>
-                <w:r>
-                  <w:rPr>
-                    <w:rFonts w:ascii="Calibri"/>
-                    <w:b/>
-                    <w:sz w:val="18"/>
-                  </w:rPr>
-                </w:r>
-                <w:r>
-                  <w:rPr>
-                    <w:rFonts w:ascii="Calibri"/>
-                    <w:b/>
-                    <w:sz w:val="18"/>
-                  </w:rPr>
-                </w:r>
-              </w:p>
-              <w:p>
-                <w:pPr>
-                  <w:pStyle w:val="939"/>
-                  <w:pBdr/>
-                  <w:spacing w:before="1" w:line="199" w:lineRule="exact"/>
-                  <w:ind w:left="160"/>
-                  <w:rPr>
-                    <w:rFonts w:ascii="Calibri"/>
-                    <w:b/>
-                    <w:sz w:val="18"/>
-                  </w:rPr>
-                </w:pPr>
-                <w:r>
-                  <w:rPr>
-                    <w:rFonts w:ascii="Calibri"/>
-                    <w:b/>
-                    <w:sz w:val="18"/>
-                  </w:rPr>
-                  <w:t xml:space="preserve">CABLE</w:t>
-                </w:r>
-                <w:r>
-                  <w:rPr>
-                    <w:rFonts w:ascii="Calibri"/>
-                    <w:b/>
-                    <w:spacing w:val="-1"/>
-                    <w:sz w:val="18"/>
-                  </w:rPr>
-                  <w:t xml:space="preserve"> </w:t>
-                </w:r>
-                <w:r>
-                  <w:rPr>
-                    <w:rFonts w:ascii="Calibri"/>
-                    <w:b/>
-                    <w:sz w:val="18"/>
-                  </w:rPr>
-                  <w:t xml:space="preserve">LENGTH</w:t>
-                </w:r>
-                <w:r>
-                  <w:rPr>
-                    <w:rFonts w:ascii="Calibri"/>
-                    <w:b/>
-                    <w:spacing w:val="-2"/>
-                    <w:sz w:val="18"/>
-                  </w:rPr>
-                  <w:t xml:space="preserve"> </w:t>
-                </w:r>
-                <w:r>
-                  <w:rPr>
-                    <w:rFonts w:ascii="Calibri"/>
-                    <w:b/>
-                    <w:spacing w:val="-4"/>
-                    <w:sz w:val="18"/>
-                  </w:rPr>
-                  <w:t xml:space="preserve">(KM)</w:t>
-                </w:r>
-                <w:r>
-                  <w:rPr>
-                    <w:rFonts w:ascii="Calibri"/>
-                    <w:b/>
-                    <w:sz w:val="18"/>
-                  </w:rPr>
-                </w:r>
-                <w:r>
-                  <w:rPr>
-                    <w:rFonts w:ascii="Calibri"/>
-                    <w:b/>
-                    <w:sz w:val="18"/>
-                  </w:rPr>
-                </w:r>
-              </w:p>
-            </w:tc>
-          </w:tr>
-          <w:tr>
-            <w:trPr>
-              <w:trHeight w:val="285"/>
-            </w:trPr>
-            <w:tc>
-              <w:tcPr>
-                <w:tcBorders/>
-                <w:tcW w:w="701" w:type="dxa"/>
-              </w:tcPr>
-              <w:p>
-                <w:pPr>
-                  <w:pStyle w:val="939"/>
-                  <w:pBdr/>
-                  <w:spacing w:before="1"/>
-                  <w:ind w:right="39" w:left="49"/>
-                  <w:jc w:val="center"/>
-                  <w:rPr>
-                    <w:rFonts w:ascii="Calibri"/>
-                    <w:sz w:val="18"/>
-                  </w:rPr>
-                </w:pPr>
-                <w:r>
-                  <w:rPr>
-                    <w:rFonts w:ascii="Calibri"/>
-                    <w:sz w:val="18"/>
-                  </w:rPr>
-                </w:r>
-                <w:r>
-                  <w:rPr>
-                    <w:rFonts w:ascii="Calibri"/>
-                    <w:sz w:val="18"/>
-                  </w:rPr>
-                  <w:t xml:space="preserve">{#site_details}{sn}</w:t>
-                </w:r>
-                <w:r>
-                  <w:rPr>
-                    <w:rFonts w:ascii="Calibri"/>
-                    <w:sz w:val="18"/>
-                  </w:rPr>
-                </w:r>
-                <w:r>
-                  <w:rPr>
-                    <w:rFonts w:ascii="Calibri"/>
-                    <w:sz w:val="18"/>
-                  </w:rPr>
-                </w:r>
-              </w:p>
-            </w:tc>
-            <w:tc>
-              <w:tcPr>
-                <w:tcBorders/>
-                <w:tcW w:w="1980" w:type="dxa"/>
-              </w:tcPr>
-              <w:p>
-                <w:pPr>
-                  <w:pStyle w:val="939"/>
-                  <w:pBdr/>
-                  <w:spacing w:before="1"/>
-                  <w:ind w:left="108"/>
-                  <w:rPr>
-                    <w:rFonts w:ascii="Calibri"/>
-                    <w:sz w:val="18"/>
-                  </w:rPr>
-                </w:pPr>
-                <w:r>
-                  <w:rPr>
-                    <w:rFonts w:ascii="Calibri"/>
-                    <w:sz w:val="18"/>
-                  </w:rPr>
-                  <w:t xml:space="preserve">{region}</w:t>
-                </w:r>
-                <w:r>
-                  <w:rPr>
-                    <w:rFonts w:ascii="Calibri"/>
-                    <w:sz w:val="18"/>
-                  </w:rPr>
-                </w:r>
-                <w:r>
-                  <w:rPr>
-                    <w:rFonts w:ascii="Calibri"/>
-                    <w:sz w:val="18"/>
-                  </w:rPr>
-                </w:r>
-              </w:p>
-            </w:tc>
-            <w:tc>
-              <w:tcPr>
-                <w:tcBorders/>
-                <w:tcW w:w="1220" w:type="dxa"/>
-              </w:tcPr>
-              <w:p>
-                <w:pPr>
-                  <w:pStyle w:val="939"/>
-                  <w:pBdr/>
-                  <w:spacing w:before="1"/>
-                  <w:ind w:left="108"/>
-                  <w:rPr>
-                    <w:rFonts w:ascii="Calibri"/>
-                    <w:sz w:val="18"/>
-                  </w:rPr>
-                </w:pPr>
-                <w:r>
-                  <w:rPr>
-                    <w:rFonts w:ascii="Calibri"/>
-                    <w:sz w:val="18"/>
-                  </w:rPr>
-                  <w:t xml:space="preserve">{area}</w:t>
-                </w:r>
-                <w:r>
-                  <w:rPr>
-                    <w:rFonts w:ascii="Calibri"/>
-                    <w:sz w:val="18"/>
-                  </w:rPr>
-                </w:r>
-                <w:r>
-                  <w:rPr>
-                    <w:rFonts w:ascii="Calibri"/>
-                    <w:sz w:val="18"/>
-                  </w:rPr>
-                </w:r>
-              </w:p>
-            </w:tc>
-            <w:tc>
-              <w:tcPr>
-                <w:tcBorders/>
-                <w:tcW w:w="1469" w:type="dxa"/>
-              </w:tcPr>
-              <w:p>
-                <w:pPr>
-                  <w:pStyle w:val="939"/>
-                  <w:pBdr/>
-                  <w:spacing w:before="66" w:line="199" w:lineRule="exact"/>
-                  <w:ind w:right="96" w:left="0"/>
-                  <w:jc w:val="right"/>
-                  <w:rPr>
-                    <w:rFonts w:ascii="Calibri"/>
-                    <w:sz w:val="18"/>
-                  </w:rPr>
-                </w:pPr>
-                <w:r>
-                  <w:rPr>
-                    <w:rFonts w:ascii="Calibri"/>
-                    <w:sz w:val="18"/>
-                  </w:rPr>
-                  <w:t xml:space="preserve">{nodes}</w:t>
-                </w:r>
-                <w:r>
-                  <w:rPr>
-                    <w:rFonts w:ascii="Calibri"/>
-                    <w:sz w:val="18"/>
-                  </w:rPr>
-                </w:r>
-                <w:r>
-                  <w:rPr>
-                    <w:rFonts w:ascii="Calibri"/>
-                    <w:sz w:val="18"/>
-                  </w:rPr>
-                </w:r>
-              </w:p>
-            </w:tc>
-            <w:tc>
-              <w:tcPr>
-                <w:tcBorders/>
-                <w:tcW w:w="1841" w:type="dxa"/>
-              </w:tcPr>
-              <w:p>
-                <w:pPr>
-                  <w:pStyle w:val="939"/>
-                  <w:pBdr/>
-                  <w:spacing w:before="1"/>
-                  <w:ind w:right="96" w:left="0"/>
-                  <w:jc w:val="right"/>
-                  <w:rPr>
-                    <w:rFonts w:ascii="Calibri"/>
-                    <w:sz w:val="18"/>
-                  </w:rPr>
-                </w:pPr>
-                <w:r>
-                  <w:rPr>
-                    <w:rFonts w:ascii="Calibri"/>
-                    <w:sz w:val="18"/>
-                  </w:rPr>
-                  <w:t xml:space="preserve">{est_km}</w:t>
-                </w:r>
-                <w:r>
-                  <w:rPr>
-                    <w:rFonts w:ascii="Calibri"/>
-                    <w:sz w:val="18"/>
-                  </w:rPr>
-                  <w:t xml:space="preserve">{/site_details}</w:t>
-                </w:r>
-                <w:r>
-                  <w:rPr>
-                    <w:rFonts w:ascii="Calibri"/>
-                    <w:sz w:val="18"/>
-                  </w:rPr>
-                </w:r>
-                <w:r>
-                  <w:rPr>
-                    <w:rFonts w:ascii="Calibri"/>
-                    <w:sz w:val="18"/>
-                  </w:rPr>
-                </w:r>
-              </w:p>
-            </w:tc>
-          </w:tr>
-          <w:tr>
-            <w:trPr>
-              <w:trHeight w:val="218"/>
-            </w:trPr>
-            <w:tc>
-              <w:tcPr>
-                <w:gridSpan w:val="3"/>
-                <w:tcBorders/>
-                <w:tcW w:w="3901" w:type="dxa"/>
-              </w:tcPr>
-              <w:p>
-                <w:pPr>
-                  <w:pStyle w:val="939"/>
-                  <w:pBdr/>
-                  <w:spacing w:line="198" w:lineRule="exact"/>
-                  <w:ind w:left="6"/>
-                  <w:jc w:val="center"/>
-                  <w:rPr>
-                    <w:rFonts w:ascii="Calibri"/>
-                    <w:b/>
-                    <w:sz w:val="18"/>
-                  </w:rPr>
-                </w:pPr>
-                <w:r>
-                  <w:rPr>
-                    <w:rFonts w:ascii="Calibri"/>
-                    <w:b/>
-                    <w:spacing w:val="-2"/>
-                    <w:sz w:val="18"/>
-                  </w:rPr>
-                  <w:t xml:space="preserve">TOTAL</w:t>
-                </w:r>
-                <w:r>
-                  <w:rPr>
-                    <w:rFonts w:ascii="Calibri"/>
-                    <w:b/>
-                    <w:sz w:val="18"/>
-                  </w:rPr>
-                </w:r>
-                <w:r>
-                  <w:rPr>
-                    <w:rFonts w:ascii="Calibri"/>
-                    <w:b/>
-                    <w:sz w:val="18"/>
-                  </w:rPr>
-                </w:r>
-              </w:p>
-            </w:tc>
-            <w:tc>
-              <w:tcPr>
-                <w:tcBorders/>
-                <w:tcW w:w="1469" w:type="dxa"/>
-              </w:tcPr>
-              <w:p>
-                <w:pPr>
-                  <w:pStyle w:val="939"/>
-                  <w:pBdr/>
-                  <w:spacing w:line="198" w:lineRule="exact"/>
-                  <w:ind w:right="96" w:left="0"/>
-                  <w:jc w:val="right"/>
-                  <w:rPr>
-                    <w:rFonts w:ascii="Calibri"/>
-                    <w:b/>
-                    <w:sz w:val="18"/>
-                  </w:rPr>
-                </w:pPr>
-                <w:r>
-                  <w:rPr>
-                    <w:rFonts w:ascii="Calibri"/>
-                    <w:b/>
-                    <w:sz w:val="18"/>
-                  </w:rPr>
-                  <w:t xml:space="preserve">{total_nodes}</w:t>
-                </w:r>
-                <w:r>
-                  <w:rPr>
-                    <w:rFonts w:ascii="Calibri"/>
-                    <w:b/>
-                    <w:sz w:val="18"/>
-                  </w:rPr>
-                </w:r>
-                <w:r>
-                  <w:rPr>
-                    <w:rFonts w:ascii="Calibri"/>
-                    <w:b/>
-                    <w:sz w:val="18"/>
-                  </w:rPr>
-                </w:r>
-              </w:p>
-            </w:tc>
-            <w:tc>
-              <w:tcPr>
-                <w:tcBorders/>
-                <w:tcW w:w="1841" w:type="dxa"/>
-              </w:tcPr>
-              <w:p>
-                <w:pPr>
-                  <w:pStyle w:val="939"/>
-                  <w:pBdr/>
-                  <w:spacing w:line="198" w:lineRule="exact"/>
-                  <w:ind w:right="96" w:left="0"/>
-                  <w:jc w:val="right"/>
-                  <w:rPr>
-                    <w:rFonts w:ascii="Calibri"/>
-                    <w:b/>
-                    <w:sz w:val="18"/>
-                  </w:rPr>
-                </w:pPr>
-                <w:r>
-                  <w:rPr>
-                    <w:rFonts w:ascii="Calibri"/>
-                    <w:b/>
-                    <w:sz w:val="18"/>
-                  </w:rPr>
-                  <w:t xml:space="preserve">{total_cable}</w:t>
-                </w:r>
-                <w:r>
-                  <w:rPr>
-                    <w:rFonts w:ascii="Calibri"/>
-                    <w:b/>
-                    <w:sz w:val="18"/>
-                  </w:rPr>
-                </w:r>
-                <w:r>
-                  <w:rPr>
-                    <w:rFonts w:ascii="Calibri"/>
-                    <w:b/>
-                    <w:sz w:val="18"/>
-                  </w:rPr>
-                </w:r>
-              </w:p>
-            </w:tc>
-          </w:tr>
-        </w:tbl>
       </w:r>
+    </w:p>
+    <w:tbl>
+      <w:tblPr>
+        <w:tblInd w:w="65" w:type="dxa"/>
+        <w:tblW w:w="0" w:type="auto"/>
+        <w:tblCellMar>
+          <w:left w:w="0" w:type="dxa"/>
+          <w:right w:w="0" w:type="dxa"/>
+        </w:tblCellMar>
+        <w:tblBorders>
+          <w:top w:val="single" w:color="000000" w:sz="4" w:space="0"/>
+          <w:left w:val="single" w:color="000000" w:sz="4" w:space="0"/>
+          <w:bottom w:val="single" w:color="000000" w:sz="4" w:space="0"/>
+          <w:right w:val="single" w:color="000000" w:sz="4" w:space="0"/>
+          <w:insideH w:val="single" w:color="000000" w:sz="4" w:space="0"/>
+          <w:insideV w:val="single" w:color="000000" w:sz="4" w:space="0"/>
+        </w:tblBorders>
+        <w:tblLayout w:type="fixed"/>
+        <w:tblLook w:val="01E0" w:firstRow="1" w:lastRow="1" w:firstColumn="1" w:lastColumn="1" w:noHBand="0" w:noVBand="0"/>
+      </w:tblPr>
+      <w:tblGrid>
+        <w:gridCol w:w="701"/>
+        <w:gridCol w:w="1980"/>
+        <w:gridCol w:w="1220"/>
+        <w:gridCol w:w="1469"/>
+        <w:gridCol w:w="1841"/>
+      </w:tblGrid>
+      <w:tr>
+        <w:trPr>
+          <w:trHeight w:val="438"/>
+        </w:trPr>
+        <w:tc>
+          <w:tcPr>
+            <w:tcBorders/>
+            <w:tcW w:w="701" w:type="dxa"/>
+          </w:tcPr>
+          <w:p>
+            <w:pPr>
+              <w:pStyle w:val="939"/>
+              <w:pBdr/>
+              <w:spacing w:line="219" w:lineRule="exact"/>
+              <w:ind w:left="49"/>
+              <w:jc w:val="center"/>
+              <w:rPr>
+                <w:rFonts w:ascii="Calibri"/>
+                <w:b/>
+                <w:sz w:val="18"/>
+              </w:rPr>
+            </w:pPr>
+            <w:r>
+              <w:rPr>
+                <w:rFonts w:ascii="Calibri"/>
+                <w:b/>
+                <w:spacing w:val="-5"/>
+                <w:sz w:val="18"/>
+              </w:rPr>
+              <w:t xml:space="preserve">S/N</w:t>
+            </w:r>
+            <w:r>
+              <w:rPr>
+                <w:rFonts w:ascii="Calibri"/>
+                <w:b/>
+                <w:sz w:val="18"/>
+              </w:rPr>
+            </w:r>
+            <w:r>
+              <w:rPr>
+                <w:rFonts w:ascii="Calibri"/>
+                <w:b/>
+                <w:sz w:val="18"/>
+              </w:rPr>
+            </w:r>
+          </w:p>
+        </w:tc>
+        <w:tc>
+          <w:tcPr>
+            <w:tcBorders/>
+            <w:tcW w:w="1980" w:type="dxa"/>
+          </w:tcPr>
+          <w:p>
+            <w:pPr>
+              <w:pStyle w:val="939"/>
+              <w:pBdr/>
+              <w:spacing w:line="219" w:lineRule="exact"/>
+              <w:ind w:left="10"/>
+              <w:jc w:val="center"/>
+              <w:rPr>
+                <w:rFonts w:ascii="Calibri"/>
+                <w:b/>
+                <w:sz w:val="18"/>
+              </w:rPr>
+            </w:pPr>
+            <w:r>
+              <w:rPr>
+                <w:rFonts w:ascii="Calibri"/>
+                <w:b/>
+                <w:spacing w:val="-2"/>
+                <w:sz w:val="18"/>
+              </w:rPr>
+              <w:t xml:space="preserve">REGION</w:t>
+            </w:r>
+            <w:r>
+              <w:rPr>
+                <w:rFonts w:ascii="Calibri"/>
+                <w:b/>
+                <w:sz w:val="18"/>
+              </w:rPr>
+            </w:r>
+            <w:r>
+              <w:rPr>
+                <w:rFonts w:ascii="Calibri"/>
+                <w:b/>
+                <w:sz w:val="18"/>
+              </w:rPr>
+            </w:r>
+          </w:p>
+        </w:tc>
+        <w:tc>
+          <w:tcPr>
+            <w:tcBorders/>
+            <w:tcW w:w="1220" w:type="dxa"/>
+          </w:tcPr>
+          <w:p>
+            <w:pPr>
+              <w:pStyle w:val="939"/>
+              <w:pBdr/>
+              <w:spacing w:line="219" w:lineRule="exact"/>
+              <w:ind w:left="204"/>
+              <w:rPr>
+                <w:rFonts w:ascii="Calibri"/>
+                <w:b/>
+                <w:sz w:val="18"/>
+              </w:rPr>
+            </w:pPr>
+            <w:r>
+              <w:rPr>
+                <w:rFonts w:ascii="Calibri"/>
+                <w:b/>
+                <w:spacing w:val="-2"/>
+                <w:sz w:val="18"/>
+              </w:rPr>
+              <w:t xml:space="preserve">AREA/CITY</w:t>
+            </w:r>
+            <w:r>
+              <w:rPr>
+                <w:rFonts w:ascii="Calibri"/>
+                <w:b/>
+                <w:sz w:val="18"/>
+              </w:rPr>
+            </w:r>
+            <w:r>
+              <w:rPr>
+                <w:rFonts w:ascii="Calibri"/>
+                <w:b/>
+                <w:sz w:val="18"/>
+              </w:rPr>
+            </w:r>
+          </w:p>
+        </w:tc>
+        <w:tc>
+          <w:tcPr>
+            <w:tcBorders/>
+            <w:tcW w:w="1469" w:type="dxa"/>
+          </w:tcPr>
+          <w:p>
+            <w:pPr>
+              <w:pStyle w:val="939"/>
+              <w:pBdr/>
+              <w:spacing w:line="219" w:lineRule="exact"/>
+              <w:ind w:left="206"/>
+              <w:rPr>
+                <w:rFonts w:ascii="Calibri"/>
+                <w:b/>
+                <w:sz w:val="18"/>
+              </w:rPr>
+            </w:pPr>
+            <w:r>
+              <w:rPr>
+                <w:rFonts w:ascii="Calibri"/>
+                <w:b/>
+                <w:sz w:val="18"/>
+              </w:rPr>
+              <w:t xml:space="preserve">NO</w:t>
+            </w:r>
+            <w:r>
+              <w:rPr>
+                <w:rFonts w:ascii="Calibri"/>
+                <w:b/>
+                <w:spacing w:val="-2"/>
+                <w:sz w:val="18"/>
+              </w:rPr>
+              <w:t xml:space="preserve"> </w:t>
+            </w:r>
+            <w:r>
+              <w:rPr>
+                <w:rFonts w:ascii="Calibri"/>
+                <w:b/>
+                <w:sz w:val="18"/>
+              </w:rPr>
+              <w:t xml:space="preserve">OF</w:t>
+            </w:r>
+            <w:r>
+              <w:rPr>
+                <w:rFonts w:ascii="Calibri"/>
+                <w:b/>
+                <w:spacing w:val="-2"/>
+                <w:sz w:val="18"/>
+              </w:rPr>
+              <w:t xml:space="preserve"> NODES</w:t>
+            </w:r>
+            <w:r>
+              <w:rPr>
+                <w:rFonts w:ascii="Calibri"/>
+                <w:b/>
+                <w:sz w:val="18"/>
+              </w:rPr>
+            </w:r>
+            <w:r>
+              <w:rPr>
+                <w:rFonts w:ascii="Calibri"/>
+                <w:b/>
+                <w:sz w:val="18"/>
+              </w:rPr>
+            </w:r>
+          </w:p>
+        </w:tc>
+        <w:tc>
+          <w:tcPr>
+            <w:tcBorders/>
+            <w:tcW w:w="1841" w:type="dxa"/>
+          </w:tcPr>
+          <w:p>
+            <w:pPr>
+              <w:pStyle w:val="939"/>
+              <w:pBdr/>
+              <w:spacing w:line="219" w:lineRule="exact"/>
+              <w:ind w:left="158"/>
+              <w:rPr>
+                <w:rFonts w:ascii="Calibri"/>
+                <w:b/>
+                <w:sz w:val="18"/>
+              </w:rPr>
+            </w:pPr>
+            <w:r>
+              <w:rPr>
+                <w:rFonts w:ascii="Calibri"/>
+                <w:b/>
+                <w:sz w:val="18"/>
+              </w:rPr>
+              <w:t xml:space="preserve">ESTIMATED</w:t>
+            </w:r>
+            <w:r>
+              <w:rPr>
+                <w:rFonts w:ascii="Calibri"/>
+                <w:b/>
+                <w:spacing w:val="-4"/>
+                <w:sz w:val="18"/>
+              </w:rPr>
+              <w:t xml:space="preserve"> </w:t>
+            </w:r>
+            <w:r>
+              <w:rPr>
+                <w:rFonts w:ascii="Calibri"/>
+                <w:b/>
+                <w:spacing w:val="-2"/>
+                <w:sz w:val="18"/>
+              </w:rPr>
+              <w:t xml:space="preserve">STRAND</w:t>
+            </w:r>
+            <w:r>
+              <w:rPr>
+                <w:rFonts w:ascii="Calibri"/>
+                <w:b/>
+                <w:sz w:val="18"/>
+              </w:rPr>
+            </w:r>
+            <w:r>
+              <w:rPr>
+                <w:rFonts w:ascii="Calibri"/>
+                <w:b/>
+                <w:sz w:val="18"/>
+              </w:rPr>
+            </w:r>
+          </w:p>
+          <w:p>
+            <w:pPr>
+              <w:pStyle w:val="939"/>
+              <w:pBdr/>
+              <w:spacing w:before="1" w:line="199" w:lineRule="exact"/>
+              <w:ind w:left="160"/>
+              <w:rPr>
+                <w:rFonts w:ascii="Calibri"/>
+                <w:b/>
+                <w:sz w:val="18"/>
+              </w:rPr>
+            </w:pPr>
+            <w:r>
+              <w:rPr>
+                <w:rFonts w:ascii="Calibri"/>
+                <w:b/>
+                <w:sz w:val="18"/>
+              </w:rPr>
+              <w:t xml:space="preserve">CABLE</w:t>
+            </w:r>
+            <w:r>
+              <w:rPr>
+                <w:rFonts w:ascii="Calibri"/>
+                <w:b/>
+                <w:spacing w:val="-1"/>
+                <w:sz w:val="18"/>
+              </w:rPr>
+              <w:t xml:space="preserve"> </w:t>
+            </w:r>
+            <w:r>
+              <w:rPr>
+                <w:rFonts w:ascii="Calibri"/>
+                <w:b/>
+                <w:sz w:val="18"/>
+              </w:rPr>
+              <w:t xml:space="preserve">LENGTH</w:t>
+            </w:r>
+            <w:r>
+              <w:rPr>
+                <w:rFonts w:ascii="Calibri"/>
+                <w:b/>
+                <w:spacing w:val="-2"/>
+                <w:sz w:val="18"/>
+              </w:rPr>
+              <w:t xml:space="preserve"> </w:t>
+            </w:r>
+            <w:r>
+              <w:rPr>
+                <w:rFonts w:ascii="Calibri"/>
+                <w:b/>
+                <w:spacing w:val="-4"/>
+                <w:sz w:val="18"/>
+              </w:rPr>
+              <w:t xml:space="preserve">(KM)</w:t>
+            </w:r>
+            <w:r>
+              <w:rPr>
+                <w:rFonts w:ascii="Calibri"/>
+                <w:b/>
+                <w:sz w:val="18"/>
+              </w:rPr>
+            </w:r>
+            <w:r>
+              <w:rPr>
+                <w:rFonts w:ascii="Calibri"/>
+                <w:b/>
+                <w:sz w:val="18"/>
+              </w:rPr>
+            </w:r>
+          </w:p>
+        </w:tc>
+      </w:tr>
+      <w:tr>
+        <w:trPr>
+          <w:trHeight w:val="285"/>
+        </w:trPr>
+        <w:tc>
+          <w:tcPr>
+            <w:tcBorders/>
+            <w:tcW w:w="701" w:type="dxa"/>
+          </w:tcPr>
+          <w:p>
+            <w:pPr>
+              <w:pStyle w:val="939"/>
+              <w:pBdr/>
+              <w:spacing w:before="1"/>
+              <w:ind w:right="39" w:left="49"/>
+              <w:jc w:val="center"/>
+              <w:rPr>
+                <w:rFonts w:ascii="Calibri"/>
+                <w:sz w:val="18"/>
+              </w:rPr>
+            </w:pPr>
+            <w:r>
+              <w:rPr>
+                <w:rFonts w:ascii="Calibri"/>
+                <w:sz w:val="18"/>
+              </w:rPr>
+            </w:r>
+            <w:r>
+              <w:rPr>
+                <w:rFonts w:ascii="Calibri"/>
+                <w:sz w:val="18"/>
+              </w:rPr>
+              <w:t xml:space="preserve">{#site_details}{sn}</w:t>
+            </w:r>
+            <w:r>
+              <w:rPr>
+                <w:rFonts w:ascii="Calibri"/>
+                <w:sz w:val="18"/>
+              </w:rPr>
+            </w:r>
+            <w:r>
+              <w:rPr>
+                <w:rFonts w:ascii="Calibri"/>
+                <w:sz w:val="18"/>
+              </w:rPr>
+            </w:r>
+          </w:p>
+        </w:tc>
+        <w:tc>
+          <w:tcPr>
+            <w:tcBorders/>
+            <w:tcW w:w="1980" w:type="dxa"/>
+          </w:tcPr>
+          <w:p>
+            <w:pPr>
+              <w:pStyle w:val="939"/>
+              <w:pBdr/>
+              <w:spacing w:before="1"/>
+              <w:ind w:left="108"/>
+              <w:rPr>
+                <w:rFonts w:ascii="Calibri"/>
+                <w:sz w:val="18"/>
+              </w:rPr>
+            </w:pPr>
+            <w:r>
+              <w:rPr>
+                <w:rFonts w:ascii="Calibri"/>
+                <w:sz w:val="18"/>
+              </w:rPr>
+              <w:t xml:space="preserve">{region}</w:t>
+            </w:r>
+            <w:r>
+              <w:rPr>
+                <w:rFonts w:ascii="Calibri"/>
+                <w:sz w:val="18"/>
+              </w:rPr>
+            </w:r>
+            <w:r>
+              <w:rPr>
+                <w:rFonts w:ascii="Calibri"/>
+                <w:sz w:val="18"/>
+              </w:rPr>
+            </w:r>
+          </w:p>
+        </w:tc>
+        <w:tc>
+          <w:tcPr>
+            <w:tcBorders/>
+            <w:tcW w:w="1220" w:type="dxa"/>
+          </w:tcPr>
+          <w:p>
+            <w:pPr>
+              <w:pStyle w:val="939"/>
+              <w:pBdr/>
+              <w:spacing w:before="1"/>
+              <w:ind w:left="108"/>
+              <w:rPr>
+                <w:rFonts w:ascii="Calibri"/>
+                <w:sz w:val="18"/>
+              </w:rPr>
+            </w:pPr>
+            <w:r>
+              <w:rPr>
+                <w:rFonts w:ascii="Calibri"/>
+                <w:sz w:val="18"/>
+              </w:rPr>
+              <w:t xml:space="preserve">{area}</w:t>
+            </w:r>
+            <w:r>
+              <w:rPr>
+                <w:rFonts w:ascii="Calibri"/>
+                <w:sz w:val="18"/>
+              </w:rPr>
+            </w:r>
+            <w:r>
+              <w:rPr>
+                <w:rFonts w:ascii="Calibri"/>
+                <w:sz w:val="18"/>
+              </w:rPr>
+            </w:r>
+          </w:p>
+        </w:tc>
+        <w:tc>
+          <w:tcPr>
+            <w:tcBorders/>
+            <w:tcW w:w="1469" w:type="dxa"/>
+          </w:tcPr>
+          <w:p>
+            <w:pPr>
+              <w:pStyle w:val="939"/>
+              <w:pBdr/>
+              <w:spacing w:before="66" w:line="199" w:lineRule="exact"/>
+              <w:ind w:right="96" w:left="0"/>
+              <w:jc w:val="right"/>
+              <w:rPr>
+                <w:rFonts w:ascii="Calibri"/>
+                <w:sz w:val="18"/>
+              </w:rPr>
+            </w:pPr>
+            <w:r>
+              <w:rPr>
+                <w:rFonts w:ascii="Calibri"/>
+                <w:sz w:val="18"/>
+              </w:rPr>
+              <w:t xml:space="preserve">{nodes}</w:t>
+            </w:r>
+            <w:r>
+              <w:rPr>
+                <w:rFonts w:ascii="Calibri"/>
+                <w:sz w:val="18"/>
+              </w:rPr>
+            </w:r>
+            <w:r>
+              <w:rPr>
+                <w:rFonts w:ascii="Calibri"/>
+                <w:sz w:val="18"/>
+              </w:rPr>
+            </w:r>
+          </w:p>
+        </w:tc>
+        <w:tc>
+          <w:tcPr>
+            <w:tcBorders/>
+            <w:tcW w:w="1841" w:type="dxa"/>
+          </w:tcPr>
+          <w:p>
+            <w:pPr>
+              <w:pStyle w:val="939"/>
+              <w:pBdr/>
+              <w:spacing w:before="1"/>
+              <w:ind w:right="96" w:left="0"/>
+              <w:jc w:val="right"/>
+              <w:rPr>
+                <w:rFonts w:ascii="Calibri"/>
+                <w:sz w:val="18"/>
+              </w:rPr>
+            </w:pPr>
+            <w:r>
+              <w:rPr>
+                <w:rFonts w:ascii="Calibri"/>
+                <w:sz w:val="18"/>
+              </w:rPr>
+              <w:t xml:space="preserve">{est_km}</w:t>
+            </w:r>
+            <w:r>
+              <w:rPr>
+                <w:rFonts w:ascii="Calibri"/>
+                <w:sz w:val="18"/>
+              </w:rPr>
+              <w:t xml:space="preserve">{/site_details}</w:t>
+            </w:r>
+            <w:r>
+              <w:rPr>
+                <w:rFonts w:ascii="Calibri"/>
+                <w:sz w:val="18"/>
+              </w:rPr>
+            </w:r>
+            <w:r>
+              <w:rPr>
+                <w:rFonts w:ascii="Calibri"/>
+                <w:sz w:val="18"/>
+              </w:rPr>
+            </w:r>
+          </w:p>
+        </w:tc>
+      </w:tr>
+      <w:tr>
+        <w:trPr>
+          <w:trHeight w:val="218"/>
+        </w:trPr>
+        <w:tc>
+          <w:tcPr>
+            <w:gridSpan w:val="3"/>
+            <w:tcBorders/>
+            <w:tcW w:w="3901" w:type="dxa"/>
+          </w:tcPr>
+          <w:p>
+            <w:pPr>
+              <w:pStyle w:val="939"/>
+              <w:pBdr/>
+              <w:spacing w:line="198" w:lineRule="exact"/>
+              <w:ind w:left="6"/>
+              <w:jc w:val="center"/>
+              <w:rPr>
+                <w:rFonts w:ascii="Calibri"/>
+                <w:b/>
+                <w:sz w:val="18"/>
+              </w:rPr>
+            </w:pPr>
+            <w:r>
+              <w:rPr>
+                <w:rFonts w:ascii="Calibri"/>
+                <w:b/>
+                <w:spacing w:val="-2"/>
+                <w:sz w:val="18"/>
+              </w:rPr>
+              <w:t xml:space="preserve">TOTAL</w:t>
+            </w:r>
+            <w:r>
+              <w:rPr>
+                <w:rFonts w:ascii="Calibri"/>
+                <w:b/>
+                <w:sz w:val="18"/>
+              </w:rPr>
+            </w:r>
+            <w:r>
+              <w:rPr>
+                <w:rFonts w:ascii="Calibri"/>
+                <w:b/>
+                <w:sz w:val="18"/>
+              </w:rPr>
+            </w:r>
+          </w:p>
+        </w:tc>
+        <w:tc>
+          <w:tcPr>
+            <w:tcBorders/>
+            <w:tcW w:w="1469" w:type="dxa"/>
+          </w:tcPr>
+          <w:p>
+            <w:pPr>
+              <w:pStyle w:val="939"/>
+              <w:pBdr/>
+              <w:spacing w:line="198" w:lineRule="exact"/>
+              <w:ind w:right="96" w:left="0"/>
+              <w:jc w:val="right"/>
+              <w:rPr>
+                <w:rFonts w:ascii="Calibri"/>
+                <w:b/>
+                <w:sz w:val="18"/>
+              </w:rPr>
+            </w:pPr>
+            <w:r>
+              <w:rPr>
+                <w:rFonts w:ascii="Calibri"/>
+                <w:b/>
+                <w:sz w:val="18"/>
+              </w:rPr>
+              <w:t xml:space="preserve">{total_nodes}</w:t>
+            </w:r>
+            <w:r>
+              <w:rPr>
+                <w:rFonts w:ascii="Calibri"/>
+                <w:b/>
+                <w:sz w:val="18"/>
+              </w:rPr>
+            </w:r>
+            <w:r>
+              <w:rPr>
+                <w:rFonts w:ascii="Calibri"/>
+                <w:b/>
+                <w:sz w:val="18"/>
+              </w:rPr>
+            </w:r>
+          </w:p>
+        </w:tc>
+        <w:tc>
+          <w:tcPr>
+            <w:tcBorders/>
+            <w:tcW w:w="1841" w:type="dxa"/>
+          </w:tcPr>
+          <w:p>
+            <w:pPr>
+              <w:pStyle w:val="939"/>
+              <w:pBdr/>
+              <w:spacing w:line="198" w:lineRule="exact"/>
+              <w:ind w:right="96" w:left="0"/>
+              <w:jc w:val="right"/>
+              <w:rPr>
+                <w:rFonts w:ascii="Calibri"/>
+                <w:b/>
+                <w:sz w:val="18"/>
+              </w:rPr>
+            </w:pPr>
+            <w:r>
+              <w:rPr>
+                <w:rFonts w:ascii="Calibri"/>
+                <w:b/>
+                <w:sz w:val="18"/>
+              </w:rPr>
+              <w:t xml:space="preserve">{total_cable}</w:t>
+            </w:r>
+            <w:r>
+              <w:rPr>
+                <w:rFonts w:ascii="Calibri"/>
+                <w:b/>
+                <w:sz w:val="18"/>
+              </w:rPr>
+            </w:r>
+            <w:r>
+              <w:rPr>
+                <w:rFonts w:ascii="Calibri"/>
+                <w:b/>
+                <w:sz w:val="18"/>
+              </w:rPr>
+            </w:r>
+          </w:p>
+        </w:tc>
+      </w:tr>
+    </w:tbl>
+    <w:p>
       <w:r>
         <w:rPr>
           <w:rFonts w:ascii="Calibri"/>

</xml_diff>

<commit_message>
fix(docx): keep site details table on the letterhead page in the PO template
</commit_message>
<xml_diff>
--- a/public/templates/PO_TEMPLATE_ORIGINAL.docx
+++ b/public/templates/PO_TEMPLATE_ORIGINAL.docx
@@ -10855,7 +10855,7 @@
         <w:sectPr>
           <w:footnotePr/>
           <w:endnotePr/>
-          <w:type w:val="continuous"/>
+          <w:type w:val="nextPage"/>
           <w:pgSz w:h="16838" w:orient="portrait" w:w="11906"/>
           <w:pgMar w:top="700" w:right="0" w:bottom="1200" w:left="720" w:header="0" w:footer="1012" w:gutter="0"/>
           <w:cols w:num="1" w:sep="0" w:space="720" w:equalWidth="1"/>
@@ -11390,7 +11390,7 @@
         <w:sectPr>
           <w:footnotePr/>
           <w:endnotePr/>
-          <w:type w:val="nextPage"/>
+          <w:type w:val="continuous"/>
           <w:pgSz w:h="16838" w:orient="portrait" w:w="11906"/>
           <w:pgMar w:top="700" w:right="0" w:bottom="1200" w:left="720" w:header="0" w:footer="1012" w:gutter="0"/>
           <w:cols w:num="1" w:sep="0" w:space="720" w:equalWidth="0">

</xml_diff>

<commit_message>
fix(docx): nest site details table after SUMMARY label inside the PO form
</commit_message>
<xml_diff>
--- a/public/templates/PO_TEMPLATE_ORIGINAL.docx
+++ b/public/templates/PO_TEMPLATE_ORIGINAL.docx
@@ -11435,701 +11435,6 @@
         </w:rPr>
       </w:r>
     </w:p>
-    <w:tbl>
-      <w:tblPr>
-        <w:tblInd w:w="65" w:type="dxa"/>
-        <w:tblW w:w="0" w:type="auto"/>
-        <w:tblCellMar>
-          <w:left w:w="0" w:type="dxa"/>
-          <w:right w:w="0" w:type="dxa"/>
-        </w:tblCellMar>
-        <w:tblBorders>
-          <w:top w:val="single" w:color="000000" w:sz="4" w:space="0"/>
-          <w:left w:val="single" w:color="000000" w:sz="4" w:space="0"/>
-          <w:bottom w:val="single" w:color="000000" w:sz="4" w:space="0"/>
-          <w:right w:val="single" w:color="000000" w:sz="4" w:space="0"/>
-          <w:insideH w:val="single" w:color="000000" w:sz="4" w:space="0"/>
-          <w:insideV w:val="single" w:color="000000" w:sz="4" w:space="0"/>
-        </w:tblBorders>
-        <w:tblLayout w:type="fixed"/>
-        <w:tblLook w:val="01E0" w:firstRow="1" w:lastRow="1" w:firstColumn="1" w:lastColumn="1" w:noHBand="0" w:noVBand="0"/>
-      </w:tblPr>
-      <w:tblGrid>
-        <w:gridCol w:w="701"/>
-        <w:gridCol w:w="1980"/>
-        <w:gridCol w:w="1220"/>
-        <w:gridCol w:w="1469"/>
-        <w:gridCol w:w="1841"/>
-      </w:tblGrid>
-      <w:tr>
-        <w:trPr>
-          <w:trHeight w:val="438"/>
-        </w:trPr>
-        <w:tc>
-          <w:tcPr>
-            <w:tcBorders/>
-            <w:tcW w:w="701" w:type="dxa"/>
-          </w:tcPr>
-          <w:p>
-            <w:pPr>
-              <w:pStyle w:val="939"/>
-              <w:pBdr/>
-              <w:spacing w:line="219" w:lineRule="exact"/>
-              <w:ind w:left="49"/>
-              <w:jc w:val="center"/>
-              <w:rPr>
-                <w:rFonts w:ascii="Calibri"/>
-                <w:b/>
-                <w:sz w:val="18"/>
-              </w:rPr>
-            </w:pPr>
-            <w:r>
-              <w:rPr>
-                <w:rFonts w:ascii="Calibri"/>
-                <w:b/>
-                <w:spacing w:val="-5"/>
-                <w:sz w:val="18"/>
-              </w:rPr>
-              <w:t xml:space="preserve">S/N</w:t>
-            </w:r>
-            <w:r>
-              <w:rPr>
-                <w:rFonts w:ascii="Calibri"/>
-                <w:b/>
-                <w:sz w:val="18"/>
-              </w:rPr>
-            </w:r>
-            <w:r>
-              <w:rPr>
-                <w:rFonts w:ascii="Calibri"/>
-                <w:b/>
-                <w:sz w:val="18"/>
-              </w:rPr>
-            </w:r>
-          </w:p>
-        </w:tc>
-        <w:tc>
-          <w:tcPr>
-            <w:tcBorders/>
-            <w:tcW w:w="1980" w:type="dxa"/>
-          </w:tcPr>
-          <w:p>
-            <w:pPr>
-              <w:pStyle w:val="939"/>
-              <w:pBdr/>
-              <w:spacing w:line="219" w:lineRule="exact"/>
-              <w:ind w:left="10"/>
-              <w:jc w:val="center"/>
-              <w:rPr>
-                <w:rFonts w:ascii="Calibri"/>
-                <w:b/>
-                <w:sz w:val="18"/>
-              </w:rPr>
-            </w:pPr>
-            <w:r>
-              <w:rPr>
-                <w:rFonts w:ascii="Calibri"/>
-                <w:b/>
-                <w:spacing w:val="-2"/>
-                <w:sz w:val="18"/>
-              </w:rPr>
-              <w:t xml:space="preserve">REGION</w:t>
-            </w:r>
-            <w:r>
-              <w:rPr>
-                <w:rFonts w:ascii="Calibri"/>
-                <w:b/>
-                <w:sz w:val="18"/>
-              </w:rPr>
-            </w:r>
-            <w:r>
-              <w:rPr>
-                <w:rFonts w:ascii="Calibri"/>
-                <w:b/>
-                <w:sz w:val="18"/>
-              </w:rPr>
-            </w:r>
-          </w:p>
-        </w:tc>
-        <w:tc>
-          <w:tcPr>
-            <w:tcBorders/>
-            <w:tcW w:w="1220" w:type="dxa"/>
-          </w:tcPr>
-          <w:p>
-            <w:pPr>
-              <w:pStyle w:val="939"/>
-              <w:pBdr/>
-              <w:spacing w:line="219" w:lineRule="exact"/>
-              <w:ind w:left="204"/>
-              <w:rPr>
-                <w:rFonts w:ascii="Calibri"/>
-                <w:b/>
-                <w:sz w:val="18"/>
-              </w:rPr>
-            </w:pPr>
-            <w:r>
-              <w:rPr>
-                <w:rFonts w:ascii="Calibri"/>
-                <w:b/>
-                <w:spacing w:val="-2"/>
-                <w:sz w:val="18"/>
-              </w:rPr>
-              <w:t xml:space="preserve">AREA/CITY</w:t>
-            </w:r>
-            <w:r>
-              <w:rPr>
-                <w:rFonts w:ascii="Calibri"/>
-                <w:b/>
-                <w:sz w:val="18"/>
-              </w:rPr>
-            </w:r>
-            <w:r>
-              <w:rPr>
-                <w:rFonts w:ascii="Calibri"/>
-                <w:b/>
-                <w:sz w:val="18"/>
-              </w:rPr>
-            </w:r>
-          </w:p>
-        </w:tc>
-        <w:tc>
-          <w:tcPr>
-            <w:tcBorders/>
-            <w:tcW w:w="1469" w:type="dxa"/>
-          </w:tcPr>
-          <w:p>
-            <w:pPr>
-              <w:pStyle w:val="939"/>
-              <w:pBdr/>
-              <w:spacing w:line="219" w:lineRule="exact"/>
-              <w:ind w:left="206"/>
-              <w:rPr>
-                <w:rFonts w:ascii="Calibri"/>
-                <w:b/>
-                <w:sz w:val="18"/>
-              </w:rPr>
-            </w:pPr>
-            <w:r>
-              <w:rPr>
-                <w:rFonts w:ascii="Calibri"/>
-                <w:b/>
-                <w:sz w:val="18"/>
-              </w:rPr>
-              <w:t xml:space="preserve">NO</w:t>
-            </w:r>
-            <w:r>
-              <w:rPr>
-                <w:rFonts w:ascii="Calibri"/>
-                <w:b/>
-                <w:spacing w:val="-2"/>
-                <w:sz w:val="18"/>
-              </w:rPr>
-              <w:t xml:space="preserve"> </w:t>
-            </w:r>
-            <w:r>
-              <w:rPr>
-                <w:rFonts w:ascii="Calibri"/>
-                <w:b/>
-                <w:sz w:val="18"/>
-              </w:rPr>
-              <w:t xml:space="preserve">OF</w:t>
-            </w:r>
-            <w:r>
-              <w:rPr>
-                <w:rFonts w:ascii="Calibri"/>
-                <w:b/>
-                <w:spacing w:val="-2"/>
-                <w:sz w:val="18"/>
-              </w:rPr>
-              <w:t xml:space="preserve"> NODES</w:t>
-            </w:r>
-            <w:r>
-              <w:rPr>
-                <w:rFonts w:ascii="Calibri"/>
-                <w:b/>
-                <w:sz w:val="18"/>
-              </w:rPr>
-            </w:r>
-            <w:r>
-              <w:rPr>
-                <w:rFonts w:ascii="Calibri"/>
-                <w:b/>
-                <w:sz w:val="18"/>
-              </w:rPr>
-            </w:r>
-          </w:p>
-        </w:tc>
-        <w:tc>
-          <w:tcPr>
-            <w:tcBorders/>
-            <w:tcW w:w="1841" w:type="dxa"/>
-          </w:tcPr>
-          <w:p>
-            <w:pPr>
-              <w:pStyle w:val="939"/>
-              <w:pBdr/>
-              <w:spacing w:line="219" w:lineRule="exact"/>
-              <w:ind w:left="158"/>
-              <w:rPr>
-                <w:rFonts w:ascii="Calibri"/>
-                <w:b/>
-                <w:sz w:val="18"/>
-              </w:rPr>
-            </w:pPr>
-            <w:r>
-              <w:rPr>
-                <w:rFonts w:ascii="Calibri"/>
-                <w:b/>
-                <w:sz w:val="18"/>
-              </w:rPr>
-              <w:t xml:space="preserve">ESTIMATED</w:t>
-            </w:r>
-            <w:r>
-              <w:rPr>
-                <w:rFonts w:ascii="Calibri"/>
-                <w:b/>
-                <w:spacing w:val="-4"/>
-                <w:sz w:val="18"/>
-              </w:rPr>
-              <w:t xml:space="preserve"> </w:t>
-            </w:r>
-            <w:r>
-              <w:rPr>
-                <w:rFonts w:ascii="Calibri"/>
-                <w:b/>
-                <w:spacing w:val="-2"/>
-                <w:sz w:val="18"/>
-              </w:rPr>
-              <w:t xml:space="preserve">STRAND</w:t>
-            </w:r>
-            <w:r>
-              <w:rPr>
-                <w:rFonts w:ascii="Calibri"/>
-                <w:b/>
-                <w:sz w:val="18"/>
-              </w:rPr>
-            </w:r>
-            <w:r>
-              <w:rPr>
-                <w:rFonts w:ascii="Calibri"/>
-                <w:b/>
-                <w:sz w:val="18"/>
-              </w:rPr>
-            </w:r>
-          </w:p>
-          <w:p>
-            <w:pPr>
-              <w:pStyle w:val="939"/>
-              <w:pBdr/>
-              <w:spacing w:before="1" w:line="199" w:lineRule="exact"/>
-              <w:ind w:left="160"/>
-              <w:rPr>
-                <w:rFonts w:ascii="Calibri"/>
-                <w:b/>
-                <w:sz w:val="18"/>
-              </w:rPr>
-            </w:pPr>
-            <w:r>
-              <w:rPr>
-                <w:rFonts w:ascii="Calibri"/>
-                <w:b/>
-                <w:sz w:val="18"/>
-              </w:rPr>
-              <w:t xml:space="preserve">CABLE</w:t>
-            </w:r>
-            <w:r>
-              <w:rPr>
-                <w:rFonts w:ascii="Calibri"/>
-                <w:b/>
-                <w:spacing w:val="-1"/>
-                <w:sz w:val="18"/>
-              </w:rPr>
-              <w:t xml:space="preserve"> </w:t>
-            </w:r>
-            <w:r>
-              <w:rPr>
-                <w:rFonts w:ascii="Calibri"/>
-                <w:b/>
-                <w:sz w:val="18"/>
-              </w:rPr>
-              <w:t xml:space="preserve">LENGTH</w:t>
-            </w:r>
-            <w:r>
-              <w:rPr>
-                <w:rFonts w:ascii="Calibri"/>
-                <w:b/>
-                <w:spacing w:val="-2"/>
-                <w:sz w:val="18"/>
-              </w:rPr>
-              <w:t xml:space="preserve"> </w:t>
-            </w:r>
-            <w:r>
-              <w:rPr>
-                <w:rFonts w:ascii="Calibri"/>
-                <w:b/>
-                <w:spacing w:val="-4"/>
-                <w:sz w:val="18"/>
-              </w:rPr>
-              <w:t xml:space="preserve">(KM)</w:t>
-            </w:r>
-            <w:r>
-              <w:rPr>
-                <w:rFonts w:ascii="Calibri"/>
-                <w:b/>
-                <w:sz w:val="18"/>
-              </w:rPr>
-            </w:r>
-            <w:r>
-              <w:rPr>
-                <w:rFonts w:ascii="Calibri"/>
-                <w:b/>
-                <w:sz w:val="18"/>
-              </w:rPr>
-            </w:r>
-          </w:p>
-        </w:tc>
-      </w:tr>
-      <w:tr>
-        <w:trPr>
-          <w:trHeight w:val="285"/>
-        </w:trPr>
-        <w:tc>
-          <w:tcPr>
-            <w:tcBorders/>
-            <w:tcW w:w="701" w:type="dxa"/>
-          </w:tcPr>
-          <w:p>
-            <w:pPr>
-              <w:pStyle w:val="939"/>
-              <w:pBdr/>
-              <w:spacing w:before="1"/>
-              <w:ind w:right="39" w:left="49"/>
-              <w:jc w:val="center"/>
-              <w:rPr>
-                <w:rFonts w:ascii="Calibri"/>
-                <w:sz w:val="18"/>
-              </w:rPr>
-            </w:pPr>
-            <w:r>
-              <w:rPr>
-                <w:rFonts w:ascii="Calibri"/>
-                <w:sz w:val="18"/>
-              </w:rPr>
-            </w:r>
-            <w:r>
-              <w:rPr>
-                <w:rFonts w:ascii="Calibri"/>
-                <w:sz w:val="18"/>
-              </w:rPr>
-              <w:t xml:space="preserve">{#site_details}{sn}</w:t>
-            </w:r>
-            <w:r>
-              <w:rPr>
-                <w:rFonts w:ascii="Calibri"/>
-                <w:sz w:val="18"/>
-              </w:rPr>
-            </w:r>
-            <w:r>
-              <w:rPr>
-                <w:rFonts w:ascii="Calibri"/>
-                <w:sz w:val="18"/>
-              </w:rPr>
-            </w:r>
-          </w:p>
-        </w:tc>
-        <w:tc>
-          <w:tcPr>
-            <w:tcBorders/>
-            <w:tcW w:w="1980" w:type="dxa"/>
-          </w:tcPr>
-          <w:p>
-            <w:pPr>
-              <w:pStyle w:val="939"/>
-              <w:pBdr/>
-              <w:spacing w:before="1"/>
-              <w:ind w:left="108"/>
-              <w:rPr>
-                <w:rFonts w:ascii="Calibri"/>
-                <w:sz w:val="18"/>
-              </w:rPr>
-            </w:pPr>
-            <w:r>
-              <w:rPr>
-                <w:rFonts w:ascii="Calibri"/>
-                <w:sz w:val="18"/>
-              </w:rPr>
-              <w:t xml:space="preserve">{region}</w:t>
-            </w:r>
-            <w:r>
-              <w:rPr>
-                <w:rFonts w:ascii="Calibri"/>
-                <w:sz w:val="18"/>
-              </w:rPr>
-            </w:r>
-            <w:r>
-              <w:rPr>
-                <w:rFonts w:ascii="Calibri"/>
-                <w:sz w:val="18"/>
-              </w:rPr>
-            </w:r>
-          </w:p>
-        </w:tc>
-        <w:tc>
-          <w:tcPr>
-            <w:tcBorders/>
-            <w:tcW w:w="1220" w:type="dxa"/>
-          </w:tcPr>
-          <w:p>
-            <w:pPr>
-              <w:pStyle w:val="939"/>
-              <w:pBdr/>
-              <w:spacing w:before="1"/>
-              <w:ind w:left="108"/>
-              <w:rPr>
-                <w:rFonts w:ascii="Calibri"/>
-                <w:sz w:val="18"/>
-              </w:rPr>
-            </w:pPr>
-            <w:r>
-              <w:rPr>
-                <w:rFonts w:ascii="Calibri"/>
-                <w:sz w:val="18"/>
-              </w:rPr>
-              <w:t xml:space="preserve">{area}</w:t>
-            </w:r>
-            <w:r>
-              <w:rPr>
-                <w:rFonts w:ascii="Calibri"/>
-                <w:sz w:val="18"/>
-              </w:rPr>
-            </w:r>
-            <w:r>
-              <w:rPr>
-                <w:rFonts w:ascii="Calibri"/>
-                <w:sz w:val="18"/>
-              </w:rPr>
-            </w:r>
-          </w:p>
-        </w:tc>
-        <w:tc>
-          <w:tcPr>
-            <w:tcBorders/>
-            <w:tcW w:w="1469" w:type="dxa"/>
-          </w:tcPr>
-          <w:p>
-            <w:pPr>
-              <w:pStyle w:val="939"/>
-              <w:pBdr/>
-              <w:spacing w:before="66" w:line="199" w:lineRule="exact"/>
-              <w:ind w:right="96" w:left="0"/>
-              <w:jc w:val="right"/>
-              <w:rPr>
-                <w:rFonts w:ascii="Calibri"/>
-                <w:sz w:val="18"/>
-              </w:rPr>
-            </w:pPr>
-            <w:r>
-              <w:rPr>
-                <w:rFonts w:ascii="Calibri"/>
-                <w:sz w:val="18"/>
-              </w:rPr>
-              <w:t xml:space="preserve">{nodes}</w:t>
-            </w:r>
-            <w:r>
-              <w:rPr>
-                <w:rFonts w:ascii="Calibri"/>
-                <w:sz w:val="18"/>
-              </w:rPr>
-            </w:r>
-            <w:r>
-              <w:rPr>
-                <w:rFonts w:ascii="Calibri"/>
-                <w:sz w:val="18"/>
-              </w:rPr>
-            </w:r>
-          </w:p>
-        </w:tc>
-        <w:tc>
-          <w:tcPr>
-            <w:tcBorders/>
-            <w:tcW w:w="1841" w:type="dxa"/>
-          </w:tcPr>
-          <w:p>
-            <w:pPr>
-              <w:pStyle w:val="939"/>
-              <w:pBdr/>
-              <w:spacing w:before="1"/>
-              <w:ind w:right="96" w:left="0"/>
-              <w:jc w:val="right"/>
-              <w:rPr>
-                <w:rFonts w:ascii="Calibri"/>
-                <w:sz w:val="18"/>
-              </w:rPr>
-            </w:pPr>
-            <w:r>
-              <w:rPr>
-                <w:rFonts w:ascii="Calibri"/>
-                <w:sz w:val="18"/>
-              </w:rPr>
-              <w:t xml:space="preserve">{est_km}</w:t>
-            </w:r>
-            <w:r>
-              <w:rPr>
-                <w:rFonts w:ascii="Calibri"/>
-                <w:sz w:val="18"/>
-              </w:rPr>
-              <w:t xml:space="preserve">{/site_details}</w:t>
-            </w:r>
-            <w:r>
-              <w:rPr>
-                <w:rFonts w:ascii="Calibri"/>
-                <w:sz w:val="18"/>
-              </w:rPr>
-            </w:r>
-            <w:r>
-              <w:rPr>
-                <w:rFonts w:ascii="Calibri"/>
-                <w:sz w:val="18"/>
-              </w:rPr>
-            </w:r>
-          </w:p>
-        </w:tc>
-      </w:tr>
-      <w:tr>
-        <w:trPr>
-          <w:trHeight w:val="218"/>
-        </w:trPr>
-        <w:tc>
-          <w:tcPr>
-            <w:gridSpan w:val="3"/>
-            <w:tcBorders/>
-            <w:tcW w:w="3901" w:type="dxa"/>
-          </w:tcPr>
-          <w:p>
-            <w:pPr>
-              <w:pStyle w:val="939"/>
-              <w:pBdr/>
-              <w:spacing w:line="198" w:lineRule="exact"/>
-              <w:ind w:left="6"/>
-              <w:jc w:val="center"/>
-              <w:rPr>
-                <w:rFonts w:ascii="Calibri"/>
-                <w:b/>
-                <w:sz w:val="18"/>
-              </w:rPr>
-            </w:pPr>
-            <w:r>
-              <w:rPr>
-                <w:rFonts w:ascii="Calibri"/>
-                <w:b/>
-                <w:spacing w:val="-2"/>
-                <w:sz w:val="18"/>
-              </w:rPr>
-              <w:t xml:space="preserve">TOTAL</w:t>
-            </w:r>
-            <w:r>
-              <w:rPr>
-                <w:rFonts w:ascii="Calibri"/>
-                <w:b/>
-                <w:sz w:val="18"/>
-              </w:rPr>
-            </w:r>
-            <w:r>
-              <w:rPr>
-                <w:rFonts w:ascii="Calibri"/>
-                <w:b/>
-                <w:sz w:val="18"/>
-              </w:rPr>
-            </w:r>
-          </w:p>
-        </w:tc>
-        <w:tc>
-          <w:tcPr>
-            <w:tcBorders/>
-            <w:tcW w:w="1469" w:type="dxa"/>
-          </w:tcPr>
-          <w:p>
-            <w:pPr>
-              <w:pStyle w:val="939"/>
-              <w:pBdr/>
-              <w:spacing w:line="198" w:lineRule="exact"/>
-              <w:ind w:right="96" w:left="0"/>
-              <w:jc w:val="right"/>
-              <w:rPr>
-                <w:rFonts w:ascii="Calibri"/>
-                <w:b/>
-                <w:sz w:val="18"/>
-              </w:rPr>
-            </w:pPr>
-            <w:r>
-              <w:rPr>
-                <w:rFonts w:ascii="Calibri"/>
-                <w:b/>
-                <w:sz w:val="18"/>
-              </w:rPr>
-              <w:t xml:space="preserve">{total_nodes}</w:t>
-            </w:r>
-            <w:r>
-              <w:rPr>
-                <w:rFonts w:ascii="Calibri"/>
-                <w:b/>
-                <w:sz w:val="18"/>
-              </w:rPr>
-            </w:r>
-            <w:r>
-              <w:rPr>
-                <w:rFonts w:ascii="Calibri"/>
-                <w:b/>
-                <w:sz w:val="18"/>
-              </w:rPr>
-            </w:r>
-          </w:p>
-        </w:tc>
-        <w:tc>
-          <w:tcPr>
-            <w:tcBorders/>
-            <w:tcW w:w="1841" w:type="dxa"/>
-          </w:tcPr>
-          <w:p>
-            <w:pPr>
-              <w:pStyle w:val="939"/>
-              <w:pBdr/>
-              <w:spacing w:line="198" w:lineRule="exact"/>
-              <w:ind w:right="96" w:left="0"/>
-              <w:jc w:val="right"/>
-              <w:rPr>
-                <w:rFonts w:ascii="Calibri"/>
-                <w:b/>
-                <w:sz w:val="18"/>
-              </w:rPr>
-            </w:pPr>
-            <w:r>
-              <w:rPr>
-                <w:rFonts w:ascii="Calibri"/>
-                <w:b/>
-                <w:sz w:val="18"/>
-              </w:rPr>
-              <w:t xml:space="preserve">{total_cable}</w:t>
-            </w:r>
-            <w:r>
-              <w:rPr>
-                <w:rFonts w:ascii="Calibri"/>
-                <w:b/>
-                <w:sz w:val="18"/>
-              </w:rPr>
-            </w:r>
-            <w:r>
-              <w:rPr>
-                <w:rFonts w:ascii="Calibri"/>
-                <w:b/>
-                <w:sz w:val="18"/>
-              </w:rPr>
-            </w:r>
-          </w:p>
-        </w:tc>
-      </w:tr>
-    </w:tbl>
     <w:p>
       <w:r>
         <w:rPr>
@@ -13789,6 +13094,701 @@
               </w:rPr>
             </w:r>
           </w:p>
+          <w:tbl>
+            <w:tblPr>
+              <w:tblInd w:w="65" w:type="dxa"/>
+              <w:tblW w:w="0" w:type="auto"/>
+              <w:tblCellMar>
+                <w:left w:w="0" w:type="dxa"/>
+                <w:right w:w="0" w:type="dxa"/>
+              </w:tblCellMar>
+              <w:tblBorders>
+                <w:top w:val="single" w:color="000000" w:sz="4" w:space="0"/>
+                <w:left w:val="single" w:color="000000" w:sz="4" w:space="0"/>
+                <w:bottom w:val="single" w:color="000000" w:sz="4" w:space="0"/>
+                <w:right w:val="single" w:color="000000" w:sz="4" w:space="0"/>
+                <w:insideH w:val="single" w:color="000000" w:sz="4" w:space="0"/>
+                <w:insideV w:val="single" w:color="000000" w:sz="4" w:space="0"/>
+              </w:tblBorders>
+              <w:tblLayout w:type="fixed"/>
+              <w:tblLook w:val="01E0" w:firstRow="1" w:lastRow="1" w:firstColumn="1" w:lastColumn="1" w:noHBand="0" w:noVBand="0"/>
+            </w:tblPr>
+            <w:tblGrid>
+              <w:gridCol w:w="701"/>
+              <w:gridCol w:w="1980"/>
+              <w:gridCol w:w="1220"/>
+              <w:gridCol w:w="1469"/>
+              <w:gridCol w:w="1841"/>
+            </w:tblGrid>
+            <w:tr>
+              <w:trPr>
+                <w:trHeight w:val="438"/>
+              </w:trPr>
+              <w:tc>
+                <w:tcPr>
+                  <w:tcBorders/>
+                  <w:tcW w:w="701" w:type="dxa"/>
+                </w:tcPr>
+                <w:p>
+                  <w:pPr>
+                    <w:pStyle w:val="939"/>
+                    <w:pBdr/>
+                    <w:spacing w:line="219" w:lineRule="exact"/>
+                    <w:ind w:left="49"/>
+                    <w:jc w:val="center"/>
+                    <w:rPr>
+                      <w:rFonts w:ascii="Calibri"/>
+                      <w:b/>
+                      <w:sz w:val="18"/>
+                    </w:rPr>
+                  </w:pPr>
+                  <w:r>
+                    <w:rPr>
+                      <w:rFonts w:ascii="Calibri"/>
+                      <w:b/>
+                      <w:spacing w:val="-5"/>
+                      <w:sz w:val="18"/>
+                    </w:rPr>
+                    <w:t xml:space="preserve">S/N</w:t>
+                  </w:r>
+                  <w:r>
+                    <w:rPr>
+                      <w:rFonts w:ascii="Calibri"/>
+                      <w:b/>
+                      <w:sz w:val="18"/>
+                    </w:rPr>
+                  </w:r>
+                  <w:r>
+                    <w:rPr>
+                      <w:rFonts w:ascii="Calibri"/>
+                      <w:b/>
+                      <w:sz w:val="18"/>
+                    </w:rPr>
+                  </w:r>
+                </w:p>
+              </w:tc>
+              <w:tc>
+                <w:tcPr>
+                  <w:tcBorders/>
+                  <w:tcW w:w="1980" w:type="dxa"/>
+                </w:tcPr>
+                <w:p>
+                  <w:pPr>
+                    <w:pStyle w:val="939"/>
+                    <w:pBdr/>
+                    <w:spacing w:line="219" w:lineRule="exact"/>
+                    <w:ind w:left="10"/>
+                    <w:jc w:val="center"/>
+                    <w:rPr>
+                      <w:rFonts w:ascii="Calibri"/>
+                      <w:b/>
+                      <w:sz w:val="18"/>
+                    </w:rPr>
+                  </w:pPr>
+                  <w:r>
+                    <w:rPr>
+                      <w:rFonts w:ascii="Calibri"/>
+                      <w:b/>
+                      <w:spacing w:val="-2"/>
+                      <w:sz w:val="18"/>
+                    </w:rPr>
+                    <w:t xml:space="preserve">REGION</w:t>
+                  </w:r>
+                  <w:r>
+                    <w:rPr>
+                      <w:rFonts w:ascii="Calibri"/>
+                      <w:b/>
+                      <w:sz w:val="18"/>
+                    </w:rPr>
+                  </w:r>
+                  <w:r>
+                    <w:rPr>
+                      <w:rFonts w:ascii="Calibri"/>
+                      <w:b/>
+                      <w:sz w:val="18"/>
+                    </w:rPr>
+                  </w:r>
+                </w:p>
+              </w:tc>
+              <w:tc>
+                <w:tcPr>
+                  <w:tcBorders/>
+                  <w:tcW w:w="1220" w:type="dxa"/>
+                </w:tcPr>
+                <w:p>
+                  <w:pPr>
+                    <w:pStyle w:val="939"/>
+                    <w:pBdr/>
+                    <w:spacing w:line="219" w:lineRule="exact"/>
+                    <w:ind w:left="204"/>
+                    <w:rPr>
+                      <w:rFonts w:ascii="Calibri"/>
+                      <w:b/>
+                      <w:sz w:val="18"/>
+                    </w:rPr>
+                  </w:pPr>
+                  <w:r>
+                    <w:rPr>
+                      <w:rFonts w:ascii="Calibri"/>
+                      <w:b/>
+                      <w:spacing w:val="-2"/>
+                      <w:sz w:val="18"/>
+                    </w:rPr>
+                    <w:t xml:space="preserve">AREA/CITY</w:t>
+                  </w:r>
+                  <w:r>
+                    <w:rPr>
+                      <w:rFonts w:ascii="Calibri"/>
+                      <w:b/>
+                      <w:sz w:val="18"/>
+                    </w:rPr>
+                  </w:r>
+                  <w:r>
+                    <w:rPr>
+                      <w:rFonts w:ascii="Calibri"/>
+                      <w:b/>
+                      <w:sz w:val="18"/>
+                    </w:rPr>
+                  </w:r>
+                </w:p>
+              </w:tc>
+              <w:tc>
+                <w:tcPr>
+                  <w:tcBorders/>
+                  <w:tcW w:w="1469" w:type="dxa"/>
+                </w:tcPr>
+                <w:p>
+                  <w:pPr>
+                    <w:pStyle w:val="939"/>
+                    <w:pBdr/>
+                    <w:spacing w:line="219" w:lineRule="exact"/>
+                    <w:ind w:left="206"/>
+                    <w:rPr>
+                      <w:rFonts w:ascii="Calibri"/>
+                      <w:b/>
+                      <w:sz w:val="18"/>
+                    </w:rPr>
+                  </w:pPr>
+                  <w:r>
+                    <w:rPr>
+                      <w:rFonts w:ascii="Calibri"/>
+                      <w:b/>
+                      <w:sz w:val="18"/>
+                    </w:rPr>
+                    <w:t xml:space="preserve">NO</w:t>
+                  </w:r>
+                  <w:r>
+                    <w:rPr>
+                      <w:rFonts w:ascii="Calibri"/>
+                      <w:b/>
+                      <w:spacing w:val="-2"/>
+                      <w:sz w:val="18"/>
+                    </w:rPr>
+                    <w:t xml:space="preserve"> </w:t>
+                  </w:r>
+                  <w:r>
+                    <w:rPr>
+                      <w:rFonts w:ascii="Calibri"/>
+                      <w:b/>
+                      <w:sz w:val="18"/>
+                    </w:rPr>
+                    <w:t xml:space="preserve">OF</w:t>
+                  </w:r>
+                  <w:r>
+                    <w:rPr>
+                      <w:rFonts w:ascii="Calibri"/>
+                      <w:b/>
+                      <w:spacing w:val="-2"/>
+                      <w:sz w:val="18"/>
+                    </w:rPr>
+                    <w:t xml:space="preserve"> NODES</w:t>
+                  </w:r>
+                  <w:r>
+                    <w:rPr>
+                      <w:rFonts w:ascii="Calibri"/>
+                      <w:b/>
+                      <w:sz w:val="18"/>
+                    </w:rPr>
+                  </w:r>
+                  <w:r>
+                    <w:rPr>
+                      <w:rFonts w:ascii="Calibri"/>
+                      <w:b/>
+                      <w:sz w:val="18"/>
+                    </w:rPr>
+                  </w:r>
+                </w:p>
+              </w:tc>
+              <w:tc>
+                <w:tcPr>
+                  <w:tcBorders/>
+                  <w:tcW w:w="1841" w:type="dxa"/>
+                </w:tcPr>
+                <w:p>
+                  <w:pPr>
+                    <w:pStyle w:val="939"/>
+                    <w:pBdr/>
+                    <w:spacing w:line="219" w:lineRule="exact"/>
+                    <w:ind w:left="158"/>
+                    <w:rPr>
+                      <w:rFonts w:ascii="Calibri"/>
+                      <w:b/>
+                      <w:sz w:val="18"/>
+                    </w:rPr>
+                  </w:pPr>
+                  <w:r>
+                    <w:rPr>
+                      <w:rFonts w:ascii="Calibri"/>
+                      <w:b/>
+                      <w:sz w:val="18"/>
+                    </w:rPr>
+                    <w:t xml:space="preserve">ESTIMATED</w:t>
+                  </w:r>
+                  <w:r>
+                    <w:rPr>
+                      <w:rFonts w:ascii="Calibri"/>
+                      <w:b/>
+                      <w:spacing w:val="-4"/>
+                      <w:sz w:val="18"/>
+                    </w:rPr>
+                    <w:t xml:space="preserve"> </w:t>
+                  </w:r>
+                  <w:r>
+                    <w:rPr>
+                      <w:rFonts w:ascii="Calibri"/>
+                      <w:b/>
+                      <w:spacing w:val="-2"/>
+                      <w:sz w:val="18"/>
+                    </w:rPr>
+                    <w:t xml:space="preserve">STRAND</w:t>
+                  </w:r>
+                  <w:r>
+                    <w:rPr>
+                      <w:rFonts w:ascii="Calibri"/>
+                      <w:b/>
+                      <w:sz w:val="18"/>
+                    </w:rPr>
+                  </w:r>
+                  <w:r>
+                    <w:rPr>
+                      <w:rFonts w:ascii="Calibri"/>
+                      <w:b/>
+                      <w:sz w:val="18"/>
+                    </w:rPr>
+                  </w:r>
+                </w:p>
+                <w:p>
+                  <w:pPr>
+                    <w:pStyle w:val="939"/>
+                    <w:pBdr/>
+                    <w:spacing w:before="1" w:line="199" w:lineRule="exact"/>
+                    <w:ind w:left="160"/>
+                    <w:rPr>
+                      <w:rFonts w:ascii="Calibri"/>
+                      <w:b/>
+                      <w:sz w:val="18"/>
+                    </w:rPr>
+                  </w:pPr>
+                  <w:r>
+                    <w:rPr>
+                      <w:rFonts w:ascii="Calibri"/>
+                      <w:b/>
+                      <w:sz w:val="18"/>
+                    </w:rPr>
+                    <w:t xml:space="preserve">CABLE</w:t>
+                  </w:r>
+                  <w:r>
+                    <w:rPr>
+                      <w:rFonts w:ascii="Calibri"/>
+                      <w:b/>
+                      <w:spacing w:val="-1"/>
+                      <w:sz w:val="18"/>
+                    </w:rPr>
+                    <w:t xml:space="preserve"> </w:t>
+                  </w:r>
+                  <w:r>
+                    <w:rPr>
+                      <w:rFonts w:ascii="Calibri"/>
+                      <w:b/>
+                      <w:sz w:val="18"/>
+                    </w:rPr>
+                    <w:t xml:space="preserve">LENGTH</w:t>
+                  </w:r>
+                  <w:r>
+                    <w:rPr>
+                      <w:rFonts w:ascii="Calibri"/>
+                      <w:b/>
+                      <w:spacing w:val="-2"/>
+                      <w:sz w:val="18"/>
+                    </w:rPr>
+                    <w:t xml:space="preserve"> </w:t>
+                  </w:r>
+                  <w:r>
+                    <w:rPr>
+                      <w:rFonts w:ascii="Calibri"/>
+                      <w:b/>
+                      <w:spacing w:val="-4"/>
+                      <w:sz w:val="18"/>
+                    </w:rPr>
+                    <w:t xml:space="preserve">(KM)</w:t>
+                  </w:r>
+                  <w:r>
+                    <w:rPr>
+                      <w:rFonts w:ascii="Calibri"/>
+                      <w:b/>
+                      <w:sz w:val="18"/>
+                    </w:rPr>
+                  </w:r>
+                  <w:r>
+                    <w:rPr>
+                      <w:rFonts w:ascii="Calibri"/>
+                      <w:b/>
+                      <w:sz w:val="18"/>
+                    </w:rPr>
+                  </w:r>
+                </w:p>
+              </w:tc>
+            </w:tr>
+            <w:tr>
+              <w:trPr>
+                <w:trHeight w:val="285"/>
+              </w:trPr>
+              <w:tc>
+                <w:tcPr>
+                  <w:tcBorders/>
+                  <w:tcW w:w="701" w:type="dxa"/>
+                </w:tcPr>
+                <w:p>
+                  <w:pPr>
+                    <w:pStyle w:val="939"/>
+                    <w:pBdr/>
+                    <w:spacing w:before="1"/>
+                    <w:ind w:right="39" w:left="49"/>
+                    <w:jc w:val="center"/>
+                    <w:rPr>
+                      <w:rFonts w:ascii="Calibri"/>
+                      <w:sz w:val="18"/>
+                    </w:rPr>
+                  </w:pPr>
+                  <w:r>
+                    <w:rPr>
+                      <w:rFonts w:ascii="Calibri"/>
+                      <w:sz w:val="18"/>
+                    </w:rPr>
+                  </w:r>
+                  <w:r>
+                    <w:rPr>
+                      <w:rFonts w:ascii="Calibri"/>
+                      <w:sz w:val="18"/>
+                    </w:rPr>
+                    <w:t xml:space="preserve">{#site_details}{sn}</w:t>
+                  </w:r>
+                  <w:r>
+                    <w:rPr>
+                      <w:rFonts w:ascii="Calibri"/>
+                      <w:sz w:val="18"/>
+                    </w:rPr>
+                  </w:r>
+                  <w:r>
+                    <w:rPr>
+                      <w:rFonts w:ascii="Calibri"/>
+                      <w:sz w:val="18"/>
+                    </w:rPr>
+                  </w:r>
+                </w:p>
+              </w:tc>
+              <w:tc>
+                <w:tcPr>
+                  <w:tcBorders/>
+                  <w:tcW w:w="1980" w:type="dxa"/>
+                </w:tcPr>
+                <w:p>
+                  <w:pPr>
+                    <w:pStyle w:val="939"/>
+                    <w:pBdr/>
+                    <w:spacing w:before="1"/>
+                    <w:ind w:left="108"/>
+                    <w:rPr>
+                      <w:rFonts w:ascii="Calibri"/>
+                      <w:sz w:val="18"/>
+                    </w:rPr>
+                  </w:pPr>
+                  <w:r>
+                    <w:rPr>
+                      <w:rFonts w:ascii="Calibri"/>
+                      <w:sz w:val="18"/>
+                    </w:rPr>
+                    <w:t xml:space="preserve">{region}</w:t>
+                  </w:r>
+                  <w:r>
+                    <w:rPr>
+                      <w:rFonts w:ascii="Calibri"/>
+                      <w:sz w:val="18"/>
+                    </w:rPr>
+                  </w:r>
+                  <w:r>
+                    <w:rPr>
+                      <w:rFonts w:ascii="Calibri"/>
+                      <w:sz w:val="18"/>
+                    </w:rPr>
+                  </w:r>
+                </w:p>
+              </w:tc>
+              <w:tc>
+                <w:tcPr>
+                  <w:tcBorders/>
+                  <w:tcW w:w="1220" w:type="dxa"/>
+                </w:tcPr>
+                <w:p>
+                  <w:pPr>
+                    <w:pStyle w:val="939"/>
+                    <w:pBdr/>
+                    <w:spacing w:before="1"/>
+                    <w:ind w:left="108"/>
+                    <w:rPr>
+                      <w:rFonts w:ascii="Calibri"/>
+                      <w:sz w:val="18"/>
+                    </w:rPr>
+                  </w:pPr>
+                  <w:r>
+                    <w:rPr>
+                      <w:rFonts w:ascii="Calibri"/>
+                      <w:sz w:val="18"/>
+                    </w:rPr>
+                    <w:t xml:space="preserve">{area}</w:t>
+                  </w:r>
+                  <w:r>
+                    <w:rPr>
+                      <w:rFonts w:ascii="Calibri"/>
+                      <w:sz w:val="18"/>
+                    </w:rPr>
+                  </w:r>
+                  <w:r>
+                    <w:rPr>
+                      <w:rFonts w:ascii="Calibri"/>
+                      <w:sz w:val="18"/>
+                    </w:rPr>
+                  </w:r>
+                </w:p>
+              </w:tc>
+              <w:tc>
+                <w:tcPr>
+                  <w:tcBorders/>
+                  <w:tcW w:w="1469" w:type="dxa"/>
+                </w:tcPr>
+                <w:p>
+                  <w:pPr>
+                    <w:pStyle w:val="939"/>
+                    <w:pBdr/>
+                    <w:spacing w:before="66" w:line="199" w:lineRule="exact"/>
+                    <w:ind w:right="96" w:left="0"/>
+                    <w:jc w:val="right"/>
+                    <w:rPr>
+                      <w:rFonts w:ascii="Calibri"/>
+                      <w:sz w:val="18"/>
+                    </w:rPr>
+                  </w:pPr>
+                  <w:r>
+                    <w:rPr>
+                      <w:rFonts w:ascii="Calibri"/>
+                      <w:sz w:val="18"/>
+                    </w:rPr>
+                    <w:t xml:space="preserve">{nodes}</w:t>
+                  </w:r>
+                  <w:r>
+                    <w:rPr>
+                      <w:rFonts w:ascii="Calibri"/>
+                      <w:sz w:val="18"/>
+                    </w:rPr>
+                  </w:r>
+                  <w:r>
+                    <w:rPr>
+                      <w:rFonts w:ascii="Calibri"/>
+                      <w:sz w:val="18"/>
+                    </w:rPr>
+                  </w:r>
+                </w:p>
+              </w:tc>
+              <w:tc>
+                <w:tcPr>
+                  <w:tcBorders/>
+                  <w:tcW w:w="1841" w:type="dxa"/>
+                </w:tcPr>
+                <w:p>
+                  <w:pPr>
+                    <w:pStyle w:val="939"/>
+                    <w:pBdr/>
+                    <w:spacing w:before="1"/>
+                    <w:ind w:right="96" w:left="0"/>
+                    <w:jc w:val="right"/>
+                    <w:rPr>
+                      <w:rFonts w:ascii="Calibri"/>
+                      <w:sz w:val="18"/>
+                    </w:rPr>
+                  </w:pPr>
+                  <w:r>
+                    <w:rPr>
+                      <w:rFonts w:ascii="Calibri"/>
+                      <w:sz w:val="18"/>
+                    </w:rPr>
+                    <w:t xml:space="preserve">{est_km}</w:t>
+                  </w:r>
+                  <w:r>
+                    <w:rPr>
+                      <w:rFonts w:ascii="Calibri"/>
+                      <w:sz w:val="18"/>
+                    </w:rPr>
+                    <w:t xml:space="preserve">{/site_details}</w:t>
+                  </w:r>
+                  <w:r>
+                    <w:rPr>
+                      <w:rFonts w:ascii="Calibri"/>
+                      <w:sz w:val="18"/>
+                    </w:rPr>
+                  </w:r>
+                  <w:r>
+                    <w:rPr>
+                      <w:rFonts w:ascii="Calibri"/>
+                      <w:sz w:val="18"/>
+                    </w:rPr>
+                  </w:r>
+                </w:p>
+              </w:tc>
+            </w:tr>
+            <w:tr>
+              <w:trPr>
+                <w:trHeight w:val="218"/>
+              </w:trPr>
+              <w:tc>
+                <w:tcPr>
+                  <w:gridSpan w:val="3"/>
+                  <w:tcBorders/>
+                  <w:tcW w:w="3901" w:type="dxa"/>
+                </w:tcPr>
+                <w:p>
+                  <w:pPr>
+                    <w:pStyle w:val="939"/>
+                    <w:pBdr/>
+                    <w:spacing w:line="198" w:lineRule="exact"/>
+                    <w:ind w:left="6"/>
+                    <w:jc w:val="center"/>
+                    <w:rPr>
+                      <w:rFonts w:ascii="Calibri"/>
+                      <w:b/>
+                      <w:sz w:val="18"/>
+                    </w:rPr>
+                  </w:pPr>
+                  <w:r>
+                    <w:rPr>
+                      <w:rFonts w:ascii="Calibri"/>
+                      <w:b/>
+                      <w:spacing w:val="-2"/>
+                      <w:sz w:val="18"/>
+                    </w:rPr>
+                    <w:t xml:space="preserve">TOTAL</w:t>
+                  </w:r>
+                  <w:r>
+                    <w:rPr>
+                      <w:rFonts w:ascii="Calibri"/>
+                      <w:b/>
+                      <w:sz w:val="18"/>
+                    </w:rPr>
+                  </w:r>
+                  <w:r>
+                    <w:rPr>
+                      <w:rFonts w:ascii="Calibri"/>
+                      <w:b/>
+                      <w:sz w:val="18"/>
+                    </w:rPr>
+                  </w:r>
+                </w:p>
+              </w:tc>
+              <w:tc>
+                <w:tcPr>
+                  <w:tcBorders/>
+                  <w:tcW w:w="1469" w:type="dxa"/>
+                </w:tcPr>
+                <w:p>
+                  <w:pPr>
+                    <w:pStyle w:val="939"/>
+                    <w:pBdr/>
+                    <w:spacing w:line="198" w:lineRule="exact"/>
+                    <w:ind w:right="96" w:left="0"/>
+                    <w:jc w:val="right"/>
+                    <w:rPr>
+                      <w:rFonts w:ascii="Calibri"/>
+                      <w:b/>
+                      <w:sz w:val="18"/>
+                    </w:rPr>
+                  </w:pPr>
+                  <w:r>
+                    <w:rPr>
+                      <w:rFonts w:ascii="Calibri"/>
+                      <w:b/>
+                      <w:sz w:val="18"/>
+                    </w:rPr>
+                    <w:t xml:space="preserve">{total_nodes}</w:t>
+                  </w:r>
+                  <w:r>
+                    <w:rPr>
+                      <w:rFonts w:ascii="Calibri"/>
+                      <w:b/>
+                      <w:sz w:val="18"/>
+                    </w:rPr>
+                  </w:r>
+                  <w:r>
+                    <w:rPr>
+                      <w:rFonts w:ascii="Calibri"/>
+                      <w:b/>
+                      <w:sz w:val="18"/>
+                    </w:rPr>
+                  </w:r>
+                </w:p>
+              </w:tc>
+              <w:tc>
+                <w:tcPr>
+                  <w:tcBorders/>
+                  <w:tcW w:w="1841" w:type="dxa"/>
+                </w:tcPr>
+                <w:p>
+                  <w:pPr>
+                    <w:pStyle w:val="939"/>
+                    <w:pBdr/>
+                    <w:spacing w:line="198" w:lineRule="exact"/>
+                    <w:ind w:right="96" w:left="0"/>
+                    <w:jc w:val="right"/>
+                    <w:rPr>
+                      <w:rFonts w:ascii="Calibri"/>
+                      <w:b/>
+                      <w:sz w:val="18"/>
+                    </w:rPr>
+                  </w:pPr>
+                  <w:r>
+                    <w:rPr>
+                      <w:rFonts w:ascii="Calibri"/>
+                      <w:b/>
+                      <w:sz w:val="18"/>
+                    </w:rPr>
+                    <w:t xml:space="preserve">{total_cable}</w:t>
+                  </w:r>
+                  <w:r>
+                    <w:rPr>
+                      <w:rFonts w:ascii="Calibri"/>
+                      <w:b/>
+                      <w:sz w:val="18"/>
+                    </w:rPr>
+                  </w:r>
+                  <w:r>
+                    <w:rPr>
+                      <w:rFonts w:ascii="Calibri"/>
+                      <w:b/>
+                      <w:sz w:val="18"/>
+                    </w:rPr>
+                  </w:r>
+                </w:p>
+              </w:tc>
+            </w:tr>
+          </w:tbl>
         </w:tc>
       </w:tr>
       <w:tr>

</xml_diff>

<commit_message>
fix(docx): render site details as real PO form rows directly under SUMMARY
</commit_message>
<xml_diff>
--- a/public/templates/PO_TEMPLATE_ORIGINAL.docx
+++ b/public/templates/PO_TEMPLATE_ORIGINAL.docx
@@ -13094,701 +13094,392 @@
               </w:rPr>
             </w:r>
           </w:p>
-          <w:tbl>
-            <w:tblPr>
-              <w:tblInd w:w="65" w:type="dxa"/>
-              <w:tblW w:w="0" w:type="auto"/>
-              <w:tblCellMar>
-                <w:left w:w="0" w:type="dxa"/>
-                <w:right w:w="0" w:type="dxa"/>
-              </w:tblCellMar>
-              <w:tblBorders>
-                <w:top w:val="single" w:color="000000" w:sz="4" w:space="0"/>
-                <w:left w:val="single" w:color="000000" w:sz="4" w:space="0"/>
-                <w:bottom w:val="single" w:color="000000" w:sz="4" w:space="0"/>
-                <w:right w:val="single" w:color="000000" w:sz="4" w:space="0"/>
-                <w:insideH w:val="single" w:color="000000" w:sz="4" w:space="0"/>
-                <w:insideV w:val="single" w:color="000000" w:sz="4" w:space="0"/>
-              </w:tblBorders>
-              <w:tblLayout w:type="fixed"/>
-              <w:tblLook w:val="01E0" w:firstRow="1" w:lastRow="1" w:firstColumn="1" w:lastColumn="1" w:noHBand="0" w:noVBand="0"/>
-            </w:tblPr>
-            <w:tblGrid>
-              <w:gridCol w:w="701"/>
-              <w:gridCol w:w="1980"/>
-              <w:gridCol w:w="1220"/>
-              <w:gridCol w:w="1469"/>
-              <w:gridCol w:w="1841"/>
-            </w:tblGrid>
-            <w:tr>
-              <w:trPr>
-                <w:trHeight w:val="438"/>
-              </w:trPr>
-              <w:tc>
-                <w:tcPr>
-                  <w:tcBorders/>
-                  <w:tcW w:w="701" w:type="dxa"/>
-                </w:tcPr>
-                <w:p>
-                  <w:pPr>
-                    <w:pStyle w:val="939"/>
-                    <w:pBdr/>
-                    <w:spacing w:line="219" w:lineRule="exact"/>
-                    <w:ind w:left="49"/>
-                    <w:jc w:val="center"/>
-                    <w:rPr>
-                      <w:rFonts w:ascii="Calibri"/>
-                      <w:b/>
-                      <w:sz w:val="18"/>
-                    </w:rPr>
-                  </w:pPr>
-                  <w:r>
-                    <w:rPr>
-                      <w:rFonts w:ascii="Calibri"/>
-                      <w:b/>
-                      <w:spacing w:val="-5"/>
-                      <w:sz w:val="18"/>
-                    </w:rPr>
-                    <w:t xml:space="preserve">S/N</w:t>
-                  </w:r>
-                  <w:r>
-                    <w:rPr>
-                      <w:rFonts w:ascii="Calibri"/>
-                      <w:b/>
-                      <w:sz w:val="18"/>
-                    </w:rPr>
-                  </w:r>
-                  <w:r>
-                    <w:rPr>
-                      <w:rFonts w:ascii="Calibri"/>
-                      <w:b/>
-                      <w:sz w:val="18"/>
-                    </w:rPr>
-                  </w:r>
-                </w:p>
-              </w:tc>
-              <w:tc>
-                <w:tcPr>
-                  <w:tcBorders/>
-                  <w:tcW w:w="1980" w:type="dxa"/>
-                </w:tcPr>
-                <w:p>
-                  <w:pPr>
-                    <w:pStyle w:val="939"/>
-                    <w:pBdr/>
-                    <w:spacing w:line="219" w:lineRule="exact"/>
-                    <w:ind w:left="10"/>
-                    <w:jc w:val="center"/>
-                    <w:rPr>
-                      <w:rFonts w:ascii="Calibri"/>
-                      <w:b/>
-                      <w:sz w:val="18"/>
-                    </w:rPr>
-                  </w:pPr>
-                  <w:r>
-                    <w:rPr>
-                      <w:rFonts w:ascii="Calibri"/>
-                      <w:b/>
-                      <w:spacing w:val="-2"/>
-                      <w:sz w:val="18"/>
-                    </w:rPr>
-                    <w:t xml:space="preserve">REGION</w:t>
-                  </w:r>
-                  <w:r>
-                    <w:rPr>
-                      <w:rFonts w:ascii="Calibri"/>
-                      <w:b/>
-                      <w:sz w:val="18"/>
-                    </w:rPr>
-                  </w:r>
-                  <w:r>
-                    <w:rPr>
-                      <w:rFonts w:ascii="Calibri"/>
-                      <w:b/>
-                      <w:sz w:val="18"/>
-                    </w:rPr>
-                  </w:r>
-                </w:p>
-              </w:tc>
-              <w:tc>
-                <w:tcPr>
-                  <w:tcBorders/>
-                  <w:tcW w:w="1220" w:type="dxa"/>
-                </w:tcPr>
-                <w:p>
-                  <w:pPr>
-                    <w:pStyle w:val="939"/>
-                    <w:pBdr/>
-                    <w:spacing w:line="219" w:lineRule="exact"/>
-                    <w:ind w:left="204"/>
-                    <w:rPr>
-                      <w:rFonts w:ascii="Calibri"/>
-                      <w:b/>
-                      <w:sz w:val="18"/>
-                    </w:rPr>
-                  </w:pPr>
-                  <w:r>
-                    <w:rPr>
-                      <w:rFonts w:ascii="Calibri"/>
-                      <w:b/>
-                      <w:spacing w:val="-2"/>
-                      <w:sz w:val="18"/>
-                    </w:rPr>
-                    <w:t xml:space="preserve">AREA/CITY</w:t>
-                  </w:r>
-                  <w:r>
-                    <w:rPr>
-                      <w:rFonts w:ascii="Calibri"/>
-                      <w:b/>
-                      <w:sz w:val="18"/>
-                    </w:rPr>
-                  </w:r>
-                  <w:r>
-                    <w:rPr>
-                      <w:rFonts w:ascii="Calibri"/>
-                      <w:b/>
-                      <w:sz w:val="18"/>
-                    </w:rPr>
-                  </w:r>
-                </w:p>
-              </w:tc>
-              <w:tc>
-                <w:tcPr>
-                  <w:tcBorders/>
-                  <w:tcW w:w="1469" w:type="dxa"/>
-                </w:tcPr>
-                <w:p>
-                  <w:pPr>
-                    <w:pStyle w:val="939"/>
-                    <w:pBdr/>
-                    <w:spacing w:line="219" w:lineRule="exact"/>
-                    <w:ind w:left="206"/>
-                    <w:rPr>
-                      <w:rFonts w:ascii="Calibri"/>
-                      <w:b/>
-                      <w:sz w:val="18"/>
-                    </w:rPr>
-                  </w:pPr>
-                  <w:r>
-                    <w:rPr>
-                      <w:rFonts w:ascii="Calibri"/>
-                      <w:b/>
-                      <w:sz w:val="18"/>
-                    </w:rPr>
-                    <w:t xml:space="preserve">NO</w:t>
-                  </w:r>
-                  <w:r>
-                    <w:rPr>
-                      <w:rFonts w:ascii="Calibri"/>
-                      <w:b/>
-                      <w:spacing w:val="-2"/>
-                      <w:sz w:val="18"/>
-                    </w:rPr>
-                    <w:t xml:space="preserve"> </w:t>
-                  </w:r>
-                  <w:r>
-                    <w:rPr>
-                      <w:rFonts w:ascii="Calibri"/>
-                      <w:b/>
-                      <w:sz w:val="18"/>
-                    </w:rPr>
-                    <w:t xml:space="preserve">OF</w:t>
-                  </w:r>
-                  <w:r>
-                    <w:rPr>
-                      <w:rFonts w:ascii="Calibri"/>
-                      <w:b/>
-                      <w:spacing w:val="-2"/>
-                      <w:sz w:val="18"/>
-                    </w:rPr>
-                    <w:t xml:space="preserve"> NODES</w:t>
-                  </w:r>
-                  <w:r>
-                    <w:rPr>
-                      <w:rFonts w:ascii="Calibri"/>
-                      <w:b/>
-                      <w:sz w:val="18"/>
-                    </w:rPr>
-                  </w:r>
-                  <w:r>
-                    <w:rPr>
-                      <w:rFonts w:ascii="Calibri"/>
-                      <w:b/>
-                      <w:sz w:val="18"/>
-                    </w:rPr>
-                  </w:r>
-                </w:p>
-              </w:tc>
-              <w:tc>
-                <w:tcPr>
-                  <w:tcBorders/>
-                  <w:tcW w:w="1841" w:type="dxa"/>
-                </w:tcPr>
-                <w:p>
-                  <w:pPr>
-                    <w:pStyle w:val="939"/>
-                    <w:pBdr/>
-                    <w:spacing w:line="219" w:lineRule="exact"/>
-                    <w:ind w:left="158"/>
-                    <w:rPr>
-                      <w:rFonts w:ascii="Calibri"/>
-                      <w:b/>
-                      <w:sz w:val="18"/>
-                    </w:rPr>
-                  </w:pPr>
-                  <w:r>
-                    <w:rPr>
-                      <w:rFonts w:ascii="Calibri"/>
-                      <w:b/>
-                      <w:sz w:val="18"/>
-                    </w:rPr>
-                    <w:t xml:space="preserve">ESTIMATED</w:t>
-                  </w:r>
-                  <w:r>
-                    <w:rPr>
-                      <w:rFonts w:ascii="Calibri"/>
-                      <w:b/>
-                      <w:spacing w:val="-4"/>
-                      <w:sz w:val="18"/>
-                    </w:rPr>
-                    <w:t xml:space="preserve"> </w:t>
-                  </w:r>
-                  <w:r>
-                    <w:rPr>
-                      <w:rFonts w:ascii="Calibri"/>
-                      <w:b/>
-                      <w:spacing w:val="-2"/>
-                      <w:sz w:val="18"/>
-                    </w:rPr>
-                    <w:t xml:space="preserve">STRAND</w:t>
-                  </w:r>
-                  <w:r>
-                    <w:rPr>
-                      <w:rFonts w:ascii="Calibri"/>
-                      <w:b/>
-                      <w:sz w:val="18"/>
-                    </w:rPr>
-                  </w:r>
-                  <w:r>
-                    <w:rPr>
-                      <w:rFonts w:ascii="Calibri"/>
-                      <w:b/>
-                      <w:sz w:val="18"/>
-                    </w:rPr>
-                  </w:r>
-                </w:p>
-                <w:p>
-                  <w:pPr>
-                    <w:pStyle w:val="939"/>
-                    <w:pBdr/>
-                    <w:spacing w:before="1" w:line="199" w:lineRule="exact"/>
-                    <w:ind w:left="160"/>
-                    <w:rPr>
-                      <w:rFonts w:ascii="Calibri"/>
-                      <w:b/>
-                      <w:sz w:val="18"/>
-                    </w:rPr>
-                  </w:pPr>
-                  <w:r>
-                    <w:rPr>
-                      <w:rFonts w:ascii="Calibri"/>
-                      <w:b/>
-                      <w:sz w:val="18"/>
-                    </w:rPr>
-                    <w:t xml:space="preserve">CABLE</w:t>
-                  </w:r>
-                  <w:r>
-                    <w:rPr>
-                      <w:rFonts w:ascii="Calibri"/>
-                      <w:b/>
-                      <w:spacing w:val="-1"/>
-                      <w:sz w:val="18"/>
-                    </w:rPr>
-                    <w:t xml:space="preserve"> </w:t>
-                  </w:r>
-                  <w:r>
-                    <w:rPr>
-                      <w:rFonts w:ascii="Calibri"/>
-                      <w:b/>
-                      <w:sz w:val="18"/>
-                    </w:rPr>
-                    <w:t xml:space="preserve">LENGTH</w:t>
-                  </w:r>
-                  <w:r>
-                    <w:rPr>
-                      <w:rFonts w:ascii="Calibri"/>
-                      <w:b/>
-                      <w:spacing w:val="-2"/>
-                      <w:sz w:val="18"/>
-                    </w:rPr>
-                    <w:t xml:space="preserve"> </w:t>
-                  </w:r>
-                  <w:r>
-                    <w:rPr>
-                      <w:rFonts w:ascii="Calibri"/>
-                      <w:b/>
-                      <w:spacing w:val="-4"/>
-                      <w:sz w:val="18"/>
-                    </w:rPr>
-                    <w:t xml:space="preserve">(KM)</w:t>
-                  </w:r>
-                  <w:r>
-                    <w:rPr>
-                      <w:rFonts w:ascii="Calibri"/>
-                      <w:b/>
-                      <w:sz w:val="18"/>
-                    </w:rPr>
-                  </w:r>
-                  <w:r>
-                    <w:rPr>
-                      <w:rFonts w:ascii="Calibri"/>
-                      <w:b/>
-                      <w:sz w:val="18"/>
-                    </w:rPr>
-                  </w:r>
-                </w:p>
-              </w:tc>
-            </w:tr>
-            <w:tr>
-              <w:trPr>
-                <w:trHeight w:val="285"/>
-              </w:trPr>
-              <w:tc>
-                <w:tcPr>
-                  <w:tcBorders/>
-                  <w:tcW w:w="701" w:type="dxa"/>
-                </w:tcPr>
-                <w:p>
-                  <w:pPr>
-                    <w:pStyle w:val="939"/>
-                    <w:pBdr/>
-                    <w:spacing w:before="1"/>
-                    <w:ind w:right="39" w:left="49"/>
-                    <w:jc w:val="center"/>
-                    <w:rPr>
-                      <w:rFonts w:ascii="Calibri"/>
-                      <w:sz w:val="18"/>
-                    </w:rPr>
-                  </w:pPr>
-                  <w:r>
-                    <w:rPr>
-                      <w:rFonts w:ascii="Calibri"/>
-                      <w:sz w:val="18"/>
-                    </w:rPr>
-                  </w:r>
-                  <w:r>
-                    <w:rPr>
-                      <w:rFonts w:ascii="Calibri"/>
-                      <w:sz w:val="18"/>
-                    </w:rPr>
-                    <w:t xml:space="preserve">{#site_details}{sn}</w:t>
-                  </w:r>
-                  <w:r>
-                    <w:rPr>
-                      <w:rFonts w:ascii="Calibri"/>
-                      <w:sz w:val="18"/>
-                    </w:rPr>
-                  </w:r>
-                  <w:r>
-                    <w:rPr>
-                      <w:rFonts w:ascii="Calibri"/>
-                      <w:sz w:val="18"/>
-                    </w:rPr>
-                  </w:r>
-                </w:p>
-              </w:tc>
-              <w:tc>
-                <w:tcPr>
-                  <w:tcBorders/>
-                  <w:tcW w:w="1980" w:type="dxa"/>
-                </w:tcPr>
-                <w:p>
-                  <w:pPr>
-                    <w:pStyle w:val="939"/>
-                    <w:pBdr/>
-                    <w:spacing w:before="1"/>
-                    <w:ind w:left="108"/>
-                    <w:rPr>
-                      <w:rFonts w:ascii="Calibri"/>
-                      <w:sz w:val="18"/>
-                    </w:rPr>
-                  </w:pPr>
-                  <w:r>
-                    <w:rPr>
-                      <w:rFonts w:ascii="Calibri"/>
-                      <w:sz w:val="18"/>
-                    </w:rPr>
-                    <w:t xml:space="preserve">{region}</w:t>
-                  </w:r>
-                  <w:r>
-                    <w:rPr>
-                      <w:rFonts w:ascii="Calibri"/>
-                      <w:sz w:val="18"/>
-                    </w:rPr>
-                  </w:r>
-                  <w:r>
-                    <w:rPr>
-                      <w:rFonts w:ascii="Calibri"/>
-                      <w:sz w:val="18"/>
-                    </w:rPr>
-                  </w:r>
-                </w:p>
-              </w:tc>
-              <w:tc>
-                <w:tcPr>
-                  <w:tcBorders/>
-                  <w:tcW w:w="1220" w:type="dxa"/>
-                </w:tcPr>
-                <w:p>
-                  <w:pPr>
-                    <w:pStyle w:val="939"/>
-                    <w:pBdr/>
-                    <w:spacing w:before="1"/>
-                    <w:ind w:left="108"/>
-                    <w:rPr>
-                      <w:rFonts w:ascii="Calibri"/>
-                      <w:sz w:val="18"/>
-                    </w:rPr>
-                  </w:pPr>
-                  <w:r>
-                    <w:rPr>
-                      <w:rFonts w:ascii="Calibri"/>
-                      <w:sz w:val="18"/>
-                    </w:rPr>
-                    <w:t xml:space="preserve">{area}</w:t>
-                  </w:r>
-                  <w:r>
-                    <w:rPr>
-                      <w:rFonts w:ascii="Calibri"/>
-                      <w:sz w:val="18"/>
-                    </w:rPr>
-                  </w:r>
-                  <w:r>
-                    <w:rPr>
-                      <w:rFonts w:ascii="Calibri"/>
-                      <w:sz w:val="18"/>
-                    </w:rPr>
-                  </w:r>
-                </w:p>
-              </w:tc>
-              <w:tc>
-                <w:tcPr>
-                  <w:tcBorders/>
-                  <w:tcW w:w="1469" w:type="dxa"/>
-                </w:tcPr>
-                <w:p>
-                  <w:pPr>
-                    <w:pStyle w:val="939"/>
-                    <w:pBdr/>
-                    <w:spacing w:before="66" w:line="199" w:lineRule="exact"/>
-                    <w:ind w:right="96" w:left="0"/>
-                    <w:jc w:val="right"/>
-                    <w:rPr>
-                      <w:rFonts w:ascii="Calibri"/>
-                      <w:sz w:val="18"/>
-                    </w:rPr>
-                  </w:pPr>
-                  <w:r>
-                    <w:rPr>
-                      <w:rFonts w:ascii="Calibri"/>
-                      <w:sz w:val="18"/>
-                    </w:rPr>
-                    <w:t xml:space="preserve">{nodes}</w:t>
-                  </w:r>
-                  <w:r>
-                    <w:rPr>
-                      <w:rFonts w:ascii="Calibri"/>
-                      <w:sz w:val="18"/>
-                    </w:rPr>
-                  </w:r>
-                  <w:r>
-                    <w:rPr>
-                      <w:rFonts w:ascii="Calibri"/>
-                      <w:sz w:val="18"/>
-                    </w:rPr>
-                  </w:r>
-                </w:p>
-              </w:tc>
-              <w:tc>
-                <w:tcPr>
-                  <w:tcBorders/>
-                  <w:tcW w:w="1841" w:type="dxa"/>
-                </w:tcPr>
-                <w:p>
-                  <w:pPr>
-                    <w:pStyle w:val="939"/>
-                    <w:pBdr/>
-                    <w:spacing w:before="1"/>
-                    <w:ind w:right="96" w:left="0"/>
-                    <w:jc w:val="right"/>
-                    <w:rPr>
-                      <w:rFonts w:ascii="Calibri"/>
-                      <w:sz w:val="18"/>
-                    </w:rPr>
-                  </w:pPr>
-                  <w:r>
-                    <w:rPr>
-                      <w:rFonts w:ascii="Calibri"/>
-                      <w:sz w:val="18"/>
-                    </w:rPr>
-                    <w:t xml:space="preserve">{est_km}</w:t>
-                  </w:r>
-                  <w:r>
-                    <w:rPr>
-                      <w:rFonts w:ascii="Calibri"/>
-                      <w:sz w:val="18"/>
-                    </w:rPr>
-                    <w:t xml:space="preserve">{/site_details}</w:t>
-                  </w:r>
-                  <w:r>
-                    <w:rPr>
-                      <w:rFonts w:ascii="Calibri"/>
-                      <w:sz w:val="18"/>
-                    </w:rPr>
-                  </w:r>
-                  <w:r>
-                    <w:rPr>
-                      <w:rFonts w:ascii="Calibri"/>
-                      <w:sz w:val="18"/>
-                    </w:rPr>
-                  </w:r>
-                </w:p>
-              </w:tc>
-            </w:tr>
-            <w:tr>
-              <w:trPr>
-                <w:trHeight w:val="218"/>
-              </w:trPr>
-              <w:tc>
-                <w:tcPr>
-                  <w:gridSpan w:val="3"/>
-                  <w:tcBorders/>
-                  <w:tcW w:w="3901" w:type="dxa"/>
-                </w:tcPr>
-                <w:p>
-                  <w:pPr>
-                    <w:pStyle w:val="939"/>
-                    <w:pBdr/>
-                    <w:spacing w:line="198" w:lineRule="exact"/>
-                    <w:ind w:left="6"/>
-                    <w:jc w:val="center"/>
-                    <w:rPr>
-                      <w:rFonts w:ascii="Calibri"/>
-                      <w:b/>
-                      <w:sz w:val="18"/>
-                    </w:rPr>
-                  </w:pPr>
-                  <w:r>
-                    <w:rPr>
-                      <w:rFonts w:ascii="Calibri"/>
-                      <w:b/>
-                      <w:spacing w:val="-2"/>
-                      <w:sz w:val="18"/>
-                    </w:rPr>
-                    <w:t xml:space="preserve">TOTAL</w:t>
-                  </w:r>
-                  <w:r>
-                    <w:rPr>
-                      <w:rFonts w:ascii="Calibri"/>
-                      <w:b/>
-                      <w:sz w:val="18"/>
-                    </w:rPr>
-                  </w:r>
-                  <w:r>
-                    <w:rPr>
-                      <w:rFonts w:ascii="Calibri"/>
-                      <w:b/>
-                      <w:sz w:val="18"/>
-                    </w:rPr>
-                  </w:r>
-                </w:p>
-              </w:tc>
-              <w:tc>
-                <w:tcPr>
-                  <w:tcBorders/>
-                  <w:tcW w:w="1469" w:type="dxa"/>
-                </w:tcPr>
-                <w:p>
-                  <w:pPr>
-                    <w:pStyle w:val="939"/>
-                    <w:pBdr/>
-                    <w:spacing w:line="198" w:lineRule="exact"/>
-                    <w:ind w:right="96" w:left="0"/>
-                    <w:jc w:val="right"/>
-                    <w:rPr>
-                      <w:rFonts w:ascii="Calibri"/>
-                      <w:b/>
-                      <w:sz w:val="18"/>
-                    </w:rPr>
-                  </w:pPr>
-                  <w:r>
-                    <w:rPr>
-                      <w:rFonts w:ascii="Calibri"/>
-                      <w:b/>
-                      <w:sz w:val="18"/>
-                    </w:rPr>
-                    <w:t xml:space="preserve">{total_nodes}</w:t>
-                  </w:r>
-                  <w:r>
-                    <w:rPr>
-                      <w:rFonts w:ascii="Calibri"/>
-                      <w:b/>
-                      <w:sz w:val="18"/>
-                    </w:rPr>
-                  </w:r>
-                  <w:r>
-                    <w:rPr>
-                      <w:rFonts w:ascii="Calibri"/>
-                      <w:b/>
-                      <w:sz w:val="18"/>
-                    </w:rPr>
-                  </w:r>
-                </w:p>
-              </w:tc>
-              <w:tc>
-                <w:tcPr>
-                  <w:tcBorders/>
-                  <w:tcW w:w="1841" w:type="dxa"/>
-                </w:tcPr>
-                <w:p>
-                  <w:pPr>
-                    <w:pStyle w:val="939"/>
-                    <w:pBdr/>
-                    <w:spacing w:line="198" w:lineRule="exact"/>
-                    <w:ind w:right="96" w:left="0"/>
-                    <w:jc w:val="right"/>
-                    <w:rPr>
-                      <w:rFonts w:ascii="Calibri"/>
-                      <w:b/>
-                      <w:sz w:val="18"/>
-                    </w:rPr>
-                  </w:pPr>
-                  <w:r>
-                    <w:rPr>
-                      <w:rFonts w:ascii="Calibri"/>
-                      <w:b/>
-                      <w:sz w:val="18"/>
-                    </w:rPr>
-                    <w:t xml:space="preserve">{total_cable}</w:t>
-                  </w:r>
-                  <w:r>
-                    <w:rPr>
-                      <w:rFonts w:ascii="Calibri"/>
-                      <w:b/>
-                      <w:sz w:val="18"/>
-                    </w:rPr>
-                  </w:r>
-                  <w:r>
-                    <w:rPr>
-                      <w:rFonts w:ascii="Calibri"/>
-                      <w:b/>
-                      <w:sz w:val="18"/>
-                    </w:rPr>
-                  </w:r>
-                </w:p>
-              </w:tc>
-            </w:tr>
-          </w:tbl>
+        </w:tc>
+      </w:tr>
+      <w:tr>
+        <w:trPr>
+          <w:trHeight w:val="438"/>
+        </w:trPr>
+        <w:tc>
+          <w:tcPr>
+            <w:tcBorders/>
+            <w:tcW w:w="3683" w:type="dxa"/>
+          </w:tcPr>
+          <w:p>
+            <w:pPr>
+              <w:pStyle w:val="939"/>
+              <w:pBdr/>
+              <w:spacing w:line="219" w:lineRule="exact"/>
+              <w:ind w:left="49"/>
+              <w:jc w:val="center"/>
+              <w:rPr>
+                <w:rFonts w:ascii="Calibri"/>
+                <w:b/>
+                <w:sz w:val="18"/>
+              </w:rPr>
+            </w:pPr>
+            <w:r>
+              <w:rPr>
+                <w:rFonts w:ascii="Calibri"/>
+                <w:b/>
+                <w:spacing w:val="-5"/>
+                <w:sz w:val="18"/>
+              </w:rPr>
+              <w:t xml:space="preserve">S/N</w:t>
+            </w:r>
+          </w:p>
+          <w:p>
+            <w:pPr>
+              <w:pStyle w:val="939"/>
+              <w:pBdr/>
+              <w:spacing w:line="219" w:lineRule="exact"/>
+              <w:ind w:left="49"/>
+              <w:jc w:val="center"/>
+              <w:rPr>
+                <w:rFonts w:ascii="Calibri"/>
+                <w:b/>
+                <w:sz w:val="18"/>
+              </w:rPr>
+            </w:pPr>
+            <w:r>
+              <w:rPr>
+                <w:rFonts w:ascii="Calibri"/>
+                <w:b/>
+                <w:spacing w:val="-5"/>
+                <w:sz w:val="18"/>
+              </w:rPr>
+              <w:t xml:space="preserve">REGION</w:t>
+            </w:r>
+          </w:p>
+        </w:tc>
+        <w:tc>
+          <w:tcPr>
+            <w:tcBorders/>
+            <w:tcW w:w="1277" w:type="dxa"/>
+          </w:tcPr>
+          <w:p>
+            <w:pPr>
+              <w:pStyle w:val="939"/>
+              <w:pBdr/>
+              <w:spacing w:line="219" w:lineRule="exact"/>
+              <w:ind w:left="204"/>
+              <w:jc w:val="center"/>
+              <w:rPr>
+                <w:rFonts w:ascii="Calibri"/>
+                <w:b/>
+                <w:sz w:val="18"/>
+              </w:rPr>
+            </w:pPr>
+            <w:r>
+              <w:rPr>
+                <w:rFonts w:ascii="Calibri"/>
+                <w:b/>
+                <w:spacing w:val="-5"/>
+                <w:sz w:val="18"/>
+              </w:rPr>
+              <w:t xml:space="preserve">AREA/CITY</w:t>
+            </w:r>
+          </w:p>
+        </w:tc>
+        <w:tc>
+          <w:tcPr>
+            <w:tcBorders/>
+            <w:tcW w:w="2413" w:type="dxa"/>
+          </w:tcPr>
+          <w:p>
+            <w:pPr>
+              <w:pStyle w:val="939"/>
+              <w:pBdr/>
+              <w:spacing w:line="219" w:lineRule="exact"/>
+              <w:ind w:left="206"/>
+              <w:jc w:val="center"/>
+              <w:rPr>
+                <w:rFonts w:ascii="Calibri"/>
+                <w:b/>
+                <w:sz w:val="18"/>
+              </w:rPr>
+            </w:pPr>
+            <w:r>
+              <w:rPr>
+                <w:rFonts w:ascii="Calibri"/>
+                <w:b/>
+                <w:spacing w:val="-5"/>
+                <w:sz w:val="18"/>
+              </w:rPr>
+              <w:t xml:space="preserve">NO OF NODES</w:t>
+            </w:r>
+          </w:p>
+        </w:tc>
+        <w:tc>
+          <w:tcPr>
+            <w:tcBorders/>
+            <w:tcW w:w="3541" w:type="dxa"/>
+          </w:tcPr>
+          <w:p>
+            <w:pPr>
+              <w:pStyle w:val="939"/>
+              <w:pBdr/>
+              <w:spacing w:line="219" w:lineRule="exact"/>
+              <w:ind w:left="158"/>
+              <w:jc w:val="center"/>
+              <w:rPr>
+                <w:rFonts w:ascii="Calibri"/>
+                <w:b/>
+                <w:sz w:val="18"/>
+              </w:rPr>
+            </w:pPr>
+            <w:r>
+              <w:rPr>
+                <w:rFonts w:ascii="Calibri"/>
+                <w:b/>
+                <w:spacing w:val="-5"/>
+                <w:sz w:val="18"/>
+              </w:rPr>
+              <w:t xml:space="preserve">ESTIMATED STRAND</w:t>
+            </w:r>
+          </w:p>
+          <w:p>
+            <w:pPr>
+              <w:pStyle w:val="939"/>
+              <w:pBdr/>
+              <w:spacing w:line="199" w:lineRule="exact"/>
+              <w:ind w:left="160"/>
+              <w:jc w:val="center"/>
+              <w:rPr>
+                <w:rFonts w:ascii="Calibri"/>
+                <w:b/>
+                <w:sz w:val="18"/>
+              </w:rPr>
+            </w:pPr>
+            <w:r>
+              <w:rPr>
+                <w:rFonts w:ascii="Calibri"/>
+                <w:b/>
+                <w:spacing w:val="-5"/>
+                <w:sz w:val="18"/>
+              </w:rPr>
+              <w:t xml:space="preserve">CABLE LENGTH (KM)</w:t>
+            </w:r>
+          </w:p>
+        </w:tc>
+      </w:tr>
+      <w:tr>
+        <w:trPr>
+          <w:trHeight w:val="285"/>
+        </w:trPr>
+        <w:tc>
+          <w:tcPr>
+            <w:tcBorders/>
+            <w:tcW w:w="3683" w:type="dxa"/>
+          </w:tcPr>
+          <w:p>
+            <w:pPr>
+              <w:pStyle w:val="939"/>
+              <w:pBdr/>
+              <w:spacing w:before="1"/>
+              <w:ind w:right="96" w:left="108"/>
+              <w:jc w:val="center"/>
+              <w:rPr>
+                <w:rFonts w:ascii="Calibri"/>
+                <w:sz w:val="18"/>
+              </w:rPr>
+            </w:pPr>
+            <w:r>
+              <w:rPr>
+                <w:rFonts w:ascii="Calibri"/>
+                <w:sz w:val="18"/>
+              </w:rPr>
+              <w:t xml:space="preserve">{#site_details}{sn} {region}</w:t>
+            </w:r>
+          </w:p>
+        </w:tc>
+        <w:tc>
+          <w:tcPr>
+            <w:tcBorders/>
+            <w:tcW w:w="1277" w:type="dxa"/>
+          </w:tcPr>
+          <w:p>
+            <w:pPr>
+              <w:pStyle w:val="939"/>
+              <w:pBdr/>
+              <w:spacing w:before="1"/>
+              <w:ind w:right="96" w:left="0"/>
+              <w:jc w:val="center"/>
+              <w:rPr>
+                <w:rFonts w:ascii="Calibri"/>
+                <w:sz w:val="18"/>
+              </w:rPr>
+            </w:pPr>
+            <w:r>
+              <w:rPr>
+                <w:rFonts w:ascii="Calibri"/>
+                <w:sz w:val="18"/>
+              </w:rPr>
+              <w:t xml:space="preserve">{area}</w:t>
+            </w:r>
+          </w:p>
+        </w:tc>
+        <w:tc>
+          <w:tcPr>
+            <w:tcBorders/>
+            <w:tcW w:w="2413" w:type="dxa"/>
+          </w:tcPr>
+          <w:p>
+            <w:pPr>
+              <w:pStyle w:val="939"/>
+              <w:pBdr/>
+              <w:spacing w:before="1"/>
+              <w:ind w:right="96" w:left="0"/>
+              <w:jc w:val="right"/>
+              <w:rPr>
+                <w:rFonts w:ascii="Calibri"/>
+                <w:sz w:val="18"/>
+              </w:rPr>
+            </w:pPr>
+            <w:r>
+              <w:rPr>
+                <w:rFonts w:ascii="Calibri"/>
+                <w:sz w:val="18"/>
+              </w:rPr>
+              <w:t xml:space="preserve">{nodes}</w:t>
+            </w:r>
+          </w:p>
+        </w:tc>
+        <w:tc>
+          <w:tcPr>
+            <w:tcBorders/>
+            <w:tcW w:w="3541" w:type="dxa"/>
+          </w:tcPr>
+          <w:p>
+            <w:pPr>
+              <w:pStyle w:val="939"/>
+              <w:pBdr/>
+              <w:spacing w:before="1"/>
+              <w:ind w:right="96" w:left="0"/>
+              <w:jc w:val="right"/>
+              <w:rPr>
+                <w:rFonts w:ascii="Calibri"/>
+                <w:sz w:val="18"/>
+              </w:rPr>
+            </w:pPr>
+            <w:r>
+              <w:rPr>
+                <w:rFonts w:ascii="Calibri"/>
+                <w:sz w:val="18"/>
+              </w:rPr>
+              <w:t xml:space="preserve">{est_km}</w:t>
+            </w:r>
+          </w:p>
+          <w:p>
+            <w:pPr>
+              <w:pStyle w:val="939"/>
+              <w:pBdr/>
+              <w:spacing w:before="1"/>
+              <w:ind w:right="96" w:left="0"/>
+              <w:jc w:val="right"/>
+              <w:rPr>
+                <w:rFonts w:ascii="Calibri"/>
+                <w:sz w:val="18"/>
+              </w:rPr>
+            </w:pPr>
+            <w:r>
+              <w:rPr>
+                <w:rFonts w:ascii="Calibri"/>
+                <w:sz w:val="18"/>
+              </w:rPr>
+              <w:t xml:space="preserve">{/site_details}</w:t>
+            </w:r>
+          </w:p>
+        </w:tc>
+      </w:tr>
+      <w:tr>
+        <w:trPr>
+          <w:trHeight w:val="218"/>
+        </w:trPr>
+        <w:tc>
+          <w:tcPr>
+            <w:gridSpan w:val="2"/>
+            <w:tcBorders/>
+            <w:tcW w:w="4960" w:type="dxa"/>
+          </w:tcPr>
+          <w:p>
+            <w:pPr>
+              <w:pStyle w:val="939"/>
+              <w:pBdr/>
+              <w:spacing w:before="1"/>
+              <w:ind w:right="96" w:left="6"/>
+              <w:jc w:val="center"/>
+              <w:rPr>
+                <w:rFonts w:ascii="Calibri"/>
+                <w:b/>
+                <w:sz w:val="18"/>
+              </w:rPr>
+            </w:pPr>
+            <w:r>
+              <w:rPr>
+                <w:rFonts w:ascii="Calibri"/>
+                <w:b/>
+                <w:sz w:val="18"/>
+              </w:rPr>
+              <w:t xml:space="preserve">TOTAL</w:t>
+            </w:r>
+          </w:p>
+        </w:tc>
+        <w:tc>
+          <w:tcPr>
+            <w:tcBorders/>
+            <w:tcW w:w="2413" w:type="dxa"/>
+          </w:tcPr>
+          <w:p>
+            <w:pPr>
+              <w:pStyle w:val="939"/>
+              <w:pBdr/>
+              <w:spacing w:before="1"/>
+              <w:ind w:right="96" w:left="0"/>
+              <w:jc w:val="right"/>
+              <w:rPr>
+                <w:rFonts w:ascii="Calibri"/>
+                <w:b/>
+                <w:sz w:val="18"/>
+              </w:rPr>
+            </w:pPr>
+            <w:r>
+              <w:rPr>
+                <w:rFonts w:ascii="Calibri"/>
+                <w:b/>
+                <w:sz w:val="18"/>
+              </w:rPr>
+              <w:t xml:space="preserve">{total_nodes}</w:t>
+            </w:r>
+          </w:p>
+        </w:tc>
+        <w:tc>
+          <w:tcPr>
+            <w:tcBorders/>
+            <w:tcW w:w="3541" w:type="dxa"/>
+          </w:tcPr>
+          <w:p>
+            <w:pPr>
+              <w:pStyle w:val="939"/>
+              <w:pBdr/>
+              <w:spacing w:before="1"/>
+              <w:ind w:right="96" w:left="0"/>
+              <w:jc w:val="right"/>
+              <w:rPr>
+                <w:rFonts w:ascii="Calibri"/>
+                <w:b/>
+                <w:sz w:val="18"/>
+              </w:rPr>
+            </w:pPr>
+            <w:r>
+              <w:rPr>
+                <w:rFonts w:ascii="Calibri"/>
+                <w:b/>
+                <w:sz w:val="18"/>
+              </w:rPr>
+              <w:t xml:space="preserve">{total_cable}</w:t>
+            </w:r>
+          </w:p>
         </w:tc>
       </w:tr>
       <w:tr>

</xml_diff>